<commit_message>
docs: add chapter 1.2
</commit_message>
<xml_diff>
--- a/docs/ПЗ.docx
+++ b/docs/ПЗ.docx
@@ -2462,7 +2462,18 @@
           <w:bdr w:val="nil"/>
           <w:lang w:val="uk-UA" w:eastAsia="ru-RU"/>
         </w:rPr>
-        <w:t xml:space="preserve">. Класичні алгоритми розв'язання цієї задачі мають суттєві обмеження: алгоритм Дейкстри погано піддається розпаралелюванню через строгу послідовність вибору вершин, а алгоритм Беллмана-Форда виконує занадто багато надлишкових обчислень. У цьому контексті алгоритм </w:t>
+        <w:t>. Класичні алгоритми розв’</w:t>
+      </w:r>
+      <w:r>
+        <w:rPr>
+          <w:rFonts w:eastAsia="Arial Unicode MS" w:cs="Times New Roman"/>
+          <w:bCs/>
+          <w:szCs w:val="28"/>
+          <w:u w:color="000000"/>
+          <w:bdr w:val="nil"/>
+          <w:lang w:val="uk-UA" w:eastAsia="ru-RU"/>
+        </w:rPr>
+        <w:t xml:space="preserve">язання цієї задачі мають суттєві обмеження: алгоритм Дейкстри погано піддається розпаралелюванню через строгу послідовність вибору вершин, а алгоритм Беллмана-Форда виконує занадто багато надлишкових обчислень. У цьому контексті алгоритм </w:t>
       </w:r>
       <m:oMath>
         <m:r>
@@ -2642,7 +2653,29 @@
           <w:bdr w:val="nil"/>
           <w:lang w:val="uk-UA" w:eastAsia="ru-RU"/>
         </w:rPr>
-        <w:t xml:space="preserve"> для розв’язання задачі пошуку найкоротших шляхів у графі з підтвердженням його математичної коректності. Разом із цим буде створено парале</w:t>
+        <w:t xml:space="preserve"> для розв</w:t>
+      </w:r>
+      <w:r>
+        <w:rPr>
+          <w:rFonts w:eastAsia="Arial Unicode MS" w:cs="Times New Roman"/>
+          <w:bCs/>
+          <w:szCs w:val="28"/>
+          <w:u w:color="000000"/>
+          <w:bdr w:val="nil"/>
+          <w:lang w:val="uk-UA" w:eastAsia="ru-RU"/>
+        </w:rPr>
+        <w:t>’</w:t>
+      </w:r>
+      <w:r>
+        <w:rPr>
+          <w:rFonts w:eastAsia="Arial Unicode MS" w:cs="Times New Roman"/>
+          <w:bCs/>
+          <w:szCs w:val="28"/>
+          <w:u w:color="000000"/>
+          <w:bdr w:val="nil"/>
+          <w:lang w:val="uk-UA" w:eastAsia="ru-RU"/>
+        </w:rPr>
+        <w:t>язання задачі пошуку найкоротших шляхів у графі з підтвердженням його математичної коректності. Разом із цим буде створено парале</w:t>
       </w:r>
       <w:r>
         <w:rPr>
@@ -2676,7 +2709,29 @@
           <w:lang w:val="uk-UA" w:eastAsia="ru-RU"/>
         </w:rPr>
         <w:lastRenderedPageBreak/>
-        <w:t>багатопроцесорності та механізмів розподіленої спільної пам'яті для обходу глобального блокування інтерпретатора та мінімізації накладних витрат на міжпроцесну взаємодію.</w:t>
+        <w:t>багатопроцесорності та механізмів розподіленої спільної пам</w:t>
+      </w:r>
+      <w:r>
+        <w:rPr>
+          <w:rFonts w:eastAsia="Arial Unicode MS" w:cs="Times New Roman"/>
+          <w:bCs/>
+          <w:szCs w:val="28"/>
+          <w:u w:color="000000"/>
+          <w:bdr w:val="nil"/>
+          <w:lang w:val="uk-UA" w:eastAsia="ru-RU"/>
+        </w:rPr>
+        <w:t>’</w:t>
+      </w:r>
+      <w:r>
+        <w:rPr>
+          <w:rFonts w:eastAsia="Arial Unicode MS" w:cs="Times New Roman"/>
+          <w:bCs/>
+          <w:szCs w:val="28"/>
+          <w:u w:color="000000"/>
+          <w:bdr w:val="nil"/>
+          <w:lang w:val="uk-UA" w:eastAsia="ru-RU"/>
+        </w:rPr>
+        <w:t>яті для обходу глобального блокування інтерпретатора та мінімізації накладних витрат на міжпроцесну взаємодію.</w:t>
       </w:r>
       <w:r>
         <w:rPr>
@@ -2971,7 +3026,31 @@
           <w:bdr w:val="nil"/>
           <w:lang w:val="uk-UA" w:eastAsia="ru-RU"/>
         </w:rPr>
-        <w:t xml:space="preserve"> це алгоритм пошуку найкоротших шляхів від однієї вершини до всіх інших (Single-Source Shortest Path, SSSP) у графах з невід'ємними вагами ребер. Йо</w:t>
+        <w:t xml:space="preserve"> це алгоритм пошуку найкоротших шляхів від однієї вершини до всіх інших (Single-Source Shortest Path, SSSP) у графах з невід</w:t>
+      </w:r>
+      <w:r>
+        <w:rPr>
+          <w:rFonts w:eastAsia="Arial Unicode MS" w:cs="Times New Roman"/>
+          <w:bCs/>
+          <w:color w:val="000000"/>
+          <w:szCs w:val="28"/>
+          <w:u w:color="000000"/>
+          <w:bdr w:val="nil"/>
+          <w:lang w:val="uk-UA" w:eastAsia="ru-RU"/>
+        </w:rPr>
+        <w:t>’</w:t>
+      </w:r>
+      <w:r>
+        <w:rPr>
+          <w:rFonts w:eastAsia="Arial Unicode MS" w:cs="Times New Roman"/>
+          <w:bCs/>
+          <w:color w:val="000000"/>
+          <w:szCs w:val="28"/>
+          <w:u w:color="000000"/>
+          <w:bdr w:val="nil"/>
+          <w:lang w:val="uk-UA" w:eastAsia="ru-RU"/>
+        </w:rPr>
+        <w:t>ємними вагами ребер. Йо</w:t>
       </w:r>
       <w:r>
         <w:rPr>
@@ -3439,7 +3518,31 @@
           <w:bdr w:val="nil"/>
           <w:lang w:val="uk-UA" w:eastAsia="ru-RU"/>
         </w:rPr>
-        <w:t xml:space="preserve">покращує використання пам’яті, що особливо необхідно для </w:t>
+        <w:t>покращує використання пам</w:t>
+      </w:r>
+      <w:r>
+        <w:rPr>
+          <w:rFonts w:eastAsia="Arial Unicode MS" w:cs="Times New Roman"/>
+          <w:bCs/>
+          <w:color w:val="000000"/>
+          <w:szCs w:val="28"/>
+          <w:u w:color="000000"/>
+          <w:bdr w:val="nil"/>
+          <w:lang w:eastAsia="ru-RU"/>
+        </w:rPr>
+        <w:t>’</w:t>
+      </w:r>
+      <w:r>
+        <w:rPr>
+          <w:rFonts w:eastAsia="Arial Unicode MS" w:cs="Times New Roman"/>
+          <w:bCs/>
+          <w:color w:val="000000"/>
+          <w:szCs w:val="28"/>
+          <w:u w:color="000000"/>
+          <w:bdr w:val="nil"/>
+          <w:lang w:val="uk-UA" w:eastAsia="ru-RU"/>
+        </w:rPr>
+        <w:t xml:space="preserve">яті, що особливо необхідно для </w:t>
       </w:r>
       <w:r>
         <w:rPr>
@@ -3710,7 +3813,7 @@
           <w:szCs w:val="28"/>
           <w:u w:color="000000"/>
           <w:bdr w:val="nil"/>
-          <w:lang w:val="ru-RU" w:eastAsia="ru-RU"/>
+          <w:lang w:eastAsia="ru-RU"/>
         </w:rPr>
         <w:t>NOT</w:t>
       </w:r>
@@ -4038,7 +4141,7 @@
           <w:szCs w:val="28"/>
           <w:u w:val="single" w:color="000000"/>
           <w:bdr w:val="nil"/>
-          <w:lang w:val="ru-RU" w:eastAsia="ru-RU"/>
+          <w:lang w:eastAsia="ru-RU"/>
         </w:rPr>
       </w:pPr>
     </w:p>
@@ -4239,79 +4342,7 @@
           <w:bdr w:val="nil"/>
           <w:lang w:val="en-US" w:eastAsia="ru-RU"/>
         </w:rPr>
-        <w:t xml:space="preserve">2D array of vertices’ weights to neighbours </w:t>
-      </w:r>
-      <w:r>
-        <w:rPr>
-          <w:rFonts w:eastAsia="Arial Unicode MS" w:cs="Times New Roman"/>
-          <w:bCs/>
-          <w:color w:val="000000"/>
-          <w:szCs w:val="28"/>
-          <w:u w:color="000000"/>
-          <w:bdr w:val="nil"/>
-          <w:lang w:val="en-US" w:eastAsia="ru-RU"/>
-        </w:rPr>
-        <w:t xml:space="preserve">(each row is an array of vertex’s </w:t>
-      </w:r>
-      <w:r>
-        <w:rPr>
-          <w:rFonts w:eastAsia="Arial Unicode MS" w:cs="Times New Roman"/>
-          <w:bCs/>
-          <w:color w:val="000000"/>
-          <w:szCs w:val="28"/>
-          <w:u w:color="000000"/>
-          <w:bdr w:val="nil"/>
-          <w:lang w:val="en-US" w:eastAsia="ru-RU"/>
-        </w:rPr>
-        <w:t>weights to</w:t>
-      </w:r>
-      <w:r>
-        <w:rPr>
-          <w:rFonts w:eastAsia="Arial Unicode MS" w:cs="Times New Roman"/>
-          <w:bCs/>
-          <w:color w:val="000000"/>
-          <w:szCs w:val="28"/>
-          <w:u w:color="000000"/>
-          <w:bdr w:val="nil"/>
-          <w:lang w:val="en-US" w:eastAsia="ru-RU"/>
-        </w:rPr>
-        <w:t xml:space="preserve"> </w:t>
-      </w:r>
-      <w:r>
-        <w:rPr>
-          <w:rFonts w:eastAsia="Arial Unicode MS" w:cs="Times New Roman"/>
-          <w:bCs/>
-          <w:color w:val="000000"/>
-          <w:szCs w:val="28"/>
-          <w:u w:color="000000"/>
-          <w:bdr w:val="nil"/>
-          <w:lang w:val="en-US" w:eastAsia="ru-RU"/>
-        </w:rPr>
-        <w:t xml:space="preserve">it’s </w:t>
-      </w:r>
-      <w:r>
-        <w:rPr>
-          <w:rFonts w:eastAsia="Arial Unicode MS" w:cs="Times New Roman"/>
-          <w:bCs/>
-          <w:color w:val="000000"/>
-          <w:szCs w:val="28"/>
-          <w:u w:color="000000"/>
-          <w:bdr w:val="nil"/>
-          <w:lang w:val="en-US" w:eastAsia="ru-RU"/>
-        </w:rPr>
-        <w:t>neighbours)</w:t>
-      </w:r>
-      <w:r>
-        <w:rPr>
-          <w:rFonts w:eastAsia="Arial Unicode MS" w:cs="Times New Roman"/>
-          <w:bCs/>
-          <w:color w:val="000000"/>
-          <w:szCs w:val="28"/>
-          <w:u w:color="000000"/>
-          <w:bdr w:val="nil"/>
-          <w:lang w:val="en-US" w:eastAsia="ru-RU"/>
-        </w:rPr>
-        <w:t>;</w:t>
+        <w:t>2D array of vertices’ weights to neighbours (each row is an array of vertex’s weights to it’s neighbours);</w:t>
       </w:r>
     </w:p>
     <w:p>
@@ -4690,18 +4721,7 @@
             <w:bdr w:val="nil"/>
             <w:lang w:val="en-US" w:eastAsia="ru-RU"/>
           </w:rPr>
-          <m:t>floor</m:t>
-        </m:r>
-        <m:r>
-          <w:rPr>
-            <w:rFonts w:ascii="Cambria Math" w:eastAsia="Arial Unicode MS" w:hAnsi="Cambria Math" w:cs="Times New Roman"/>
-            <w:color w:val="000000"/>
-            <w:szCs w:val="28"/>
-            <w:u w:color="000000"/>
-            <w:bdr w:val="nil"/>
-            <w:lang w:val="en-US" w:eastAsia="ru-RU"/>
-          </w:rPr>
-          <m:t>(</m:t>
+          <m:t>floor(</m:t>
         </m:r>
         <m:f>
           <m:fPr>
@@ -5359,29 +5379,7 @@
             <w:bdr w:val="nil"/>
             <w:lang w:val="en-US" w:eastAsia="ru-RU"/>
           </w:rPr>
-          <m:t>←</m:t>
-        </m:r>
-        <m:r>
-          <w:rPr>
-            <w:rFonts w:ascii="Cambria Math" w:eastAsia="Arial Unicode MS" w:hAnsi="Cambria Math" w:cs="Times New Roman"/>
-            <w:color w:val="000000"/>
-            <w:szCs w:val="28"/>
-            <w:u w:color="000000"/>
-            <w:bdr w:val="nil"/>
-            <w:lang w:val="en-US" w:eastAsia="ru-RU"/>
-          </w:rPr>
-          <m:t>mod(</m:t>
-        </m:r>
-        <m:r>
-          <w:rPr>
-            <w:rFonts w:ascii="Cambria Math" w:eastAsia="Arial Unicode MS" w:hAnsi="Cambria Math" w:cs="Times New Roman"/>
-            <w:color w:val="000000"/>
-            <w:szCs w:val="28"/>
-            <w:u w:color="000000"/>
-            <w:bdr w:val="nil"/>
-            <w:lang w:val="en-US" w:eastAsia="ru-RU"/>
-          </w:rPr>
-          <m:t xml:space="preserve">next_non_empty_bucket_absolute_index,  </m:t>
+          <m:t xml:space="preserve">←mod(next_non_empty_bucket_absolute_index,  </m:t>
         </m:r>
         <m:r>
           <m:rPr>
@@ -5686,19 +5684,7 @@
           <w:bdr w:val="nil"/>
           <w:lang w:val="en-US" w:eastAsia="ru-RU"/>
         </w:rPr>
-        <w:t xml:space="preserve">bucket_sizes[actual_bucket_index] </w:t>
-      </w:r>
-      <w:r>
-        <w:rPr>
-          <w:rFonts w:eastAsia="Arial Unicode MS" w:cs="Times New Roman"/>
-          <w:bCs/>
-          <w:color w:val="000000"/>
-          <w:szCs w:val="28"/>
-          <w:u w:color="000000"/>
-          <w:bdr w:val="nil"/>
-          <w:lang w:val="en-US" w:eastAsia="ru-RU"/>
-        </w:rPr>
-        <w:t xml:space="preserve"> - </w:t>
+        <w:t xml:space="preserve">bucket_sizes[actual_bucket_index]  - </w:t>
       </w:r>
       <w:r>
         <w:rPr>
@@ -5801,18 +5787,7 @@
             <w:bdr w:val="nil"/>
             <w:lang w:val="en-US" w:eastAsia="ru-RU"/>
           </w:rPr>
-          <m:t>mod(</m:t>
-        </m:r>
-        <m:r>
-          <w:rPr>
-            <w:rFonts w:ascii="Cambria Math" w:eastAsia="Arial Unicode MS" w:hAnsi="Cambria Math" w:cs="Times New Roman"/>
-            <w:color w:val="000000"/>
-            <w:szCs w:val="28"/>
-            <w:u w:color="000000"/>
-            <w:bdr w:val="nil"/>
-            <w:lang w:val="en-US" w:eastAsia="ru-RU"/>
-          </w:rPr>
-          <m:t>floor</m:t>
+          <m:t>mod(floor</m:t>
         </m:r>
         <m:d>
           <m:dPr>
@@ -5956,18 +5931,7 @@
             <w:bdr w:val="nil"/>
             <w:lang w:val="en-US" w:eastAsia="ru-RU"/>
           </w:rPr>
-          <m:t>,</m:t>
-        </m:r>
-        <m:r>
-          <w:rPr>
-            <w:rFonts w:ascii="Cambria Math" w:eastAsia="Arial Unicode MS" w:hAnsi="Cambria Math" w:cs="Times New Roman"/>
-            <w:color w:val="000000"/>
-            <w:szCs w:val="28"/>
-            <w:u w:color="000000"/>
-            <w:bdr w:val="nil"/>
-            <w:lang w:val="en-US" w:eastAsia="ru-RU"/>
-          </w:rPr>
-          <m:t xml:space="preserve"> </m:t>
+          <m:t xml:space="preserve">, </m:t>
         </m:r>
         <m:r>
           <m:rPr>
@@ -6314,18 +6278,7 @@
             <w:bdr w:val="nil"/>
             <w:lang w:val="en-US" w:eastAsia="ru-RU"/>
           </w:rPr>
-          <m:t>←</m:t>
-        </m:r>
-        <m:r>
-          <w:rPr>
-            <w:rFonts w:ascii="Cambria Math" w:eastAsia="Arial Unicode MS" w:hAnsi="Cambria Math" w:cs="Times New Roman"/>
-            <w:color w:val="000000"/>
-            <w:szCs w:val="28"/>
-            <w:u w:color="000000"/>
-            <w:bdr w:val="nil"/>
-            <w:lang w:val="en-US" w:eastAsia="ru-RU"/>
-          </w:rPr>
-          <m:t xml:space="preserve"> </m:t>
+          <m:t xml:space="preserve">← </m:t>
         </m:r>
       </m:oMath>
       <w:r>
@@ -7917,31 +7870,7 @@
           <w:bdr w:val="nil"/>
           <w:lang w:val="en-US" w:eastAsia="ru-RU"/>
         </w:rPr>
-        <w:t xml:space="preserve">distances – </w:t>
-      </w:r>
-      <w:r>
-        <w:rPr>
-          <w:rFonts w:eastAsia="Arial Unicode MS" w:cs="Times New Roman"/>
-          <w:bCs/>
-          <w:color w:val="000000"/>
-          <w:szCs w:val="28"/>
-          <w:u w:color="000000"/>
-          <w:bdr w:val="nil"/>
-          <w:lang w:val="en-US" w:eastAsia="ru-RU"/>
-        </w:rPr>
-        <w:t>array of current distances to each vertex</w:t>
-      </w:r>
-      <w:r>
-        <w:rPr>
-          <w:rFonts w:eastAsia="Arial Unicode MS" w:cs="Times New Roman"/>
-          <w:bCs/>
-          <w:color w:val="000000"/>
-          <w:szCs w:val="28"/>
-          <w:u w:color="000000"/>
-          <w:bdr w:val="nil"/>
-          <w:lang w:val="en-US" w:eastAsia="ru-RU"/>
-        </w:rPr>
-        <w:t>;</w:t>
+        <w:t>distances – array of current distances to each vertex;</w:t>
       </w:r>
     </w:p>
     <w:p>
@@ -8180,18 +8109,7 @@
                 <w:bdr w:val="nil"/>
                 <w:lang w:val="en-US" w:eastAsia="ru-RU"/>
               </w:rPr>
-              <m:t>floor(</m:t>
-            </m:r>
-            <m:r>
-              <w:rPr>
-                <w:rFonts w:ascii="Cambria Math" w:eastAsia="Arial Unicode MS" w:hAnsi="Cambria Math" w:cs="Times New Roman"/>
-                <w:color w:val="000000"/>
-                <w:szCs w:val="28"/>
-                <w:u w:color="000000"/>
-                <w:bdr w:val="nil"/>
-                <w:lang w:val="en-US" w:eastAsia="ru-RU"/>
-              </w:rPr>
-              <m:t>distances[vertex_index] / delta</m:t>
+              <m:t>floor(distances[vertex_index] / delta</m:t>
             </m:r>
             <m:r>
               <w:rPr>
@@ -8431,19 +8349,7 @@
           <w:bdr w:val="nil"/>
           <w:lang w:val="en-US" w:eastAsia="ru-RU"/>
         </w:rPr>
-        <w:t xml:space="preserve">bucket_sizes[bucket_index] </w:t>
-      </w:r>
-      <w:r>
-        <w:rPr>
-          <w:rFonts w:eastAsia="Arial Unicode MS" w:cs="Times New Roman"/>
-          <w:bCs/>
-          <w:color w:val="000000"/>
-          <w:szCs w:val="28"/>
-          <w:u w:color="000000"/>
-          <w:bdr w:val="nil"/>
-          <w:lang w:val="en-US" w:eastAsia="ru-RU"/>
-        </w:rPr>
-        <w:t xml:space="preserve"> + </w:t>
+        <w:t xml:space="preserve">bucket_sizes[bucket_index]  + </w:t>
       </w:r>
       <w:r>
         <w:rPr>
@@ -8476,7 +8382,7 @@
       <w:pPr>
         <w:pStyle w:val="2"/>
         <w:rPr>
-          <w:lang w:val="ru-RU"/>
+          <w:lang w:val="uk-UA"/>
         </w:rPr>
       </w:pPr>
       <w:bookmarkStart w:id="3" w:name="_Toc158713965"/>
@@ -8505,10 +8411,13 @@
         </m:r>
       </m:oMath>
       <w:r>
-        <w:rPr>
-          <w:lang w:val="ru-RU"/>
-        </w:rPr>
         <w:t>-степінг</w:t>
+      </w:r>
+      <w:r>
+        <w:rPr>
+          <w:lang w:val="uk-UA"/>
+        </w:rPr>
+        <w:t>у</w:t>
       </w:r>
       <w:bookmarkStart w:id="4" w:name="_GoBack"/>
       <w:bookmarkEnd w:id="4"/>
@@ -8535,334 +8444,861 @@
           <w:bdr w:val="nil"/>
           <w:lang w:val="uk-UA" w:eastAsia="ru-RU"/>
         </w:rPr>
-        <w:t>Текст….</w:t>
-      </w:r>
-      <w:r>
-        <w:rPr>
-          <w:rFonts w:eastAsia="Arial Unicode MS" w:cs="Times New Roman"/>
-          <w:bCs/>
-          <w:color w:val="000000"/>
-          <w:szCs w:val="28"/>
-          <w:u w:color="000000"/>
-          <w:bdr w:val="nil"/>
-          <w:lang w:val="uk-UA" w:eastAsia="ru-RU"/>
-        </w:rPr>
-        <w:t>Рисунок завжди ПІСЛЯ посилання на нього в тексті. Поси</w:t>
-      </w:r>
-      <w:r>
-        <w:rPr>
-          <w:rFonts w:eastAsia="Arial Unicode MS" w:cs="Times New Roman"/>
-          <w:bCs/>
-          <w:color w:val="000000"/>
-          <w:szCs w:val="28"/>
-          <w:u w:color="000000"/>
-          <w:bdr w:val="nil"/>
-          <w:lang w:val="uk-UA" w:eastAsia="ru-RU"/>
-        </w:rPr>
-        <w:t>л</w:t>
-      </w:r>
-      <w:r>
-        <w:rPr>
-          <w:rFonts w:eastAsia="Arial Unicode MS" w:cs="Times New Roman"/>
-          <w:bCs/>
-          <w:color w:val="000000"/>
-          <w:szCs w:val="28"/>
-          <w:u w:color="000000"/>
-          <w:bdr w:val="nil"/>
-          <w:lang w:val="uk-UA" w:eastAsia="ru-RU"/>
-        </w:rPr>
-        <w:t>ання оформлюємо в тексті або «…наведено на рисунку 1.1», або «…(рис.1.1)».</w:t>
-      </w:r>
-    </w:p>
-    <w:p>
-      <w:pPr>
-        <w:jc w:val="center"/>
-        <w:rPr>
-          <w:rFonts w:eastAsia="Arial Unicode MS" w:cs="Times New Roman"/>
-          <w:bCs/>
-          <w:color w:val="000000"/>
-          <w:szCs w:val="28"/>
-          <w:u w:color="000000"/>
-          <w:bdr w:val="nil"/>
-          <w:lang w:val="uk-UA" w:eastAsia="ru-RU"/>
-        </w:rPr>
-      </w:pPr>
-    </w:p>
-    <w:p>
-      <w:pPr>
-        <w:jc w:val="center"/>
-        <w:rPr>
-          <w:rFonts w:eastAsia="Arial Unicode MS" w:cs="Times New Roman"/>
-          <w:bCs/>
-          <w:color w:val="000000"/>
-          <w:szCs w:val="28"/>
-          <w:u w:color="000000"/>
-          <w:bdr w:val="nil"/>
-          <w:lang w:val="uk-UA" w:eastAsia="ru-RU"/>
-        </w:rPr>
-      </w:pPr>
-      <w:r>
-        <w:rPr>
-          <w:rFonts w:eastAsia="Arial Unicode MS" w:cs="Times New Roman"/>
-          <w:bCs/>
-          <w:color w:val="000000"/>
-          <w:szCs w:val="28"/>
-          <w:u w:color="000000"/>
-          <w:bdr w:val="nil"/>
-          <w:lang w:val="uk-UA" w:eastAsia="ru-RU"/>
-        </w:rPr>
-        <w:t>Рис</w:t>
-      </w:r>
-      <w:r>
-        <w:rPr>
-          <w:rFonts w:eastAsia="Arial Unicode MS" w:cs="Times New Roman"/>
-          <w:bCs/>
-          <w:color w:val="000000"/>
-          <w:szCs w:val="28"/>
-          <w:u w:color="000000"/>
-          <w:bdr w:val="nil"/>
-          <w:lang w:val="uk-UA" w:eastAsia="ru-RU"/>
-        </w:rPr>
-        <w:t>унок</w:t>
-      </w:r>
-      <w:r>
-        <w:rPr>
-          <w:rFonts w:eastAsia="Arial Unicode MS" w:cs="Times New Roman"/>
-          <w:bCs/>
-          <w:color w:val="000000"/>
-          <w:szCs w:val="28"/>
-          <w:u w:color="000000"/>
-          <w:bdr w:val="nil"/>
-          <w:lang w:val="uk-UA" w:eastAsia="ru-RU"/>
-        </w:rPr>
-        <w:t xml:space="preserve"> 1.1.</w:t>
-      </w:r>
-      <w:r>
-        <w:rPr>
-          <w:rFonts w:eastAsia="Arial Unicode MS" w:cs="Times New Roman"/>
-          <w:bCs/>
-          <w:color w:val="000000"/>
-          <w:szCs w:val="28"/>
-          <w:u w:color="000000"/>
-          <w:bdr w:val="nil"/>
-          <w:lang w:val="uk-UA" w:eastAsia="ru-RU"/>
-        </w:rPr>
-        <w:t xml:space="preserve"> </w:t>
-      </w:r>
-      <w:r>
-        <w:rPr>
-          <w:rFonts w:eastAsia="Arial Unicode MS" w:cs="Times New Roman"/>
-          <w:bCs/>
-          <w:color w:val="000000"/>
-          <w:szCs w:val="28"/>
-          <w:u w:color="000000"/>
-          <w:bdr w:val="nil"/>
-          <w:lang w:val="uk-UA" w:eastAsia="ru-RU"/>
-        </w:rPr>
-        <w:t>–</w:t>
-      </w:r>
-      <w:r>
-        <w:rPr>
-          <w:rFonts w:eastAsia="Arial Unicode MS" w:cs="Times New Roman"/>
-          <w:bCs/>
-          <w:color w:val="000000"/>
-          <w:szCs w:val="28"/>
-          <w:u w:color="000000"/>
-          <w:bdr w:val="nil"/>
-          <w:lang w:val="uk-UA" w:eastAsia="ru-RU"/>
-        </w:rPr>
-        <w:t xml:space="preserve"> </w:t>
-      </w:r>
-      <w:r>
-        <w:rPr>
-          <w:rFonts w:eastAsia="Arial Unicode MS" w:cs="Times New Roman"/>
-          <w:bCs/>
-          <w:color w:val="000000"/>
-          <w:szCs w:val="28"/>
-          <w:u w:color="000000"/>
-          <w:bdr w:val="nil"/>
-          <w:lang w:val="uk-UA" w:eastAsia="ru-RU"/>
-        </w:rPr>
-        <w:t>Назва рисунку</w:t>
-      </w:r>
-    </w:p>
-    <w:p>
-      <w:pPr>
-        <w:rPr>
-          <w:rFonts w:eastAsia="Arial Unicode MS" w:cs="Times New Roman"/>
-          <w:bCs/>
-          <w:color w:val="000000"/>
-          <w:szCs w:val="28"/>
-          <w:u w:color="000000"/>
-          <w:bdr w:val="nil"/>
-          <w:lang w:val="uk-UA" w:eastAsia="ru-RU"/>
-        </w:rPr>
-      </w:pPr>
-    </w:p>
-    <w:p>
-      <w:pPr>
-        <w:rPr>
-          <w:rFonts w:eastAsia="Arial Unicode MS" w:cs="Times New Roman"/>
-          <w:bCs/>
-          <w:color w:val="000000"/>
-          <w:szCs w:val="28"/>
-          <w:u w:color="000000"/>
-          <w:bdr w:val="nil"/>
-          <w:lang w:val="uk-UA" w:eastAsia="ru-RU"/>
-        </w:rPr>
-      </w:pPr>
-      <w:r>
-        <w:rPr>
-          <w:rFonts w:eastAsia="Arial Unicode MS" w:cs="Times New Roman"/>
-          <w:bCs/>
-          <w:color w:val="000000"/>
-          <w:szCs w:val="28"/>
-          <w:u w:color="000000"/>
-          <w:bdr w:val="nil"/>
-          <w:lang w:val="uk-UA" w:eastAsia="ru-RU"/>
-        </w:rPr>
-        <w:t>Текст….</w:t>
-      </w:r>
-      <w:r>
-        <w:rPr>
-          <w:rFonts w:eastAsia="Arial Unicode MS" w:cs="Times New Roman"/>
-          <w:bCs/>
-          <w:color w:val="000000"/>
-          <w:szCs w:val="28"/>
-          <w:u w:color="000000"/>
-          <w:bdr w:val="nil"/>
-          <w:lang w:val="uk-UA" w:eastAsia="ru-RU"/>
-        </w:rPr>
-        <w:t>у формулі (1.1)</w:t>
-      </w:r>
-    </w:p>
-    <w:p>
-      <w:pPr>
-        <w:pStyle w:val="Formula"/>
-        <w:ind w:left="2832" w:firstLine="708"/>
-      </w:pPr>
+        <w:t xml:space="preserve">Алгоритм </w:t>
+      </w:r>
       <m:oMath>
         <m:r>
           <w:rPr>
             <w:rFonts w:ascii="Cambria Math" w:hAnsi="Cambria Math"/>
-            <w:lang w:val="en-US"/>
+            <w:lang w:val="uk-UA"/>
           </w:rPr>
-          <m:t>S</m:t>
+          <m:t>∆</m:t>
         </m:r>
+      </m:oMath>
+      <w:r>
+        <w:rPr>
+          <w:rFonts w:eastAsia="Arial Unicode MS" w:cs="Times New Roman"/>
+        </w:rPr>
+        <w:t>-</w:t>
+      </w:r>
+      <w:r>
+        <w:rPr>
+          <w:rFonts w:eastAsia="Arial Unicode MS" w:cs="Times New Roman"/>
+          <w:bCs/>
+          <w:color w:val="000000"/>
+          <w:szCs w:val="28"/>
+          <w:u w:color="000000"/>
+          <w:bdr w:val="nil"/>
+          <w:lang w:val="uk-UA" w:eastAsia="ru-RU"/>
+        </w:rPr>
+        <w:t xml:space="preserve">степінгу з моменту свого створення Ульріхом Майєром та Пітером Сандерсом розглядався як найбільш перспективна паралельна альтернатива алгоритму Дейкстри. Його було спеціально орієнтовано на ефективну роботу в паралельних обчислювальних середовищах. Перша експериментальна реалізація </w:t>
+      </w:r>
+      <w:r>
+        <w:rPr>
+          <w:rFonts w:eastAsia="Arial Unicode MS" w:cs="Times New Roman"/>
+          <w:bCs/>
+          <w:color w:val="000000"/>
+          <w:szCs w:val="28"/>
+          <w:u w:color="000000"/>
+          <w:bdr w:val="nil"/>
+          <w:lang w:val="uk-UA" w:eastAsia="ru-RU"/>
+        </w:rPr>
+        <w:t xml:space="preserve">послідовної версії </w:t>
+      </w:r>
+      <w:r>
+        <w:rPr>
+          <w:rFonts w:eastAsia="Arial Unicode MS" w:cs="Times New Roman"/>
+          <w:bCs/>
+          <w:color w:val="000000"/>
+          <w:szCs w:val="28"/>
+          <w:u w:color="000000"/>
+          <w:bdr w:val="nil"/>
+          <w:lang w:val="uk-UA" w:eastAsia="ru-RU"/>
+        </w:rPr>
+        <w:t xml:space="preserve">авторів </w:t>
+      </w:r>
+      <w:r>
+        <w:rPr>
+          <w:rFonts w:eastAsia="Arial Unicode MS" w:cs="Times New Roman"/>
+          <w:bCs/>
+          <w:color w:val="000000"/>
+          <w:szCs w:val="28"/>
+          <w:u w:color="000000"/>
+          <w:bdr w:val="nil"/>
+          <w:lang w:val="uk-UA" w:eastAsia="ru-RU"/>
+        </w:rPr>
+        <w:t xml:space="preserve">мала пришвидшення до 3.1 раз у порівнянні із оптимізованим алгоритмом Дейкстри, а паралельна версія </w:t>
+      </w:r>
+      <w:r>
+        <w:rPr>
+          <w:rFonts w:eastAsia="Arial Unicode MS" w:cs="Times New Roman"/>
+          <w:bCs/>
+          <w:color w:val="000000"/>
+          <w:szCs w:val="28"/>
+          <w:u w:color="000000"/>
+          <w:bdr w:val="nil"/>
+          <w:lang w:val="uk-UA" w:eastAsia="ru-RU"/>
+        </w:rPr>
+        <w:t>на багатопроцесорній системі з 16 вузлами продемон</w:t>
+      </w:r>
+      <w:r>
+        <w:rPr>
+          <w:rFonts w:eastAsia="Arial Unicode MS" w:cs="Times New Roman"/>
+          <w:bCs/>
+          <w:color w:val="000000"/>
+          <w:szCs w:val="28"/>
+          <w:u w:color="000000"/>
+          <w:bdr w:val="nil"/>
+          <w:lang w:val="uk-UA" w:eastAsia="ru-RU"/>
+        </w:rPr>
+        <w:t>струвала прискорення до 9.2 раз</w:t>
+      </w:r>
+      <w:r>
+        <w:rPr>
+          <w:rFonts w:eastAsia="Arial Unicode MS" w:cs="Times New Roman"/>
+          <w:bCs/>
+          <w:color w:val="000000"/>
+          <w:szCs w:val="28"/>
+          <w:u w:color="000000"/>
+          <w:bdr w:val="nil"/>
+          <w:lang w:val="uk-UA" w:eastAsia="ru-RU"/>
+        </w:rPr>
+        <w:t xml:space="preserve">. Це підтвердило життєздатність концепції розподілу вершин за </w:t>
+      </w:r>
+      <w:r>
+        <w:rPr>
+          <w:rFonts w:eastAsia="Arial Unicode MS" w:cs="Times New Roman"/>
+          <w:bCs/>
+          <w:color w:val="000000"/>
+          <w:szCs w:val="28"/>
+          <w:u w:color="000000"/>
+          <w:bdr w:val="nil"/>
+          <w:lang w:val="uk-UA" w:eastAsia="ru-RU"/>
+        </w:rPr>
+        <w:lastRenderedPageBreak/>
+        <w:t>«кошиками» та можливість безпечної паралельної релаксації «легких» ребер у меж</w:t>
+      </w:r>
+      <w:r>
+        <w:rPr>
+          <w:rFonts w:eastAsia="Arial Unicode MS" w:cs="Times New Roman"/>
+          <w:bCs/>
+          <w:color w:val="000000"/>
+          <w:szCs w:val="28"/>
+          <w:u w:color="000000"/>
+          <w:bdr w:val="nil"/>
+          <w:lang w:val="uk-UA" w:eastAsia="ru-RU"/>
+        </w:rPr>
+        <w:t>ах одного проміжку відстаней</w:t>
+      </w:r>
+      <w:r>
+        <w:rPr>
+          <w:rFonts w:eastAsia="Arial Unicode MS" w:cs="Times New Roman"/>
+          <w:bCs/>
+          <w:color w:val="000000"/>
+          <w:szCs w:val="28"/>
+          <w:u w:color="000000"/>
+          <w:bdr w:val="nil"/>
+          <w:lang w:val="uk-UA" w:eastAsia="ru-RU"/>
+        </w:rPr>
+        <w:t>.</w:t>
+      </w:r>
+    </w:p>
+    <w:p>
+      <w:pPr>
+        <w:rPr>
+          <w:rFonts w:eastAsia="Arial Unicode MS" w:cs="Times New Roman"/>
+          <w:bCs/>
+          <w:color w:val="000000"/>
+          <w:szCs w:val="28"/>
+          <w:u w:color="000000"/>
+          <w:bdr w:val="nil"/>
+          <w:lang w:val="uk-UA" w:eastAsia="ru-RU"/>
+        </w:rPr>
+      </w:pPr>
+      <w:r>
+        <w:rPr>
+          <w:rFonts w:eastAsia="Arial Unicode MS" w:cs="Times New Roman"/>
+          <w:bCs/>
+          <w:color w:val="000000"/>
+          <w:szCs w:val="28"/>
+          <w:u w:color="000000"/>
+          <w:bdr w:val="nil"/>
+          <w:lang w:val="uk-UA" w:eastAsia="ru-RU"/>
+        </w:rPr>
+        <w:t>Значний розвиток паралельні реалізації алгоритму отримали для архітектур зі с</w:t>
+      </w:r>
+      <w:r>
+        <w:rPr>
+          <w:rFonts w:eastAsia="Arial Unicode MS" w:cs="Times New Roman"/>
+          <w:bCs/>
+          <w:color w:val="000000"/>
+          <w:szCs w:val="28"/>
+          <w:u w:color="000000"/>
+          <w:bdr w:val="nil"/>
+          <w:lang w:val="uk-UA" w:eastAsia="ru-RU"/>
+        </w:rPr>
+        <w:t>пільною пам’яттю</w:t>
+      </w:r>
+      <w:r>
+        <w:rPr>
+          <w:rFonts w:eastAsia="Arial Unicode MS" w:cs="Times New Roman"/>
+          <w:bCs/>
+          <w:color w:val="000000"/>
+          <w:szCs w:val="28"/>
+          <w:u w:color="000000"/>
+          <w:bdr w:val="nil"/>
+          <w:lang w:val="uk-UA" w:eastAsia="ru-RU"/>
+        </w:rPr>
+        <w:t>. Найсучаснішим підходом у цьому сегменті є алгоритм PD3 (Parallel Delta-</w:t>
+      </w:r>
+      <w:r>
+        <w:rPr>
+          <w:rFonts w:eastAsia="Arial Unicode MS" w:cs="Times New Roman"/>
+          <w:bCs/>
+          <w:color w:val="000000"/>
+          <w:szCs w:val="28"/>
+          <w:u w:color="000000"/>
+          <w:bdr w:val="nil"/>
+          <w:lang w:val="uk-UA" w:eastAsia="ru-RU"/>
+        </w:rPr>
+        <w:t>Stepping with Decreasing Delta)</w:t>
+      </w:r>
+      <w:r>
+        <w:rPr>
+          <w:rFonts w:eastAsia="Arial Unicode MS" w:cs="Times New Roman"/>
+          <w:bCs/>
+          <w:color w:val="000000"/>
+          <w:szCs w:val="28"/>
+          <w:u w:color="000000"/>
+          <w:bdr w:val="nil"/>
+          <w:lang w:val="uk-UA" w:eastAsia="ru-RU"/>
+        </w:rPr>
+        <w:t xml:space="preserve">. У цій реалізації впроваджено техніку поступового зменшення параметра </w:t>
+      </w:r>
+      <m:oMath>
         <m:r>
           <w:rPr>
             <w:rFonts w:ascii="Cambria Math" w:hAnsi="Cambria Math"/>
-            <w:lang w:val="ru-RU"/>
+            <w:lang w:val="uk-UA"/>
           </w:rPr>
-          <m:t>=</m:t>
+          <m:t>∆</m:t>
         </m:r>
-        <m:f>
-          <m:fPr>
-            <m:ctrlPr>
-              <w:rPr>
-                <w:rFonts w:ascii="Cambria Math" w:hAnsi="Cambria Math"/>
-                <w:i/>
-                <w:lang w:val="en-US"/>
-              </w:rPr>
-            </m:ctrlPr>
-          </m:fPr>
-          <m:num>
-            <m:sSub>
-              <m:sSubPr>
-                <m:ctrlPr>
-                  <w:rPr>
-                    <w:rFonts w:ascii="Cambria Math" w:hAnsi="Cambria Math"/>
-                    <w:i/>
-                    <w:lang w:val="en-US"/>
-                  </w:rPr>
-                </m:ctrlPr>
-              </m:sSubPr>
-              <m:e>
-                <m:r>
-                  <w:rPr>
-                    <w:rFonts w:ascii="Cambria Math" w:hAnsi="Cambria Math"/>
-                    <w:lang w:val="en-US"/>
-                  </w:rPr>
-                  <m:t>T</m:t>
-                </m:r>
-              </m:e>
-              <m:sub>
-                <m:r>
-                  <w:rPr>
-                    <w:rFonts w:ascii="Cambria Math" w:hAnsi="Cambria Math"/>
-                    <w:lang w:val="en-US"/>
-                  </w:rPr>
-                  <m:t>seq</m:t>
-                </m:r>
-              </m:sub>
-            </m:sSub>
-          </m:num>
-          <m:den>
-            <m:sSub>
-              <m:sSubPr>
-                <m:ctrlPr>
-                  <w:rPr>
-                    <w:rFonts w:ascii="Cambria Math" w:hAnsi="Cambria Math"/>
-                    <w:i/>
-                    <w:lang w:val="en-US"/>
-                  </w:rPr>
-                </m:ctrlPr>
-              </m:sSubPr>
-              <m:e>
-                <m:r>
-                  <w:rPr>
-                    <w:rFonts w:ascii="Cambria Math" w:hAnsi="Cambria Math"/>
-                    <w:lang w:val="en-US"/>
-                  </w:rPr>
-                  <m:t>T</m:t>
-                </m:r>
-              </m:e>
-              <m:sub>
-                <m:r>
-                  <w:rPr>
-                    <w:rFonts w:ascii="Cambria Math" w:hAnsi="Cambria Math"/>
-                    <w:lang w:val="en-US"/>
-                  </w:rPr>
-                  <m:t>par</m:t>
-                </m:r>
-              </m:sub>
-            </m:sSub>
-          </m:den>
-        </m:f>
       </m:oMath>
       <w:r>
         <w:rPr>
-          <w:lang w:val="ru-RU"/>
-        </w:rPr>
-        <w:tab/>
-      </w:r>
-      <w:r>
-        <w:rPr>
-          <w:lang w:val="ru-RU"/>
-        </w:rPr>
-        <w:tab/>
-      </w:r>
-      <w:r>
-        <w:rPr>
-          <w:lang w:val="ru-RU"/>
-        </w:rPr>
-        <w:tab/>
-      </w:r>
-      <w:r>
-        <w:rPr>
-          <w:lang w:val="ru-RU"/>
-        </w:rPr>
-        <w:tab/>
-      </w:r>
-      <w:r>
-        <w:rPr>
-          <w:lang w:val="ru-RU"/>
-        </w:rPr>
-        <w:tab/>
-        <w:t xml:space="preserve">  </w:t>
-      </w:r>
-      <w:r>
-        <w:t>(1.1)</w:t>
+          <w:rFonts w:eastAsia="Arial Unicode MS" w:cs="Times New Roman"/>
+          <w:lang w:val="uk-UA"/>
+        </w:rPr>
+        <w:t xml:space="preserve"> </w:t>
+      </w:r>
+      <w:r>
+        <w:rPr>
+          <w:rFonts w:eastAsia="Arial Unicode MS" w:cs="Times New Roman"/>
+          <w:bCs/>
+          <w:color w:val="000000"/>
+          <w:szCs w:val="28"/>
+          <w:u w:color="000000"/>
+          <w:bdr w:val="nil"/>
+          <w:lang w:val="uk-UA" w:eastAsia="ru-RU"/>
+        </w:rPr>
+        <w:t xml:space="preserve">під час виконання, що разом із механізмами динамічного балансування навантаження та злиття кошиків дозволило досягти прискорення до 65 разів порівняно з найкращими послідовними аналогами </w:t>
+      </w:r>
+      <w:r>
+        <w:rPr>
+          <w:rFonts w:eastAsia="Arial Unicode MS" w:cs="Times New Roman"/>
+          <w:bCs/>
+          <w:color w:val="000000"/>
+          <w:szCs w:val="28"/>
+          <w:u w:color="000000"/>
+          <w:bdr w:val="nil"/>
+          <w:lang w:val="uk-UA" w:eastAsia="ru-RU"/>
+        </w:rPr>
+        <w:t xml:space="preserve">на </w:t>
+      </w:r>
+      <w:r>
+        <w:rPr>
+          <w:rFonts w:eastAsia="Arial Unicode MS" w:cs="Times New Roman"/>
+          <w:bCs/>
+          <w:color w:val="000000"/>
+          <w:szCs w:val="28"/>
+          <w:u w:color="000000"/>
+          <w:bdr w:val="nil"/>
+          <w:lang w:val="uk-UA" w:eastAsia="ru-RU"/>
+        </w:rPr>
+        <w:t>спецефічних графах</w:t>
+      </w:r>
+      <w:r>
+        <w:rPr>
+          <w:rFonts w:eastAsia="Arial Unicode MS" w:cs="Times New Roman"/>
+          <w:bCs/>
+          <w:color w:val="000000"/>
+          <w:szCs w:val="28"/>
+          <w:u w:color="000000"/>
+          <w:bdr w:val="nil"/>
+          <w:lang w:val="uk-UA" w:eastAsia="ru-RU"/>
+        </w:rPr>
+        <w:t xml:space="preserve">. </w:t>
+      </w:r>
+    </w:p>
+    <w:p>
+      <w:pPr>
+        <w:rPr>
+          <w:rFonts w:eastAsia="Arial Unicode MS" w:cs="Times New Roman"/>
+          <w:bCs/>
+          <w:color w:val="000000"/>
+          <w:szCs w:val="28"/>
+          <w:u w:color="000000"/>
+          <w:bdr w:val="nil"/>
+          <w:lang w:val="uk-UA" w:eastAsia="ru-RU"/>
+        </w:rPr>
+      </w:pPr>
+      <w:r>
+        <w:rPr>
+          <w:rFonts w:eastAsia="Arial Unicode MS" w:cs="Times New Roman"/>
+          <w:bCs/>
+          <w:color w:val="000000"/>
+          <w:szCs w:val="28"/>
+          <w:u w:color="000000"/>
+          <w:bdr w:val="nil"/>
+          <w:lang w:val="uk-UA" w:eastAsia="ru-RU"/>
+        </w:rPr>
+        <w:t xml:space="preserve">Паралелізація алгоритму для </w:t>
+      </w:r>
+      <w:r>
+        <w:rPr>
+          <w:rFonts w:eastAsia="Arial Unicode MS" w:cs="Times New Roman"/>
+          <w:bCs/>
+          <w:color w:val="000000"/>
+          <w:szCs w:val="28"/>
+          <w:u w:color="000000"/>
+          <w:bdr w:val="nil"/>
+          <w:lang w:val="en-US" w:eastAsia="ru-RU"/>
+        </w:rPr>
+        <w:t>GPU</w:t>
+      </w:r>
+      <w:r>
+        <w:rPr>
+          <w:rFonts w:eastAsia="Arial Unicode MS" w:cs="Times New Roman"/>
+          <w:bCs/>
+          <w:color w:val="000000"/>
+          <w:szCs w:val="28"/>
+          <w:u w:color="000000"/>
+          <w:bdr w:val="nil"/>
+          <w:lang w:val="uk-UA" w:eastAsia="ru-RU"/>
+        </w:rPr>
+        <w:t xml:space="preserve"> стикається зі значними труднощами через динамічну природу структур даних </w:t>
+      </w:r>
+      <m:oMath>
+        <m:r>
+          <m:rPr>
+            <m:sty m:val="bi"/>
+          </m:rPr>
+          <w:rPr>
+            <w:rFonts w:ascii="Cambria Math" w:hAnsi="Cambria Math"/>
+            <w:lang w:val="uk-UA"/>
+          </w:rPr>
+          <m:t>∆</m:t>
+        </m:r>
+      </m:oMath>
+      <w:r>
+        <w:rPr>
+          <w:rFonts w:eastAsia="Arial Unicode MS" w:cs="Times New Roman"/>
+          <w:b/>
+          <w:lang w:val="uk-UA"/>
+        </w:rPr>
+        <w:t>-</w:t>
+      </w:r>
+      <w:r>
+        <w:rPr>
+          <w:rFonts w:eastAsia="Arial Unicode MS" w:cs="Times New Roman"/>
+          <w:bCs/>
+          <w:color w:val="000000"/>
+          <w:szCs w:val="28"/>
+          <w:u w:color="000000"/>
+          <w:bdr w:val="nil"/>
+          <w:lang w:val="uk-UA" w:eastAsia="ru-RU"/>
+        </w:rPr>
+        <w:t>степінгу та архітектуру SIMD, що погано працює з нерівномірним навантаженням. Однак ці обмеження долаю</w:t>
+      </w:r>
+      <w:r>
+        <w:rPr>
+          <w:rFonts w:eastAsia="Arial Unicode MS" w:cs="Times New Roman"/>
+          <w:bCs/>
+          <w:color w:val="000000"/>
+          <w:szCs w:val="28"/>
+          <w:u w:color="000000"/>
+          <w:bdr w:val="nil"/>
+          <w:lang w:val="uk-UA" w:eastAsia="ru-RU"/>
+        </w:rPr>
+        <w:t>ться в такому алгоритму, як ADDS</w:t>
+      </w:r>
+      <w:r>
+        <w:rPr>
+          <w:rFonts w:eastAsia="Arial Unicode MS" w:cs="Times New Roman"/>
+          <w:bCs/>
+          <w:color w:val="000000"/>
+          <w:szCs w:val="28"/>
+          <w:u w:color="000000"/>
+          <w:bdr w:val="nil"/>
+          <w:lang w:val="uk-UA" w:eastAsia="ru-RU"/>
+        </w:rPr>
+        <w:t>. Використання асинхронного механізму обробки кошиків та покращеного планувальника ро</w:t>
+      </w:r>
+      <w:r>
+        <w:rPr>
+          <w:rFonts w:eastAsia="Arial Unicode MS" w:cs="Times New Roman"/>
+          <w:bCs/>
+          <w:color w:val="000000"/>
+          <w:szCs w:val="28"/>
+          <w:u w:color="000000"/>
+          <w:bdr w:val="nil"/>
+          <w:lang w:val="uk-UA" w:eastAsia="ru-RU"/>
+        </w:rPr>
+        <w:t xml:space="preserve">біт мінімізує простої </w:t>
+      </w:r>
+      <w:r>
+        <w:rPr>
+          <w:rFonts w:eastAsia="Arial Unicode MS" w:cs="Times New Roman"/>
+          <w:bCs/>
+          <w:color w:val="000000"/>
+          <w:szCs w:val="28"/>
+          <w:u w:color="000000"/>
+          <w:bdr w:val="nil"/>
+          <w:lang w:val="uk-UA" w:eastAsia="ru-RU"/>
+        </w:rPr>
+        <w:t>GPU</w:t>
+      </w:r>
+      <w:r>
+        <w:rPr>
+          <w:rFonts w:eastAsia="Arial Unicode MS" w:cs="Times New Roman"/>
+          <w:bCs/>
+          <w:color w:val="000000"/>
+          <w:szCs w:val="28"/>
+          <w:u w:color="000000"/>
+          <w:bdr w:val="nil"/>
+          <w:lang w:val="uk-UA" w:eastAsia="ru-RU"/>
+        </w:rPr>
+        <w:t>.</w:t>
+      </w:r>
+      <w:r>
+        <w:rPr>
+          <w:rFonts w:eastAsia="Arial Unicode MS" w:cs="Times New Roman"/>
+          <w:bCs/>
+          <w:color w:val="000000"/>
+          <w:szCs w:val="28"/>
+          <w:u w:color="000000"/>
+          <w:bdr w:val="nil"/>
+          <w:lang w:val="uk-UA" w:eastAsia="ru-RU"/>
+        </w:rPr>
+        <w:t xml:space="preserve"> </w:t>
+      </w:r>
+    </w:p>
+    <w:p>
+      <w:pPr>
+        <w:rPr>
+          <w:rFonts w:eastAsia="Arial Unicode MS" w:cs="Times New Roman"/>
+          <w:bCs/>
+          <w:color w:val="000000"/>
+          <w:szCs w:val="28"/>
+          <w:u w:color="000000"/>
+          <w:bdr w:val="nil"/>
+          <w:lang w:val="uk-UA" w:eastAsia="ru-RU"/>
+        </w:rPr>
+      </w:pPr>
+      <w:r>
+        <w:rPr>
+          <w:rFonts w:eastAsia="Arial Unicode MS" w:cs="Times New Roman"/>
+          <w:bCs/>
+          <w:color w:val="000000"/>
+          <w:szCs w:val="28"/>
+          <w:u w:color="000000"/>
+          <w:bdr w:val="nil"/>
+          <w:lang w:val="uk-UA" w:eastAsia="ru-RU"/>
+        </w:rPr>
+        <w:t>Узагальнюючи оригінальну концепцію, д</w:t>
+      </w:r>
+      <w:r>
+        <w:rPr>
+          <w:rFonts w:eastAsia="Arial Unicode MS" w:cs="Times New Roman"/>
+          <w:bCs/>
+          <w:color w:val="000000"/>
+          <w:szCs w:val="28"/>
+          <w:u w:color="000000"/>
+          <w:bdr w:val="nil"/>
+          <w:lang w:val="uk-UA" w:eastAsia="ru-RU"/>
+        </w:rPr>
+        <w:t>ля роботи з надвеликими графами, які не вміщуються в</w:t>
+      </w:r>
+      <w:r>
+        <w:rPr>
+          <w:rFonts w:eastAsia="Arial Unicode MS" w:cs="Times New Roman"/>
+          <w:bCs/>
+          <w:color w:val="000000"/>
+          <w:szCs w:val="28"/>
+          <w:u w:color="000000"/>
+          <w:bdr w:val="nil"/>
+          <w:lang w:val="uk-UA" w:eastAsia="ru-RU"/>
+        </w:rPr>
+        <w:t xml:space="preserve"> оперативну пам’ять одного комп’</w:t>
+      </w:r>
+      <w:r>
+        <w:rPr>
+          <w:rFonts w:eastAsia="Arial Unicode MS" w:cs="Times New Roman"/>
+          <w:bCs/>
+          <w:color w:val="000000"/>
+          <w:szCs w:val="28"/>
+          <w:u w:color="000000"/>
+          <w:bdr w:val="nil"/>
+          <w:lang w:val="uk-UA" w:eastAsia="ru-RU"/>
+        </w:rPr>
+        <w:t>ютера, застосовуються рішення дл</w:t>
+      </w:r>
+      <w:r>
+        <w:rPr>
+          <w:rFonts w:eastAsia="Arial Unicode MS" w:cs="Times New Roman"/>
+          <w:bCs/>
+          <w:color w:val="000000"/>
+          <w:szCs w:val="28"/>
+          <w:u w:color="000000"/>
+          <w:bdr w:val="nil"/>
+          <w:lang w:val="uk-UA" w:eastAsia="ru-RU"/>
+        </w:rPr>
+        <w:t>я кластерів із розподіленою пам’</w:t>
+      </w:r>
+      <w:r>
+        <w:rPr>
+          <w:rFonts w:eastAsia="Arial Unicode MS" w:cs="Times New Roman"/>
+          <w:bCs/>
+          <w:color w:val="000000"/>
+          <w:szCs w:val="28"/>
+          <w:u w:color="000000"/>
+          <w:bdr w:val="nil"/>
+          <w:lang w:val="uk-UA" w:eastAsia="ru-RU"/>
+        </w:rPr>
+        <w:t>яттю на базі стандарту MPI. У таких реалізаціях використовується слабке масштабування, а вершини графу розподіляються між обчислювальними вузлами, які локально обробляють свої «кошики» та обмінюються повідо</w:t>
+      </w:r>
+      <w:r>
+        <w:rPr>
+          <w:rFonts w:eastAsia="Arial Unicode MS" w:cs="Times New Roman"/>
+          <w:bCs/>
+          <w:color w:val="000000"/>
+          <w:szCs w:val="28"/>
+          <w:u w:color="000000"/>
+          <w:bdr w:val="nil"/>
+          <w:lang w:val="uk-UA" w:eastAsia="ru-RU"/>
+        </w:rPr>
+        <w:t>мленнями про зміну відстаней</w:t>
+      </w:r>
+      <w:r>
+        <w:rPr>
+          <w:rFonts w:eastAsia="Arial Unicode MS" w:cs="Times New Roman"/>
+          <w:bCs/>
+          <w:color w:val="000000"/>
+          <w:szCs w:val="28"/>
+          <w:u w:color="000000"/>
+          <w:bdr w:val="nil"/>
+          <w:lang w:val="uk-UA" w:eastAsia="ru-RU"/>
+        </w:rPr>
+        <w:t xml:space="preserve">. </w:t>
+      </w:r>
+    </w:p>
+    <w:p>
+      <w:pPr>
+        <w:rPr>
+          <w:rFonts w:eastAsia="Arial Unicode MS" w:cs="Times New Roman"/>
+          <w:bCs/>
+          <w:color w:val="000000"/>
+          <w:szCs w:val="28"/>
+          <w:u w:color="000000"/>
+          <w:bdr w:val="nil"/>
+          <w:lang w:val="uk-UA" w:eastAsia="ru-RU"/>
+        </w:rPr>
+      </w:pPr>
+      <w:r>
+        <w:rPr>
+          <w:rFonts w:eastAsia="Arial Unicode MS" w:cs="Times New Roman"/>
+          <w:bCs/>
+          <w:color w:val="000000"/>
+          <w:szCs w:val="28"/>
+          <w:u w:color="000000"/>
+          <w:bdr w:val="nil"/>
+          <w:lang w:val="uk-UA" w:eastAsia="ru-RU"/>
+        </w:rPr>
+        <w:t xml:space="preserve">Висока ефективність та масштабованість алгоритму призвели до того, що </w:t>
+      </w:r>
+      <m:oMath>
+        <m:r>
+          <m:rPr>
+            <m:sty m:val="bi"/>
+          </m:rPr>
+          <w:rPr>
+            <w:rFonts w:ascii="Cambria Math" w:hAnsi="Cambria Math"/>
+            <w:lang w:val="uk-UA"/>
+          </w:rPr>
+          <m:t>∆</m:t>
+        </m:r>
+      </m:oMath>
+      <w:r>
+        <w:rPr>
+          <w:rFonts w:eastAsia="Arial Unicode MS" w:cs="Times New Roman"/>
+          <w:b/>
+          <w:lang w:val="uk-UA"/>
+        </w:rPr>
+        <w:t>-</w:t>
+      </w:r>
+      <w:r>
+        <w:rPr>
+          <w:rFonts w:eastAsia="Arial Unicode MS" w:cs="Times New Roman"/>
+          <w:bCs/>
+          <w:color w:val="000000"/>
+          <w:szCs w:val="28"/>
+          <w:u w:color="000000"/>
+          <w:bdr w:val="nil"/>
+          <w:lang w:val="uk-UA" w:eastAsia="ru-RU"/>
+        </w:rPr>
+        <w:t>степінг та його узагальнені варіанти</w:t>
+      </w:r>
+      <w:r>
+        <w:rPr>
+          <w:rFonts w:eastAsia="Arial Unicode MS" w:cs="Times New Roman"/>
+          <w:bCs/>
+          <w:color w:val="000000"/>
+          <w:szCs w:val="28"/>
+          <w:u w:color="000000"/>
+          <w:bdr w:val="nil"/>
+          <w:lang w:val="uk-UA" w:eastAsia="ru-RU"/>
+        </w:rPr>
+        <w:t xml:space="preserve"> стали</w:t>
+      </w:r>
+      <w:r>
+        <w:rPr>
+          <w:rFonts w:eastAsia="Arial Unicode MS" w:cs="Times New Roman"/>
+          <w:bCs/>
+          <w:color w:val="000000"/>
+          <w:szCs w:val="28"/>
+          <w:u w:color="000000"/>
+          <w:bdr w:val="nil"/>
+          <w:lang w:val="uk-UA" w:eastAsia="ru-RU"/>
+        </w:rPr>
+        <w:t xml:space="preserve"> вбудованими інструментами у фреймворках</w:t>
+      </w:r>
+      <w:r>
+        <w:rPr>
+          <w:rFonts w:eastAsia="Arial Unicode MS" w:cs="Times New Roman"/>
+          <w:bCs/>
+          <w:color w:val="000000"/>
+          <w:szCs w:val="28"/>
+          <w:u w:color="000000"/>
+          <w:bdr w:val="nil"/>
+          <w:lang w:val="uk-UA" w:eastAsia="ru-RU"/>
+        </w:rPr>
+        <w:t>, як, наприклад,</w:t>
+      </w:r>
+      <w:r>
+        <w:rPr>
+          <w:rFonts w:eastAsia="Arial Unicode MS" w:cs="Times New Roman"/>
+          <w:bCs/>
+          <w:color w:val="000000"/>
+          <w:szCs w:val="28"/>
+          <w:u w:color="000000"/>
+          <w:bdr w:val="nil"/>
+          <w:lang w:val="uk-UA" w:eastAsia="ru-RU"/>
+        </w:rPr>
+        <w:t xml:space="preserve"> Neo4j Graph Data Science [5].</w:t>
+      </w:r>
+    </w:p>
+    <w:p>
+      <w:pPr>
+        <w:rPr>
+          <w:rFonts w:eastAsia="Arial Unicode MS" w:cs="Times New Roman"/>
+          <w:bCs/>
+          <w:color w:val="000000"/>
+          <w:szCs w:val="28"/>
+          <w:u w:color="000000"/>
+          <w:bdr w:val="nil"/>
+          <w:lang w:val="uk-UA" w:eastAsia="ru-RU"/>
+        </w:rPr>
+      </w:pPr>
+      <w:r>
+        <w:rPr>
+          <w:rFonts w:eastAsia="Arial Unicode MS" w:cs="Times New Roman"/>
+          <w:bCs/>
+          <w:color w:val="000000"/>
+          <w:szCs w:val="28"/>
+          <w:u w:color="000000"/>
+          <w:bdr w:val="nil"/>
+          <w:lang w:val="uk-UA" w:eastAsia="ru-RU"/>
+        </w:rPr>
+        <w:t>Таким чином, н</w:t>
+      </w:r>
+      <w:r>
+        <w:rPr>
+          <w:rFonts w:eastAsia="Arial Unicode MS" w:cs="Times New Roman"/>
+          <w:bCs/>
+          <w:color w:val="000000"/>
+          <w:szCs w:val="28"/>
+          <w:u w:color="000000"/>
+          <w:bdr w:val="nil"/>
+          <w:lang w:val="uk-UA" w:eastAsia="ru-RU"/>
+        </w:rPr>
+        <w:t>езважаючи на наявність пот</w:t>
+      </w:r>
+      <w:r>
+        <w:rPr>
+          <w:rFonts w:eastAsia="Arial Unicode MS" w:cs="Times New Roman"/>
+          <w:bCs/>
+          <w:color w:val="000000"/>
+          <w:szCs w:val="28"/>
+          <w:u w:color="000000"/>
+          <w:bdr w:val="nil"/>
+          <w:lang w:val="uk-UA" w:eastAsia="ru-RU"/>
+        </w:rPr>
+        <w:t xml:space="preserve">ужних реалізацій на C++, MPI, </w:t>
+      </w:r>
+      <w:r>
+        <w:rPr>
+          <w:rFonts w:eastAsia="Arial Unicode MS" w:cs="Times New Roman"/>
+          <w:bCs/>
+          <w:color w:val="000000"/>
+          <w:szCs w:val="28"/>
+          <w:u w:color="000000"/>
+          <w:bdr w:val="nil"/>
+          <w:lang w:val="uk-UA" w:eastAsia="ru-RU"/>
+        </w:rPr>
+        <w:t>CUDA</w:t>
+      </w:r>
+      <w:r>
+        <w:rPr>
+          <w:rFonts w:eastAsia="Arial Unicode MS" w:cs="Times New Roman"/>
+          <w:bCs/>
+          <w:color w:val="000000"/>
+          <w:szCs w:val="28"/>
+          <w:u w:color="000000"/>
+          <w:bdr w:val="nil"/>
+          <w:lang w:val="uk-UA" w:eastAsia="ru-RU"/>
+        </w:rPr>
+        <w:t xml:space="preserve"> та інших</w:t>
+      </w:r>
+      <w:r>
+        <w:rPr>
+          <w:rFonts w:eastAsia="Arial Unicode MS" w:cs="Times New Roman"/>
+          <w:bCs/>
+          <w:color w:val="000000"/>
+          <w:szCs w:val="28"/>
+          <w:u w:color="000000"/>
+          <w:bdr w:val="nil"/>
+          <w:lang w:val="uk-UA" w:eastAsia="ru-RU"/>
+        </w:rPr>
+        <w:t>, створення ефективної паралельної версії мовою Python залишається актуальним завданням. На сьогодні Python є стандартом де-факто в галузі аналізу даних</w:t>
+      </w:r>
+      <w:r>
+        <w:rPr>
+          <w:rFonts w:eastAsia="Arial Unicode MS" w:cs="Times New Roman"/>
+          <w:bCs/>
+          <w:color w:val="000000"/>
+          <w:szCs w:val="28"/>
+          <w:u w:color="000000"/>
+          <w:bdr w:val="nil"/>
+          <w:lang w:val="uk-UA" w:eastAsia="ru-RU"/>
+        </w:rPr>
+        <w:t xml:space="preserve">, </w:t>
+      </w:r>
+      <w:r>
+        <w:rPr>
+          <w:rFonts w:eastAsia="Arial Unicode MS" w:cs="Times New Roman"/>
+          <w:bCs/>
+          <w:color w:val="000000"/>
+          <w:szCs w:val="28"/>
+          <w:u w:color="000000"/>
+          <w:bdr w:val="nil"/>
+          <w:lang w:val="uk-UA" w:eastAsia="ru-RU"/>
+        </w:rPr>
+        <w:t xml:space="preserve">проте більшість популярних бібліотек обробки графів пропонують переважно послідовні реалізації алгоритмів. Розробка паралельного </w:t>
+      </w:r>
+      <w:r>
+        <w:rPr>
+          <w:rFonts w:eastAsia="Arial Unicode MS" w:cs="Times New Roman"/>
+          <w:bCs/>
+          <w:color w:val="000000"/>
+          <w:szCs w:val="28"/>
+          <w:u w:color="000000"/>
+          <w:bdr w:val="nil"/>
+          <w:lang w:val="uk-UA" w:eastAsia="ru-RU"/>
+        </w:rPr>
+        <w:lastRenderedPageBreak/>
+        <w:t xml:space="preserve">алгоритму </w:t>
+      </w:r>
+      <m:oMath>
+        <m:r>
+          <m:rPr>
+            <m:sty m:val="bi"/>
+          </m:rPr>
+          <w:rPr>
+            <w:rFonts w:ascii="Cambria Math" w:hAnsi="Cambria Math"/>
+            <w:lang w:val="uk-UA"/>
+          </w:rPr>
+          <m:t>∆</m:t>
+        </m:r>
+      </m:oMath>
+      <w:r>
+        <w:rPr>
+          <w:rFonts w:eastAsia="Arial Unicode MS" w:cs="Times New Roman"/>
+          <w:b/>
+          <w:lang w:val="uk-UA"/>
+        </w:rPr>
+        <w:t>-</w:t>
+      </w:r>
+      <w:r>
+        <w:rPr>
+          <w:rFonts w:eastAsia="Arial Unicode MS" w:cs="Times New Roman"/>
+          <w:bCs/>
+          <w:color w:val="000000"/>
+          <w:szCs w:val="28"/>
+          <w:u w:color="000000"/>
+          <w:bdr w:val="nil"/>
+          <w:lang w:val="uk-UA" w:eastAsia="ru-RU"/>
+        </w:rPr>
+        <w:t>степінгу з використанням механі</w:t>
+      </w:r>
+      <w:r>
+        <w:rPr>
+          <w:rFonts w:eastAsia="Arial Unicode MS" w:cs="Times New Roman"/>
+          <w:bCs/>
+          <w:color w:val="000000"/>
+          <w:szCs w:val="28"/>
+          <w:u w:color="000000"/>
+          <w:bdr w:val="nil"/>
+          <w:lang w:val="uk-UA" w:eastAsia="ru-RU"/>
+        </w:rPr>
+        <w:t xml:space="preserve">змів багатопроцесорності </w:t>
+      </w:r>
+      <w:r>
+        <w:rPr>
+          <w:rFonts w:eastAsia="Arial Unicode MS" w:cs="Times New Roman"/>
+          <w:bCs/>
+          <w:color w:val="000000"/>
+          <w:szCs w:val="28"/>
+          <w:u w:color="000000"/>
+          <w:bdr w:val="nil"/>
+          <w:lang w:val="uk-UA" w:eastAsia="ru-RU"/>
+        </w:rPr>
+        <w:t xml:space="preserve">та спільної пам'яті дозволить значно прискорити аналіз великих графів, зберігаючи при цьому легкість інтеграції </w:t>
+      </w:r>
+      <w:r>
+        <w:rPr>
+          <w:rFonts w:eastAsia="Arial Unicode MS" w:cs="Times New Roman"/>
+          <w:bCs/>
+          <w:color w:val="000000"/>
+          <w:szCs w:val="28"/>
+          <w:u w:color="000000"/>
+          <w:bdr w:val="nil"/>
+          <w:lang w:val="uk-UA" w:eastAsia="ru-RU"/>
+        </w:rPr>
+        <w:t xml:space="preserve">у середовищі, що використовує мову </w:t>
+      </w:r>
+      <w:r>
+        <w:rPr>
+          <w:rFonts w:eastAsia="Arial Unicode MS" w:cs="Times New Roman"/>
+          <w:bCs/>
+          <w:color w:val="000000"/>
+          <w:szCs w:val="28"/>
+          <w:u w:color="000000"/>
+          <w:bdr w:val="nil"/>
+          <w:lang w:val="en-US" w:eastAsia="ru-RU"/>
+        </w:rPr>
+        <w:t>Python</w:t>
+      </w:r>
+      <w:r>
+        <w:rPr>
+          <w:rFonts w:eastAsia="Arial Unicode MS" w:cs="Times New Roman"/>
+          <w:bCs/>
+          <w:color w:val="000000"/>
+          <w:szCs w:val="28"/>
+          <w:u w:color="000000"/>
+          <w:bdr w:val="nil"/>
+          <w:lang w:val="uk-UA" w:eastAsia="ru-RU"/>
+        </w:rPr>
+        <w:t>.</w:t>
       </w:r>
     </w:p>
     <w:p>
@@ -10145,7 +10581,19 @@
           <w:bdr w:val="nil"/>
           <w:lang w:val="uk-UA" w:eastAsia="ru-RU"/>
         </w:rPr>
-        <w:t>…..</w:t>
+        <w:t>https://www.researchgate.net/publication/47843063_Heaps_Are_Better_than_Buckets_Parallel_Shortest_Paths_on_Unbalanced_Graphs</w:t>
+      </w:r>
+      <w:r>
+        <w:rPr>
+          <w:rFonts w:eastAsia="Arial Unicode MS" w:cs="Times New Roman"/>
+          <w:bCs/>
+          <w:color w:val="000000"/>
+          <w:szCs w:val="28"/>
+          <w:u w:color="000000"/>
+          <w:bdr w:val="nil"/>
+          <w:lang w:val="uk-UA" w:eastAsia="ru-RU"/>
+        </w:rPr>
+        <w:t>….</w:t>
       </w:r>
       <w:r>
         <w:rPr>
@@ -10187,19 +10635,7 @@
           <w:bdr w:val="nil"/>
           <w:lang w:val="uk-UA" w:eastAsia="ru-RU"/>
         </w:rPr>
-        <w:t>….</w:t>
-      </w:r>
-      <w:r>
-        <w:rPr>
-          <w:rFonts w:eastAsia="Arial Unicode MS" w:cs="Times New Roman"/>
-          <w:bCs/>
-          <w:color w:val="000000"/>
-          <w:szCs w:val="28"/>
-          <w:u w:color="000000"/>
-          <w:bdr w:val="nil"/>
-          <w:lang w:val="uk-UA" w:eastAsia="ru-RU"/>
-        </w:rPr>
-        <w:t>.</w:t>
+        <w:t>https://ieeexplore.ieee.org/document/10938422</w:t>
       </w:r>
     </w:p>
     <w:p>
@@ -10229,19 +10665,7 @@
           <w:bdr w:val="nil"/>
           <w:lang w:val="uk-UA" w:eastAsia="ru-RU"/>
         </w:rPr>
-        <w:t>….</w:t>
-      </w:r>
-      <w:r>
-        <w:rPr>
-          <w:rFonts w:eastAsia="Arial Unicode MS" w:cs="Times New Roman"/>
-          <w:bCs/>
-          <w:color w:val="000000"/>
-          <w:szCs w:val="28"/>
-          <w:u w:color="000000"/>
-          <w:bdr w:val="nil"/>
-          <w:lang w:val="uk-UA" w:eastAsia="ru-RU"/>
-        </w:rPr>
-        <w:t>.</w:t>
+        <w:t>https://arifuzzaman.faculty.unlv.edu/paper/HPEC24_sssp.pdf</w:t>
       </w:r>
     </w:p>
     <w:p>
@@ -10271,37 +10695,7 @@
           <w:bdr w:val="nil"/>
           <w:lang w:val="uk-UA" w:eastAsia="ru-RU"/>
         </w:rPr>
-        <w:t>….</w:t>
-      </w:r>
-    </w:p>
-    <w:p>
-      <w:pPr>
-        <w:pStyle w:val="ad"/>
-        <w:numPr>
-          <w:ilvl w:val="0"/>
-          <w:numId w:val="6"/>
-        </w:numPr>
-        <w:rPr>
-          <w:rFonts w:eastAsia="Arial Unicode MS" w:cs="Times New Roman"/>
-          <w:bCs/>
-          <w:color w:val="000000"/>
-          <w:szCs w:val="28"/>
-          <w:u w:color="000000"/>
-          <w:bdr w:val="nil"/>
-          <w:lang w:val="uk-UA" w:eastAsia="ru-RU"/>
-        </w:rPr>
-      </w:pPr>
-      <w:r>
-        <w:rPr>
-          <w:rFonts w:eastAsia="Arial Unicode MS" w:cs="Times New Roman"/>
-          <w:bCs/>
-          <w:color w:val="000000"/>
-          <w:szCs w:val="28"/>
-          <w:u w:color="000000"/>
-          <w:bdr w:val="nil"/>
-          <w:lang w:val="uk-UA" w:eastAsia="ru-RU"/>
-        </w:rPr>
-        <w:t>…..</w:t>
+        <w:t>https://neo4j.com/docs/graph-data-science/current/algorithms/delta-single-source/</w:t>
       </w:r>
     </w:p>
     <w:p>
@@ -10697,7 +11091,7 @@
             <w:noProof/>
             <w:szCs w:val="28"/>
           </w:rPr>
-          <w:t>12</w:t>
+          <w:t>21</w:t>
         </w:r>
         <w:r>
           <w:rPr>
@@ -12874,569 +13268,6 @@
 </w:styles>
 </file>
 
-<file path=word/glossary/document.xml><?xml version="1.0" encoding="utf-8"?>
-<w:glossaryDocument xmlns:wpc="http://schemas.microsoft.com/office/word/2010/wordprocessingCanvas" xmlns:mc="http://schemas.openxmlformats.org/markup-compatibility/2006" xmlns:o="urn:schemas-microsoft-com:office:office" xmlns:r="http://schemas.openxmlformats.org/officeDocument/2006/relationships" xmlns:m="http://schemas.openxmlformats.org/officeDocument/2006/math" xmlns:v="urn:schemas-microsoft-com:vml" xmlns:wp14="http://schemas.microsoft.com/office/word/2010/wordprocessingDrawing" xmlns:wp="http://schemas.openxmlformats.org/drawingml/2006/wordprocessingDrawing" xmlns:w10="urn:schemas-microsoft-com:office:word" xmlns:w="http://schemas.openxmlformats.org/wordprocessingml/2006/main" xmlns:w14="http://schemas.microsoft.com/office/word/2010/wordml" xmlns:w15="http://schemas.microsoft.com/office/word/2012/wordml" xmlns:wpg="http://schemas.microsoft.com/office/word/2010/wordprocessingGroup" xmlns:wpi="http://schemas.microsoft.com/office/word/2010/wordprocessingInk" xmlns:wne="http://schemas.microsoft.com/office/word/2006/wordml" xmlns:wps="http://schemas.microsoft.com/office/word/2010/wordprocessingShape" mc:Ignorable="w14 w15 wp14"/>
-</file>
-
-<file path=word/glossary/fontTable.xml><?xml version="1.0" encoding="utf-8"?>
-<w:fonts xmlns:mc="http://schemas.openxmlformats.org/markup-compatibility/2006" xmlns:r="http://schemas.openxmlformats.org/officeDocument/2006/relationships" xmlns:w="http://schemas.openxmlformats.org/wordprocessingml/2006/main" xmlns:w14="http://schemas.microsoft.com/office/word/2010/wordml" xmlns:w15="http://schemas.microsoft.com/office/word/2012/wordml" mc:Ignorable="w14 w15">
-  <w:font w:name="Times New Roman">
-    <w:panose1 w:val="02020603050405020304"/>
-    <w:charset w:val="CC"/>
-    <w:family w:val="roman"/>
-    <w:pitch w:val="variable"/>
-    <w:sig w:usb0="E0002EFF" w:usb1="C000785B" w:usb2="00000009" w:usb3="00000000" w:csb0="000001FF" w:csb1="00000000"/>
-  </w:font>
-  <w:font w:name="Symbol">
-    <w:panose1 w:val="05050102010706020507"/>
-    <w:charset w:val="02"/>
-    <w:family w:val="roman"/>
-    <w:pitch w:val="variable"/>
-    <w:sig w:usb0="00000000" w:usb1="10000000" w:usb2="00000000" w:usb3="00000000" w:csb0="80000000" w:csb1="00000000"/>
-  </w:font>
-  <w:font w:name="Courier New">
-    <w:panose1 w:val="02070309020205020404"/>
-    <w:charset w:val="CC"/>
-    <w:family w:val="modern"/>
-    <w:pitch w:val="fixed"/>
-    <w:sig w:usb0="E0002EFF" w:usb1="C0007843" w:usb2="00000009" w:usb3="00000000" w:csb0="000001FF" w:csb1="00000000"/>
-  </w:font>
-  <w:font w:name="Wingdings">
-    <w:panose1 w:val="05000000000000000000"/>
-    <w:charset w:val="02"/>
-    <w:family w:val="auto"/>
-    <w:pitch w:val="variable"/>
-    <w:sig w:usb0="00000000" w:usb1="10000000" w:usb2="00000000" w:usb3="00000000" w:csb0="80000000" w:csb1="00000000"/>
-  </w:font>
-  <w:font w:name="Arial Unicode MS">
-    <w:panose1 w:val="020B0604020202020204"/>
-    <w:charset w:val="80"/>
-    <w:family w:val="swiss"/>
-    <w:pitch w:val="variable"/>
-    <w:sig w:usb0="F7FFAFFF" w:usb1="E9DFFFFF" w:usb2="0000003F" w:usb3="00000000" w:csb0="003F01FF" w:csb1="00000000"/>
-  </w:font>
-  <w:font w:name="Calibri">
-    <w:panose1 w:val="020F0502020204030204"/>
-    <w:charset w:val="CC"/>
-    <w:family w:val="swiss"/>
-    <w:pitch w:val="variable"/>
-    <w:sig w:usb0="E4002EFF" w:usb1="C000247B" w:usb2="00000009" w:usb3="00000000" w:csb0="000001FF" w:csb1="00000000"/>
-  </w:font>
-  <w:font w:name="Times New Roman (Headings CS)">
-    <w:altName w:val="Times New Roman"/>
-    <w:panose1 w:val="00000000000000000000"/>
-    <w:charset w:val="00"/>
-    <w:family w:val="roman"/>
-    <w:notTrueType/>
-    <w:pitch w:val="default"/>
-  </w:font>
-  <w:font w:name="Segoe UI">
-    <w:panose1 w:val="020B0502040204020203"/>
-    <w:charset w:val="CC"/>
-    <w:family w:val="swiss"/>
-    <w:pitch w:val="variable"/>
-    <w:sig w:usb0="E4002EFF" w:usb1="C000E47F" w:usb2="00000009" w:usb3="00000000" w:csb0="000001FF" w:csb1="00000000"/>
-  </w:font>
-  <w:font w:name="Cambria Math">
-    <w:panose1 w:val="02040503050406030204"/>
-    <w:charset w:val="CC"/>
-    <w:family w:val="roman"/>
-    <w:pitch w:val="variable"/>
-    <w:sig w:usb0="E00006FF" w:usb1="420024FF" w:usb2="02000000" w:usb3="00000000" w:csb0="0000019F" w:csb1="00000000"/>
-  </w:font>
-  <w:font w:name="Calibri Light">
-    <w:panose1 w:val="020F0302020204030204"/>
-    <w:charset w:val="CC"/>
-    <w:family w:val="swiss"/>
-    <w:pitch w:val="variable"/>
-    <w:sig w:usb0="E4002EFF" w:usb1="C000247B" w:usb2="00000009" w:usb3="00000000" w:csb0="000001FF" w:csb1="00000000"/>
-  </w:font>
-</w:fonts>
-</file>
-
-<file path=word/glossary/settings.xml><?xml version="1.0" encoding="utf-8"?>
-<w:settings xmlns:mc="http://schemas.openxmlformats.org/markup-compatibility/2006" xmlns:o="urn:schemas-microsoft-com:office:office" xmlns:r="http://schemas.openxmlformats.org/officeDocument/2006/relationships" xmlns:m="http://schemas.openxmlformats.org/officeDocument/2006/math" xmlns:v="urn:schemas-microsoft-com:vml" xmlns:w10="urn:schemas-microsoft-com:office:word" xmlns:w="http://schemas.openxmlformats.org/wordprocessingml/2006/main" xmlns:w14="http://schemas.microsoft.com/office/word/2010/wordml" xmlns:w15="http://schemas.microsoft.com/office/word/2012/wordml" xmlns:sl="http://schemas.openxmlformats.org/schemaLibrary/2006/main" mc:Ignorable="w14 w15">
-  <w:view w:val="normal"/>
-  <w:revisionView w:markup="0" w:comments="0" w:insDel="0" w:formatting="0" w:inkAnnotations="0"/>
-  <w:defaultTabStop w:val="708"/>
-  <w:characterSpacingControl w:val="doNotCompress"/>
-  <w:compat>
-    <w:useFELayout/>
-    <w:compatSetting w:name="compatibilityMode" w:uri="http://schemas.microsoft.com/office/word" w:val="15"/>
-    <w:compatSetting w:name="overrideTableStyleFontSizeAndJustification" w:uri="http://schemas.microsoft.com/office/word" w:val="1"/>
-    <w:compatSetting w:name="enableOpenTypeFeatures" w:uri="http://schemas.microsoft.com/office/word" w:val="1"/>
-    <w:compatSetting w:name="doNotFlipMirrorIndents" w:uri="http://schemas.microsoft.com/office/word" w:val="1"/>
-    <w:compatSetting w:name="differentiateMultirowTableHeaders" w:uri="http://schemas.microsoft.com/office/word" w:val="1"/>
-  </w:compat>
-  <w:rsids>
-    <w:rsidRoot w:val="00A4238B"/>
-    <w:rsid w:val="008D44B8"/>
-    <w:rsid w:val="00A4238B"/>
-    <w:rsid w:val="00D432EB"/>
-    <w:rsid w:val="00E503B6"/>
-  </w:rsids>
-  <m:mathPr>
-    <m:mathFont m:val="Cambria Math"/>
-    <m:brkBin m:val="before"/>
-    <m:brkBinSub m:val="--"/>
-    <m:smallFrac m:val="0"/>
-    <m:dispDef/>
-    <m:lMargin m:val="0"/>
-    <m:rMargin m:val="0"/>
-    <m:defJc m:val="centerGroup"/>
-    <m:wrapIndent m:val="1440"/>
-    <m:intLim m:val="subSup"/>
-    <m:naryLim m:val="undOvr"/>
-  </m:mathPr>
-  <w:themeFontLang w:val="ru-RU"/>
-  <w:clrSchemeMapping w:bg1="light1" w:t1="dark1" w:bg2="light2" w:t2="dark2" w:accent1="accent1" w:accent2="accent2" w:accent3="accent3" w:accent4="accent4" w:accent5="accent5" w:accent6="accent6" w:hyperlink="hyperlink" w:followedHyperlink="followedHyperlink"/>
-  <w:decimalSymbol w:val=","/>
-  <w:listSeparator w:val=";"/>
-  <w15:chartTrackingRefBased/>
-</w:settings>
-</file>
-
-<file path=word/glossary/styles.xml><?xml version="1.0" encoding="utf-8"?>
-<w:styles xmlns:mc="http://schemas.openxmlformats.org/markup-compatibility/2006" xmlns:r="http://schemas.openxmlformats.org/officeDocument/2006/relationships" xmlns:w="http://schemas.openxmlformats.org/wordprocessingml/2006/main" xmlns:w14="http://schemas.microsoft.com/office/word/2010/wordml" xmlns:w15="http://schemas.microsoft.com/office/word/2012/wordml" mc:Ignorable="w14 w15">
-  <w:docDefaults>
-    <w:rPrDefault>
-      <w:rPr>
-        <w:rFonts w:asciiTheme="minorHAnsi" w:eastAsiaTheme="minorEastAsia" w:hAnsiTheme="minorHAnsi" w:cstheme="minorBidi"/>
-        <w:sz w:val="22"/>
-        <w:szCs w:val="22"/>
-        <w:lang w:val="ru-RU" w:eastAsia="ru-RU" w:bidi="ar-SA"/>
-      </w:rPr>
-    </w:rPrDefault>
-    <w:pPrDefault>
-      <w:pPr>
-        <w:spacing w:after="160" w:line="259" w:lineRule="auto"/>
-      </w:pPr>
-    </w:pPrDefault>
-  </w:docDefaults>
-  <w:latentStyles w:defLockedState="0" w:defUIPriority="99" w:defSemiHidden="0" w:defUnhideWhenUsed="0" w:defQFormat="0" w:count="371">
-    <w:lsdException w:name="Normal" w:uiPriority="0" w:qFormat="1"/>
-    <w:lsdException w:name="heading 1" w:uiPriority="9" w:qFormat="1"/>
-    <w:lsdException w:name="heading 2" w:semiHidden="1" w:uiPriority="9" w:unhideWhenUsed="1" w:qFormat="1"/>
-    <w:lsdException w:name="heading 3" w:semiHidden="1" w:uiPriority="9" w:unhideWhenUsed="1" w:qFormat="1"/>
-    <w:lsdException w:name="heading 4" w:semiHidden="1" w:uiPriority="9" w:unhideWhenUsed="1" w:qFormat="1"/>
-    <w:lsdException w:name="heading 5" w:semiHidden="1" w:uiPriority="9" w:unhideWhenUsed="1" w:qFormat="1"/>
-    <w:lsdException w:name="heading 6" w:semiHidden="1" w:uiPriority="9" w:unhideWhenUsed="1" w:qFormat="1"/>
-    <w:lsdException w:name="heading 7" w:semiHidden="1" w:uiPriority="9" w:unhideWhenUsed="1" w:qFormat="1"/>
-    <w:lsdException w:name="heading 8" w:semiHidden="1" w:uiPriority="9" w:unhideWhenUsed="1" w:qFormat="1"/>
-    <w:lsdException w:name="heading 9" w:semiHidden="1" w:uiPriority="9" w:unhideWhenUsed="1" w:qFormat="1"/>
-    <w:lsdException w:name="index 1" w:semiHidden="1" w:unhideWhenUsed="1"/>
-    <w:lsdException w:name="index 2" w:semiHidden="1" w:unhideWhenUsed="1"/>
-    <w:lsdException w:name="index 3" w:semiHidden="1" w:unhideWhenUsed="1"/>
-    <w:lsdException w:name="index 4" w:semiHidden="1" w:unhideWhenUsed="1"/>
-    <w:lsdException w:name="index 5" w:semiHidden="1" w:unhideWhenUsed="1"/>
-    <w:lsdException w:name="index 6" w:semiHidden="1" w:unhideWhenUsed="1"/>
-    <w:lsdException w:name="index 7" w:semiHidden="1" w:unhideWhenUsed="1"/>
-    <w:lsdException w:name="index 8" w:semiHidden="1" w:unhideWhenUsed="1"/>
-    <w:lsdException w:name="index 9" w:semiHidden="1" w:unhideWhenUsed="1"/>
-    <w:lsdException w:name="toc 1" w:semiHidden="1" w:uiPriority="39" w:unhideWhenUsed="1"/>
-    <w:lsdException w:name="toc 2" w:semiHidden="1" w:uiPriority="39" w:unhideWhenUsed="1"/>
-    <w:lsdException w:name="toc 3" w:semiHidden="1" w:uiPriority="39" w:unhideWhenUsed="1"/>
-    <w:lsdException w:name="toc 4" w:semiHidden="1" w:uiPriority="39" w:unhideWhenUsed="1"/>
-    <w:lsdException w:name="toc 5" w:semiHidden="1" w:uiPriority="39" w:unhideWhenUsed="1"/>
-    <w:lsdException w:name="toc 6" w:semiHidden="1" w:uiPriority="39" w:unhideWhenUsed="1"/>
-    <w:lsdException w:name="toc 7" w:semiHidden="1" w:uiPriority="39" w:unhideWhenUsed="1"/>
-    <w:lsdException w:name="toc 8" w:semiHidden="1" w:uiPriority="39" w:unhideWhenUsed="1"/>
-    <w:lsdException w:name="toc 9" w:semiHidden="1" w:uiPriority="39" w:unhideWhenUsed="1"/>
-    <w:lsdException w:name="Normal Indent" w:semiHidden="1" w:unhideWhenUsed="1"/>
-    <w:lsdException w:name="footnote text" w:semiHidden="1" w:unhideWhenUsed="1"/>
-    <w:lsdException w:name="annotation text" w:semiHidden="1" w:unhideWhenUsed="1"/>
-    <w:lsdException w:name="header" w:semiHidden="1" w:unhideWhenUsed="1"/>
-    <w:lsdException w:name="footer" w:semiHidden="1" w:unhideWhenUsed="1"/>
-    <w:lsdException w:name="index heading" w:semiHidden="1" w:unhideWhenUsed="1"/>
-    <w:lsdException w:name="caption" w:semiHidden="1" w:uiPriority="35" w:unhideWhenUsed="1" w:qFormat="1"/>
-    <w:lsdException w:name="table of figures" w:semiHidden="1" w:unhideWhenUsed="1"/>
-    <w:lsdException w:name="envelope address" w:semiHidden="1" w:unhideWhenUsed="1"/>
-    <w:lsdException w:name="envelope return" w:semiHidden="1" w:unhideWhenUsed="1"/>
-    <w:lsdException w:name="footnote reference" w:semiHidden="1" w:unhideWhenUsed="1"/>
-    <w:lsdException w:name="annotation reference" w:semiHidden="1" w:unhideWhenUsed="1"/>
-    <w:lsdException w:name="line number" w:semiHidden="1" w:unhideWhenUsed="1"/>
-    <w:lsdException w:name="page number" w:semiHidden="1" w:unhideWhenUsed="1"/>
-    <w:lsdException w:name="endnote reference" w:semiHidden="1" w:unhideWhenUsed="1"/>
-    <w:lsdException w:name="endnote text" w:semiHidden="1" w:unhideWhenUsed="1"/>
-    <w:lsdException w:name="table of authorities" w:semiHidden="1" w:unhideWhenUsed="1"/>
-    <w:lsdException w:name="macro" w:semiHidden="1" w:unhideWhenUsed="1"/>
-    <w:lsdException w:name="toa heading" w:semiHidden="1" w:unhideWhenUsed="1"/>
-    <w:lsdException w:name="List" w:semiHidden="1" w:unhideWhenUsed="1"/>
-    <w:lsdException w:name="List Bullet" w:semiHidden="1" w:unhideWhenUsed="1"/>
-    <w:lsdException w:name="List Number" w:semiHidden="1" w:unhideWhenUsed="1"/>
-    <w:lsdException w:name="List 2" w:semiHidden="1" w:unhideWhenUsed="1"/>
-    <w:lsdException w:name="List 3" w:semiHidden="1" w:unhideWhenUsed="1"/>
-    <w:lsdException w:name="List 4" w:semiHidden="1" w:unhideWhenUsed="1"/>
-    <w:lsdException w:name="List 5" w:semiHidden="1" w:unhideWhenUsed="1"/>
-    <w:lsdException w:name="List Bullet 2" w:semiHidden="1" w:unhideWhenUsed="1"/>
-    <w:lsdException w:name="List Bullet 3" w:semiHidden="1" w:unhideWhenUsed="1"/>
-    <w:lsdException w:name="List Bullet 4" w:semiHidden="1" w:unhideWhenUsed="1"/>
-    <w:lsdException w:name="List Bullet 5" w:semiHidden="1" w:unhideWhenUsed="1"/>
-    <w:lsdException w:name="List Number 2" w:semiHidden="1" w:unhideWhenUsed="1"/>
-    <w:lsdException w:name="List Number 3" w:semiHidden="1" w:unhideWhenUsed="1"/>
-    <w:lsdException w:name="List Number 4" w:semiHidden="1" w:unhideWhenUsed="1"/>
-    <w:lsdException w:name="List Number 5" w:semiHidden="1" w:unhideWhenUsed="1"/>
-    <w:lsdException w:name="Title" w:uiPriority="10" w:qFormat="1"/>
-    <w:lsdException w:name="Closing" w:semiHidden="1" w:unhideWhenUsed="1"/>
-    <w:lsdException w:name="Signature" w:semiHidden="1" w:unhideWhenUsed="1"/>
-    <w:lsdException w:name="Default Paragraph Font" w:semiHidden="1" w:uiPriority="1" w:unhideWhenUsed="1"/>
-    <w:lsdException w:name="Body Text" w:semiHidden="1" w:unhideWhenUsed="1"/>
-    <w:lsdException w:name="Body Text Indent" w:semiHidden="1" w:unhideWhenUsed="1"/>
-    <w:lsdException w:name="List Continue" w:semiHidden="1" w:unhideWhenUsed="1"/>
-    <w:lsdException w:name="List Continue 2" w:semiHidden="1" w:unhideWhenUsed="1"/>
-    <w:lsdException w:name="List Continue 3" w:semiHidden="1" w:unhideWhenUsed="1"/>
-    <w:lsdException w:name="List Continue 4" w:semiHidden="1" w:unhideWhenUsed="1"/>
-    <w:lsdException w:name="List Continue 5" w:semiHidden="1" w:unhideWhenUsed="1"/>
-    <w:lsdException w:name="Message Header" w:semiHidden="1" w:unhideWhenUsed="1"/>
-    <w:lsdException w:name="Subtitle" w:uiPriority="11" w:qFormat="1"/>
-    <w:lsdException w:name="Salutation" w:semiHidden="1" w:unhideWhenUsed="1"/>
-    <w:lsdException w:name="Date" w:semiHidden="1" w:unhideWhenUsed="1"/>
-    <w:lsdException w:name="Body Text First Indent" w:semiHidden="1" w:unhideWhenUsed="1"/>
-    <w:lsdException w:name="Body Text First Indent 2" w:semiHidden="1" w:unhideWhenUsed="1"/>
-    <w:lsdException w:name="Note Heading" w:semiHidden="1" w:unhideWhenUsed="1"/>
-    <w:lsdException w:name="Body Text 2" w:semiHidden="1" w:unhideWhenUsed="1"/>
-    <w:lsdException w:name="Body Text 3" w:semiHidden="1" w:unhideWhenUsed="1"/>
-    <w:lsdException w:name="Body Text Indent 2" w:semiHidden="1" w:unhideWhenUsed="1"/>
-    <w:lsdException w:name="Body Text Indent 3" w:semiHidden="1" w:unhideWhenUsed="1"/>
-    <w:lsdException w:name="Block Text" w:semiHidden="1" w:unhideWhenUsed="1"/>
-    <w:lsdException w:name="Hyperlink" w:semiHidden="1" w:unhideWhenUsed="1"/>
-    <w:lsdException w:name="FollowedHyperlink" w:semiHidden="1" w:unhideWhenUsed="1"/>
-    <w:lsdException w:name="Strong" w:uiPriority="22" w:qFormat="1"/>
-    <w:lsdException w:name="Emphasis" w:uiPriority="20" w:qFormat="1"/>
-    <w:lsdException w:name="Document Map" w:semiHidden="1" w:unhideWhenUsed="1"/>
-    <w:lsdException w:name="Plain Text" w:semiHidden="1" w:unhideWhenUsed="1"/>
-    <w:lsdException w:name="E-mail Signature" w:semiHidden="1" w:unhideWhenUsed="1"/>
-    <w:lsdException w:name="HTML Top of Form" w:semiHidden="1" w:unhideWhenUsed="1"/>
-    <w:lsdException w:name="HTML Bottom of Form" w:semiHidden="1" w:unhideWhenUsed="1"/>
-    <w:lsdException w:name="Normal (Web)" w:semiHidden="1" w:unhideWhenUsed="1"/>
-    <w:lsdException w:name="HTML Acronym" w:semiHidden="1" w:unhideWhenUsed="1"/>
-    <w:lsdException w:name="HTML Address" w:semiHidden="1" w:unhideWhenUsed="1"/>
-    <w:lsdException w:name="HTML Cite" w:semiHidden="1" w:unhideWhenUsed="1"/>
-    <w:lsdException w:name="HTML Code" w:semiHidden="1" w:unhideWhenUsed="1"/>
-    <w:lsdException w:name="HTML Definition" w:semiHidden="1" w:unhideWhenUsed="1"/>
-    <w:lsdException w:name="HTML Keyboard" w:semiHidden="1" w:unhideWhenUsed="1"/>
-    <w:lsdException w:name="HTML Preformatted" w:semiHidden="1" w:unhideWhenUsed="1"/>
-    <w:lsdException w:name="HTML Sample" w:semiHidden="1" w:unhideWhenUsed="1"/>
-    <w:lsdException w:name="HTML Typewriter" w:semiHidden="1" w:unhideWhenUsed="1"/>
-    <w:lsdException w:name="HTML Variable" w:semiHidden="1" w:unhideWhenUsed="1"/>
-    <w:lsdException w:name="Normal Table" w:semiHidden="1" w:unhideWhenUsed="1"/>
-    <w:lsdException w:name="annotation subject" w:semiHidden="1" w:unhideWhenUsed="1"/>
-    <w:lsdException w:name="No List" w:semiHidden="1" w:unhideWhenUsed="1"/>
-    <w:lsdException w:name="Outline List 1" w:semiHidden="1" w:unhideWhenUsed="1"/>
-    <w:lsdException w:name="Outline List 2" w:semiHidden="1" w:unhideWhenUsed="1"/>
-    <w:lsdException w:name="Outline List 3" w:semiHidden="1" w:unhideWhenUsed="1"/>
-    <w:lsdException w:name="Table Simple 1" w:semiHidden="1" w:unhideWhenUsed="1"/>
-    <w:lsdException w:name="Table Simple 2" w:semiHidden="1" w:unhideWhenUsed="1"/>
-    <w:lsdException w:name="Table Simple 3" w:semiHidden="1" w:unhideWhenUsed="1"/>
-    <w:lsdException w:name="Table Classic 1" w:semiHidden="1" w:unhideWhenUsed="1"/>
-    <w:lsdException w:name="Table Classic 2" w:semiHidden="1" w:unhideWhenUsed="1"/>
-    <w:lsdException w:name="Table Classic 3" w:semiHidden="1" w:unhideWhenUsed="1"/>
-    <w:lsdException w:name="Table Classic 4" w:semiHidden="1" w:unhideWhenUsed="1"/>
-    <w:lsdException w:name="Table Colorful 1" w:semiHidden="1" w:unhideWhenUsed="1"/>
-    <w:lsdException w:name="Table Colorful 2" w:semiHidden="1" w:unhideWhenUsed="1"/>
-    <w:lsdException w:name="Table Colorful 3" w:semiHidden="1" w:unhideWhenUsed="1"/>
-    <w:lsdException w:name="Table Columns 1" w:semiHidden="1" w:unhideWhenUsed="1"/>
-    <w:lsdException w:name="Table Columns 2" w:semiHidden="1" w:unhideWhenUsed="1"/>
-    <w:lsdException w:name="Table Columns 3" w:semiHidden="1" w:unhideWhenUsed="1"/>
-    <w:lsdException w:name="Table Columns 4" w:semiHidden="1" w:unhideWhenUsed="1"/>
-    <w:lsdException w:name="Table Columns 5" w:semiHidden="1" w:unhideWhenUsed="1"/>
-    <w:lsdException w:name="Table Grid 1" w:semiHidden="1" w:unhideWhenUsed="1"/>
-    <w:lsdException w:name="Table Grid 2" w:semiHidden="1" w:unhideWhenUsed="1"/>
-    <w:lsdException w:name="Table Grid 3" w:semiHidden="1" w:unhideWhenUsed="1"/>
-    <w:lsdException w:name="Table Grid 4" w:semiHidden="1" w:unhideWhenUsed="1"/>
-    <w:lsdException w:name="Table Grid 5" w:semiHidden="1" w:unhideWhenUsed="1"/>
-    <w:lsdException w:name="Table Grid 6" w:semiHidden="1" w:unhideWhenUsed="1"/>
-    <w:lsdException w:name="Table Grid 7" w:semiHidden="1" w:unhideWhenUsed="1"/>
-    <w:lsdException w:name="Table Grid 8" w:semiHidden="1" w:unhideWhenUsed="1"/>
-    <w:lsdException w:name="Table List 1" w:semiHidden="1" w:unhideWhenUsed="1"/>
-    <w:lsdException w:name="Table List 2" w:semiHidden="1" w:unhideWhenUsed="1"/>
-    <w:lsdException w:name="Table List 3" w:semiHidden="1" w:unhideWhenUsed="1"/>
-    <w:lsdException w:name="Table List 4" w:semiHidden="1" w:unhideWhenUsed="1"/>
-    <w:lsdException w:name="Table List 5" w:semiHidden="1" w:unhideWhenUsed="1"/>
-    <w:lsdException w:name="Table List 6" w:semiHidden="1" w:unhideWhenUsed="1"/>
-    <w:lsdException w:name="Table List 7" w:semiHidden="1" w:unhideWhenUsed="1"/>
-    <w:lsdException w:name="Table List 8" w:semiHidden="1" w:unhideWhenUsed="1"/>
-    <w:lsdException w:name="Table 3D effects 1" w:semiHidden="1" w:unhideWhenUsed="1"/>
-    <w:lsdException w:name="Table 3D effects 2" w:semiHidden="1" w:unhideWhenUsed="1"/>
-    <w:lsdException w:name="Table 3D effects 3" w:semiHidden="1" w:unhideWhenUsed="1"/>
-    <w:lsdException w:name="Table Contemporary" w:semiHidden="1" w:unhideWhenUsed="1"/>
-    <w:lsdException w:name="Table Elegant" w:semiHidden="1" w:unhideWhenUsed="1"/>
-    <w:lsdException w:name="Table Professional" w:semiHidden="1" w:unhideWhenUsed="1"/>
-    <w:lsdException w:name="Table Subtle 1" w:semiHidden="1" w:unhideWhenUsed="1"/>
-    <w:lsdException w:name="Table Subtle 2" w:semiHidden="1" w:unhideWhenUsed="1"/>
-    <w:lsdException w:name="Table Web 1" w:semiHidden="1" w:unhideWhenUsed="1"/>
-    <w:lsdException w:name="Table Web 2" w:semiHidden="1" w:unhideWhenUsed="1"/>
-    <w:lsdException w:name="Table Web 3" w:semiHidden="1" w:unhideWhenUsed="1"/>
-    <w:lsdException w:name="Balloon Text" w:semiHidden="1" w:unhideWhenUsed="1"/>
-    <w:lsdException w:name="Table Grid" w:uiPriority="39"/>
-    <w:lsdException w:name="Table Theme" w:semiHidden="1" w:unhideWhenUsed="1"/>
-    <w:lsdException w:name="Placeholder Text" w:semiHidden="1"/>
-    <w:lsdException w:name="No Spacing" w:uiPriority="1" w:qFormat="1"/>
-    <w:lsdException w:name="Light Shading" w:uiPriority="60"/>
-    <w:lsdException w:name="Light List" w:uiPriority="61"/>
-    <w:lsdException w:name="Light Grid" w:uiPriority="62"/>
-    <w:lsdException w:name="Medium Shading 1" w:uiPriority="63"/>
-    <w:lsdException w:name="Medium Shading 2" w:uiPriority="64"/>
-    <w:lsdException w:name="Medium List 1" w:uiPriority="65"/>
-    <w:lsdException w:name="Medium List 2" w:uiPriority="66"/>
-    <w:lsdException w:name="Medium Grid 1" w:uiPriority="67"/>
-    <w:lsdException w:name="Medium Grid 2" w:uiPriority="68"/>
-    <w:lsdException w:name="Medium Grid 3" w:uiPriority="69"/>
-    <w:lsdException w:name="Dark List" w:uiPriority="70"/>
-    <w:lsdException w:name="Colorful Shading" w:uiPriority="71"/>
-    <w:lsdException w:name="Colorful List" w:uiPriority="72"/>
-    <w:lsdException w:name="Colorful Grid" w:uiPriority="73"/>
-    <w:lsdException w:name="Light Shading Accent 1" w:uiPriority="60"/>
-    <w:lsdException w:name="Light List Accent 1" w:uiPriority="61"/>
-    <w:lsdException w:name="Light Grid Accent 1" w:uiPriority="62"/>
-    <w:lsdException w:name="Medium Shading 1 Accent 1" w:uiPriority="63"/>
-    <w:lsdException w:name="Medium Shading 2 Accent 1" w:uiPriority="64"/>
-    <w:lsdException w:name="Medium List 1 Accent 1" w:uiPriority="65"/>
-    <w:lsdException w:name="Revision" w:semiHidden="1"/>
-    <w:lsdException w:name="List Paragraph" w:uiPriority="34" w:qFormat="1"/>
-    <w:lsdException w:name="Quote" w:uiPriority="29" w:qFormat="1"/>
-    <w:lsdException w:name="Intense Quote" w:uiPriority="30" w:qFormat="1"/>
-    <w:lsdException w:name="Medium List 2 Accent 1" w:uiPriority="66"/>
-    <w:lsdException w:name="Medium Grid 1 Accent 1" w:uiPriority="67"/>
-    <w:lsdException w:name="Medium Grid 2 Accent 1" w:uiPriority="68"/>
-    <w:lsdException w:name="Medium Grid 3 Accent 1" w:uiPriority="69"/>
-    <w:lsdException w:name="Dark List Accent 1" w:uiPriority="70"/>
-    <w:lsdException w:name="Colorful Shading Accent 1" w:uiPriority="71"/>
-    <w:lsdException w:name="Colorful List Accent 1" w:uiPriority="72"/>
-    <w:lsdException w:name="Colorful Grid Accent 1" w:uiPriority="73"/>
-    <w:lsdException w:name="Light Shading Accent 2" w:uiPriority="60"/>
-    <w:lsdException w:name="Light List Accent 2" w:uiPriority="61"/>
-    <w:lsdException w:name="Light Grid Accent 2" w:uiPriority="62"/>
-    <w:lsdException w:name="Medium Shading 1 Accent 2" w:uiPriority="63"/>
-    <w:lsdException w:name="Medium Shading 2 Accent 2" w:uiPriority="64"/>
-    <w:lsdException w:name="Medium List 1 Accent 2" w:uiPriority="65"/>
-    <w:lsdException w:name="Medium List 2 Accent 2" w:uiPriority="66"/>
-    <w:lsdException w:name="Medium Grid 1 Accent 2" w:uiPriority="67"/>
-    <w:lsdException w:name="Medium Grid 2 Accent 2" w:uiPriority="68"/>
-    <w:lsdException w:name="Medium Grid 3 Accent 2" w:uiPriority="69"/>
-    <w:lsdException w:name="Dark List Accent 2" w:uiPriority="70"/>
-    <w:lsdException w:name="Colorful Shading Accent 2" w:uiPriority="71"/>
-    <w:lsdException w:name="Colorful List Accent 2" w:uiPriority="72"/>
-    <w:lsdException w:name="Colorful Grid Accent 2" w:uiPriority="73"/>
-    <w:lsdException w:name="Light Shading Accent 3" w:uiPriority="60"/>
-    <w:lsdException w:name="Light List Accent 3" w:uiPriority="61"/>
-    <w:lsdException w:name="Light Grid Accent 3" w:uiPriority="62"/>
-    <w:lsdException w:name="Medium Shading 1 Accent 3" w:uiPriority="63"/>
-    <w:lsdException w:name="Medium Shading 2 Accent 3" w:uiPriority="64"/>
-    <w:lsdException w:name="Medium List 1 Accent 3" w:uiPriority="65"/>
-    <w:lsdException w:name="Medium List 2 Accent 3" w:uiPriority="66"/>
-    <w:lsdException w:name="Medium Grid 1 Accent 3" w:uiPriority="67"/>
-    <w:lsdException w:name="Medium Grid 2 Accent 3" w:uiPriority="68"/>
-    <w:lsdException w:name="Medium Grid 3 Accent 3" w:uiPriority="69"/>
-    <w:lsdException w:name="Dark List Accent 3" w:uiPriority="70"/>
-    <w:lsdException w:name="Colorful Shading Accent 3" w:uiPriority="71"/>
-    <w:lsdException w:name="Colorful List Accent 3" w:uiPriority="72"/>
-    <w:lsdException w:name="Colorful Grid Accent 3" w:uiPriority="73"/>
-    <w:lsdException w:name="Light Shading Accent 4" w:uiPriority="60"/>
-    <w:lsdException w:name="Light List Accent 4" w:uiPriority="61"/>
-    <w:lsdException w:name="Light Grid Accent 4" w:uiPriority="62"/>
-    <w:lsdException w:name="Medium Shading 1 Accent 4" w:uiPriority="63"/>
-    <w:lsdException w:name="Medium Shading 2 Accent 4" w:uiPriority="64"/>
-    <w:lsdException w:name="Medium List 1 Accent 4" w:uiPriority="65"/>
-    <w:lsdException w:name="Medium List 2 Accent 4" w:uiPriority="66"/>
-    <w:lsdException w:name="Medium Grid 1 Accent 4" w:uiPriority="67"/>
-    <w:lsdException w:name="Medium Grid 2 Accent 4" w:uiPriority="68"/>
-    <w:lsdException w:name="Medium Grid 3 Accent 4" w:uiPriority="69"/>
-    <w:lsdException w:name="Dark List Accent 4" w:uiPriority="70"/>
-    <w:lsdException w:name="Colorful Shading Accent 4" w:uiPriority="71"/>
-    <w:lsdException w:name="Colorful List Accent 4" w:uiPriority="72"/>
-    <w:lsdException w:name="Colorful Grid Accent 4" w:uiPriority="73"/>
-    <w:lsdException w:name="Light Shading Accent 5" w:uiPriority="60"/>
-    <w:lsdException w:name="Light List Accent 5" w:uiPriority="61"/>
-    <w:lsdException w:name="Light Grid Accent 5" w:uiPriority="62"/>
-    <w:lsdException w:name="Medium Shading 1 Accent 5" w:uiPriority="63"/>
-    <w:lsdException w:name="Medium Shading 2 Accent 5" w:uiPriority="64"/>
-    <w:lsdException w:name="Medium List 1 Accent 5" w:uiPriority="65"/>
-    <w:lsdException w:name="Medium List 2 Accent 5" w:uiPriority="66"/>
-    <w:lsdException w:name="Medium Grid 1 Accent 5" w:uiPriority="67"/>
-    <w:lsdException w:name="Medium Grid 2 Accent 5" w:uiPriority="68"/>
-    <w:lsdException w:name="Medium Grid 3 Accent 5" w:uiPriority="69"/>
-    <w:lsdException w:name="Dark List Accent 5" w:uiPriority="70"/>
-    <w:lsdException w:name="Colorful Shading Accent 5" w:uiPriority="71"/>
-    <w:lsdException w:name="Colorful List Accent 5" w:uiPriority="72"/>
-    <w:lsdException w:name="Colorful Grid Accent 5" w:uiPriority="73"/>
-    <w:lsdException w:name="Light Shading Accent 6" w:uiPriority="60"/>
-    <w:lsdException w:name="Light List Accent 6" w:uiPriority="61"/>
-    <w:lsdException w:name="Light Grid Accent 6" w:uiPriority="62"/>
-    <w:lsdException w:name="Medium Shading 1 Accent 6" w:uiPriority="63"/>
-    <w:lsdException w:name="Medium Shading 2 Accent 6" w:uiPriority="64"/>
-    <w:lsdException w:name="Medium List 1 Accent 6" w:uiPriority="65"/>
-    <w:lsdException w:name="Medium List 2 Accent 6" w:uiPriority="66"/>
-    <w:lsdException w:name="Medium Grid 1 Accent 6" w:uiPriority="67"/>
-    <w:lsdException w:name="Medium Grid 2 Accent 6" w:uiPriority="68"/>
-    <w:lsdException w:name="Medium Grid 3 Accent 6" w:uiPriority="69"/>
-    <w:lsdException w:name="Dark List Accent 6" w:uiPriority="70"/>
-    <w:lsdException w:name="Colorful Shading Accent 6" w:uiPriority="71"/>
-    <w:lsdException w:name="Colorful List Accent 6" w:uiPriority="72"/>
-    <w:lsdException w:name="Colorful Grid Accent 6" w:uiPriority="73"/>
-    <w:lsdException w:name="Subtle Emphasis" w:uiPriority="19" w:qFormat="1"/>
-    <w:lsdException w:name="Intense Emphasis" w:uiPriority="21" w:qFormat="1"/>
-    <w:lsdException w:name="Subtle Reference" w:uiPriority="31" w:qFormat="1"/>
-    <w:lsdException w:name="Intense Reference" w:uiPriority="32" w:qFormat="1"/>
-    <w:lsdException w:name="Book Title" w:uiPriority="33" w:qFormat="1"/>
-    <w:lsdException w:name="Bibliography" w:semiHidden="1" w:uiPriority="37" w:unhideWhenUsed="1"/>
-    <w:lsdException w:name="TOC Heading" w:semiHidden="1" w:uiPriority="39" w:unhideWhenUsed="1" w:qFormat="1"/>
-    <w:lsdException w:name="Plain Table 1" w:uiPriority="41"/>
-    <w:lsdException w:name="Plain Table 2" w:uiPriority="42"/>
-    <w:lsdException w:name="Plain Table 3" w:uiPriority="43"/>
-    <w:lsdException w:name="Plain Table 4" w:uiPriority="44"/>
-    <w:lsdException w:name="Plain Table 5" w:uiPriority="45"/>
-    <w:lsdException w:name="Grid Table Light" w:uiPriority="40"/>
-    <w:lsdException w:name="Grid Table 1 Light" w:uiPriority="46"/>
-    <w:lsdException w:name="Grid Table 2" w:uiPriority="47"/>
-    <w:lsdException w:name="Grid Table 3" w:uiPriority="48"/>
-    <w:lsdException w:name="Grid Table 4" w:uiPriority="49"/>
-    <w:lsdException w:name="Grid Table 5 Dark" w:uiPriority="50"/>
-    <w:lsdException w:name="Grid Table 6 Colorful" w:uiPriority="51"/>
-    <w:lsdException w:name="Grid Table 7 Colorful" w:uiPriority="52"/>
-    <w:lsdException w:name="Grid Table 1 Light Accent 1" w:uiPriority="46"/>
-    <w:lsdException w:name="Grid Table 2 Accent 1" w:uiPriority="47"/>
-    <w:lsdException w:name="Grid Table 3 Accent 1" w:uiPriority="48"/>
-    <w:lsdException w:name="Grid Table 4 Accent 1" w:uiPriority="49"/>
-    <w:lsdException w:name="Grid Table 5 Dark Accent 1" w:uiPriority="50"/>
-    <w:lsdException w:name="Grid Table 6 Colorful Accent 1" w:uiPriority="51"/>
-    <w:lsdException w:name="Grid Table 7 Colorful Accent 1" w:uiPriority="52"/>
-    <w:lsdException w:name="Grid Table 1 Light Accent 2" w:uiPriority="46"/>
-    <w:lsdException w:name="Grid Table 2 Accent 2" w:uiPriority="47"/>
-    <w:lsdException w:name="Grid Table 3 Accent 2" w:uiPriority="48"/>
-    <w:lsdException w:name="Grid Table 4 Accent 2" w:uiPriority="49"/>
-    <w:lsdException w:name="Grid Table 5 Dark Accent 2" w:uiPriority="50"/>
-    <w:lsdException w:name="Grid Table 6 Colorful Accent 2" w:uiPriority="51"/>
-    <w:lsdException w:name="Grid Table 7 Colorful Accent 2" w:uiPriority="52"/>
-    <w:lsdException w:name="Grid Table 1 Light Accent 3" w:uiPriority="46"/>
-    <w:lsdException w:name="Grid Table 2 Accent 3" w:uiPriority="47"/>
-    <w:lsdException w:name="Grid Table 3 Accent 3" w:uiPriority="48"/>
-    <w:lsdException w:name="Grid Table 4 Accent 3" w:uiPriority="49"/>
-    <w:lsdException w:name="Grid Table 5 Dark Accent 3" w:uiPriority="50"/>
-    <w:lsdException w:name="Grid Table 6 Colorful Accent 3" w:uiPriority="51"/>
-    <w:lsdException w:name="Grid Table 7 Colorful Accent 3" w:uiPriority="52"/>
-    <w:lsdException w:name="Grid Table 1 Light Accent 4" w:uiPriority="46"/>
-    <w:lsdException w:name="Grid Table 2 Accent 4" w:uiPriority="47"/>
-    <w:lsdException w:name="Grid Table 3 Accent 4" w:uiPriority="48"/>
-    <w:lsdException w:name="Grid Table 4 Accent 4" w:uiPriority="49"/>
-    <w:lsdException w:name="Grid Table 5 Dark Accent 4" w:uiPriority="50"/>
-    <w:lsdException w:name="Grid Table 6 Colorful Accent 4" w:uiPriority="51"/>
-    <w:lsdException w:name="Grid Table 7 Colorful Accent 4" w:uiPriority="52"/>
-    <w:lsdException w:name="Grid Table 1 Light Accent 5" w:uiPriority="46"/>
-    <w:lsdException w:name="Grid Table 2 Accent 5" w:uiPriority="47"/>
-    <w:lsdException w:name="Grid Table 3 Accent 5" w:uiPriority="48"/>
-    <w:lsdException w:name="Grid Table 4 Accent 5" w:uiPriority="49"/>
-    <w:lsdException w:name="Grid Table 5 Dark Accent 5" w:uiPriority="50"/>
-    <w:lsdException w:name="Grid Table 6 Colorful Accent 5" w:uiPriority="51"/>
-    <w:lsdException w:name="Grid Table 7 Colorful Accent 5" w:uiPriority="52"/>
-    <w:lsdException w:name="Grid Table 1 Light Accent 6" w:uiPriority="46"/>
-    <w:lsdException w:name="Grid Table 2 Accent 6" w:uiPriority="47"/>
-    <w:lsdException w:name="Grid Table 3 Accent 6" w:uiPriority="48"/>
-    <w:lsdException w:name="Grid Table 4 Accent 6" w:uiPriority="49"/>
-    <w:lsdException w:name="Grid Table 5 Dark Accent 6" w:uiPriority="50"/>
-    <w:lsdException w:name="Grid Table 6 Colorful Accent 6" w:uiPriority="51"/>
-    <w:lsdException w:name="Grid Table 7 Colorful Accent 6" w:uiPriority="52"/>
-    <w:lsdException w:name="List Table 1 Light" w:uiPriority="46"/>
-    <w:lsdException w:name="List Table 2" w:uiPriority="47"/>
-    <w:lsdException w:name="List Table 3" w:uiPriority="48"/>
-    <w:lsdException w:name="List Table 4" w:uiPriority="49"/>
-    <w:lsdException w:name="List Table 5 Dark" w:uiPriority="50"/>
-    <w:lsdException w:name="List Table 6 Colorful" w:uiPriority="51"/>
-    <w:lsdException w:name="List Table 7 Colorful" w:uiPriority="52"/>
-    <w:lsdException w:name="List Table 1 Light Accent 1" w:uiPriority="46"/>
-    <w:lsdException w:name="List Table 2 Accent 1" w:uiPriority="47"/>
-    <w:lsdException w:name="List Table 3 Accent 1" w:uiPriority="48"/>
-    <w:lsdException w:name="List Table 4 Accent 1" w:uiPriority="49"/>
-    <w:lsdException w:name="List Table 5 Dark Accent 1" w:uiPriority="50"/>
-    <w:lsdException w:name="List Table 6 Colorful Accent 1" w:uiPriority="51"/>
-    <w:lsdException w:name="List Table 7 Colorful Accent 1" w:uiPriority="52"/>
-    <w:lsdException w:name="List Table 1 Light Accent 2" w:uiPriority="46"/>
-    <w:lsdException w:name="List Table 2 Accent 2" w:uiPriority="47"/>
-    <w:lsdException w:name="List Table 3 Accent 2" w:uiPriority="48"/>
-    <w:lsdException w:name="List Table 4 Accent 2" w:uiPriority="49"/>
-    <w:lsdException w:name="List Table 5 Dark Accent 2" w:uiPriority="50"/>
-    <w:lsdException w:name="List Table 6 Colorful Accent 2" w:uiPriority="51"/>
-    <w:lsdException w:name="List Table 7 Colorful Accent 2" w:uiPriority="52"/>
-    <w:lsdException w:name="List Table 1 Light Accent 3" w:uiPriority="46"/>
-    <w:lsdException w:name="List Table 2 Accent 3" w:uiPriority="47"/>
-    <w:lsdException w:name="List Table 3 Accent 3" w:uiPriority="48"/>
-    <w:lsdException w:name="List Table 4 Accent 3" w:uiPriority="49"/>
-    <w:lsdException w:name="List Table 5 Dark Accent 3" w:uiPriority="50"/>
-    <w:lsdException w:name="List Table 6 Colorful Accent 3" w:uiPriority="51"/>
-    <w:lsdException w:name="List Table 7 Colorful Accent 3" w:uiPriority="52"/>
-    <w:lsdException w:name="List Table 1 Light Accent 4" w:uiPriority="46"/>
-    <w:lsdException w:name="List Table 2 Accent 4" w:uiPriority="47"/>
-    <w:lsdException w:name="List Table 3 Accent 4" w:uiPriority="48"/>
-    <w:lsdException w:name="List Table 4 Accent 4" w:uiPriority="49"/>
-    <w:lsdException w:name="List Table 5 Dark Accent 4" w:uiPriority="50"/>
-    <w:lsdException w:name="List Table 6 Colorful Accent 4" w:uiPriority="51"/>
-    <w:lsdException w:name="List Table 7 Colorful Accent 4" w:uiPriority="52"/>
-    <w:lsdException w:name="List Table 1 Light Accent 5" w:uiPriority="46"/>
-    <w:lsdException w:name="List Table 2 Accent 5" w:uiPriority="47"/>
-    <w:lsdException w:name="List Table 3 Accent 5" w:uiPriority="48"/>
-    <w:lsdException w:name="List Table 4 Accent 5" w:uiPriority="49"/>
-    <w:lsdException w:name="List Table 5 Dark Accent 5" w:uiPriority="50"/>
-    <w:lsdException w:name="List Table 6 Colorful Accent 5" w:uiPriority="51"/>
-    <w:lsdException w:name="List Table 7 Colorful Accent 5" w:uiPriority="52"/>
-    <w:lsdException w:name="List Table 1 Light Accent 6" w:uiPriority="46"/>
-    <w:lsdException w:name="List Table 2 Accent 6" w:uiPriority="47"/>
-    <w:lsdException w:name="List Table 3 Accent 6" w:uiPriority="48"/>
-    <w:lsdException w:name="List Table 4 Accent 6" w:uiPriority="49"/>
-    <w:lsdException w:name="List Table 5 Dark Accent 6" w:uiPriority="50"/>
-    <w:lsdException w:name="List Table 6 Colorful Accent 6" w:uiPriority="51"/>
-    <w:lsdException w:name="List Table 7 Colorful Accent 6" w:uiPriority="52"/>
-  </w:latentStyles>
-  <w:style w:type="paragraph" w:default="1" w:styleId="a">
-    <w:name w:val="Normal"/>
-    <w:qFormat/>
-  </w:style>
-  <w:style w:type="character" w:default="1" w:styleId="a0">
-    <w:name w:val="Default Paragraph Font"/>
-    <w:uiPriority w:val="1"/>
-    <w:semiHidden/>
-    <w:unhideWhenUsed/>
-  </w:style>
-  <w:style w:type="table" w:default="1" w:styleId="a1">
-    <w:name w:val="Normal Table"/>
-    <w:uiPriority w:val="99"/>
-    <w:semiHidden/>
-    <w:unhideWhenUsed/>
-    <w:tblPr>
-      <w:tblInd w:w="0" w:type="dxa"/>
-      <w:tblCellMar>
-        <w:top w:w="0" w:type="dxa"/>
-        <w:left w:w="108" w:type="dxa"/>
-        <w:bottom w:w="0" w:type="dxa"/>
-        <w:right w:w="108" w:type="dxa"/>
-      </w:tblCellMar>
-    </w:tblPr>
-  </w:style>
-  <w:style w:type="numbering" w:default="1" w:styleId="a2">
-    <w:name w:val="No List"/>
-    <w:uiPriority w:val="99"/>
-    <w:semiHidden/>
-    <w:unhideWhenUsed/>
-  </w:style>
-  <w:style w:type="character" w:styleId="a3">
-    <w:name w:val="Placeholder Text"/>
-    <w:basedOn w:val="a0"/>
-    <w:uiPriority w:val="99"/>
-    <w:semiHidden/>
-    <w:rsid w:val="00D432EB"/>
-    <w:rPr>
-      <w:color w:val="808080"/>
-    </w:rPr>
-  </w:style>
-</w:styles>
-</file>
-
-<file path=word/glossary/webSettings.xml><?xml version="1.0" encoding="utf-8"?>
-<w:webSettings xmlns:mc="http://schemas.openxmlformats.org/markup-compatibility/2006" xmlns:r="http://schemas.openxmlformats.org/officeDocument/2006/relationships" xmlns:w="http://schemas.openxmlformats.org/wordprocessingml/2006/main" xmlns:w14="http://schemas.microsoft.com/office/word/2010/wordml" xmlns:w15="http://schemas.microsoft.com/office/word/2012/wordml" mc:Ignorable="w14 w15">
-  <w:optimizeForBrowser/>
-  <w:allowPNG/>
-</w:webSettings>
-</file>
-
 <file path=word/theme/theme1.xml><?xml version="1.0" encoding="utf-8"?>
 <a:theme xmlns:a="http://schemas.openxmlformats.org/drawingml/2006/main" name="Тема Office">
   <a:themeElements>
@@ -13703,7 +13534,7 @@
 </file>
 
 <file path=customXml/itemProps1.xml><?xml version="1.0" encoding="utf-8"?>
-<ds:datastoreItem xmlns:ds="http://schemas.openxmlformats.org/officeDocument/2006/customXml" ds:itemID="{199E3118-3FBE-4259-84F5-1C37975D3088}">
+<ds:datastoreItem xmlns:ds="http://schemas.openxmlformats.org/officeDocument/2006/customXml" ds:itemID="{AD09532D-D7A0-44B3-8E74-18D551E7967B}">
   <ds:schemaRefs>
     <ds:schemaRef ds:uri="http://schemas.openxmlformats.org/officeDocument/2006/bibliography"/>
   </ds:schemaRefs>

</xml_diff>

<commit_message>
docs: change pseudocode after changes in code
</commit_message>
<xml_diff>
--- a/docs/ПЗ.docx
+++ b/docs/ПЗ.docx
@@ -4788,7 +4788,7 @@
             <w:bdr w:val="nil"/>
             <w:lang w:val="en-US" w:eastAsia="ru-RU"/>
           </w:rPr>
-          <m:t>) + 1</m:t>
+          <m:t>) + 2</m:t>
         </m:r>
       </m:oMath>
     </w:p>
@@ -5196,7 +5196,20 @@
           <w:bdr w:val="nil"/>
           <w:lang w:val="en-US" w:eastAsia="ru-RU"/>
         </w:rPr>
-        <w:t>Create bucket_sizes array with max_buckets elements</w:t>
+        <w:lastRenderedPageBreak/>
+        <w:t>Create in_bucket 2D array with max_buckets rows and vertices length cols</w:t>
+      </w:r>
+      <w:r>
+        <w:rPr>
+          <w:rFonts w:eastAsia="Arial Unicode MS" w:cs="Times New Roman"/>
+          <w:bCs/>
+          <w:color w:val="000000"/>
+          <w:szCs w:val="28"/>
+          <w:u w:color="000000"/>
+          <w:bdr w:val="nil"/>
+          <w:lang w:val="en-US" w:eastAsia="ru-RU"/>
+        </w:rPr>
+        <w:t xml:space="preserve"> and set all values to false</w:t>
       </w:r>
     </w:p>
     <w:p>
@@ -5226,7 +5239,36 @@
           <w:bdr w:val="nil"/>
           <w:lang w:val="en-US" w:eastAsia="ru-RU"/>
         </w:rPr>
-        <w:lastRenderedPageBreak/>
+        <w:t>Create bucket_sizes array with max_buckets elements</w:t>
+      </w:r>
+    </w:p>
+    <w:p>
+      <w:pPr>
+        <w:pStyle w:val="ad"/>
+        <w:numPr>
+          <w:ilvl w:val="0"/>
+          <w:numId w:val="10"/>
+        </w:numPr>
+        <w:rPr>
+          <w:rFonts w:eastAsia="Arial Unicode MS" w:cs="Times New Roman"/>
+          <w:bCs/>
+          <w:color w:val="000000"/>
+          <w:szCs w:val="28"/>
+          <w:u w:color="000000"/>
+          <w:bdr w:val="nil"/>
+          <w:lang w:val="en-US" w:eastAsia="ru-RU"/>
+        </w:rPr>
+      </w:pPr>
+      <w:r>
+        <w:rPr>
+          <w:rFonts w:eastAsia="Arial Unicode MS" w:cs="Times New Roman"/>
+          <w:bCs/>
+          <w:color w:val="000000"/>
+          <w:szCs w:val="28"/>
+          <w:u w:color="000000"/>
+          <w:bdr w:val="nil"/>
+          <w:lang w:val="en-US" w:eastAsia="ru-RU"/>
+        </w:rPr>
         <w:t xml:space="preserve">distances[source_vertex] </w:t>
       </w:r>
       <m:oMath>
@@ -5282,7 +5324,21 @@
           <w:bdr w:val="nil"/>
           <w:lang w:val="en-US" w:eastAsia="ru-RU"/>
         </w:rPr>
-        <w:t>Add to bucket(delta, source_vertex, distances, buckets, bucket_sizes, max_buckets)</w:t>
+        <w:t>Add to bucket(delta, source_vertex, distances, buckets, bucket_sizes, max</w:t>
+      </w:r>
+      <w:bookmarkStart w:id="3" w:name="_GoBack"/>
+      <w:bookmarkEnd w:id="3"/>
+      <w:r>
+        <w:rPr>
+          <w:rFonts w:eastAsia="Arial Unicode MS" w:cs="Times New Roman"/>
+          <w:bCs/>
+          <w:color w:val="000000"/>
+          <w:szCs w:val="28"/>
+          <w:u w:color="000000"/>
+          <w:bdr w:val="nil"/>
+          <w:lang w:val="en-US" w:eastAsia="ru-RU"/>
+        </w:rPr>
+        <w:t>_buckets)</w:t>
       </w:r>
     </w:p>
     <w:p>
@@ -5618,6 +5674,60 @@
           <w:lang w:val="en-US" w:eastAsia="ru-RU"/>
         </w:rPr>
         <w:t xml:space="preserve"> buckets[actual_bucket_index, last_vertex_index]</w:t>
+      </w:r>
+    </w:p>
+    <w:p>
+      <w:pPr>
+        <w:pStyle w:val="ad"/>
+        <w:numPr>
+          <w:ilvl w:val="2"/>
+          <w:numId w:val="10"/>
+        </w:numPr>
+        <w:rPr>
+          <w:rFonts w:eastAsia="Arial Unicode MS" w:cs="Times New Roman"/>
+          <w:bCs/>
+          <w:color w:val="000000"/>
+          <w:szCs w:val="28"/>
+          <w:u w:color="000000"/>
+          <w:bdr w:val="nil"/>
+          <w:lang w:val="en-US" w:eastAsia="ru-RU"/>
+        </w:rPr>
+      </w:pPr>
+      <w:r>
+        <w:rPr>
+          <w:rFonts w:eastAsia="Arial Unicode MS" w:cs="Times New Roman"/>
+          <w:bCs/>
+          <w:color w:val="000000"/>
+          <w:szCs w:val="28"/>
+          <w:u w:color="000000"/>
+          <w:bdr w:val="nil"/>
+          <w:lang w:val="en-US" w:eastAsia="ru-RU"/>
+        </w:rPr>
+        <w:t xml:space="preserve">in_bucket[actual_bucket_index, vertex_index] </w:t>
+      </w:r>
+      <m:oMath>
+        <m:r>
+          <w:rPr>
+            <w:rFonts w:ascii="Cambria Math" w:eastAsia="Arial Unicode MS" w:hAnsi="Cambria Math" w:cs="Times New Roman"/>
+            <w:color w:val="000000"/>
+            <w:szCs w:val="28"/>
+            <w:u w:color="000000"/>
+            <w:bdr w:val="nil"/>
+            <w:lang w:val="en-US" w:eastAsia="ru-RU"/>
+          </w:rPr>
+          <m:t>←</m:t>
+        </m:r>
+      </m:oMath>
+      <w:r>
+        <w:rPr>
+          <w:rFonts w:eastAsia="Arial Unicode MS" w:cs="Times New Roman"/>
+          <w:color w:val="000000"/>
+          <w:szCs w:val="28"/>
+          <w:u w:color="000000"/>
+          <w:bdr w:val="nil"/>
+          <w:lang w:val="en-US" w:eastAsia="ru-RU"/>
+        </w:rPr>
+        <w:t xml:space="preserve"> false</w:t>
       </w:r>
     </w:p>
     <w:p>
@@ -5859,50 +5969,8 @@
                         <w:bdr w:val="nil"/>
                         <w:lang w:val="en-US" w:eastAsia="ru-RU"/>
                       </w:rPr>
-                      <m:t>verte</m:t>
+                      <m:t>vertex_index</m:t>
                     </m:r>
-                    <m:sSub>
-                      <m:sSubPr>
-                        <m:ctrlPr>
-                          <w:rPr>
-                            <w:rFonts w:ascii="Cambria Math" w:eastAsia="Arial Unicode MS" w:hAnsi="Cambria Math" w:cs="Times New Roman"/>
-                            <w:bCs/>
-                            <w:i/>
-                            <w:color w:val="000000"/>
-                            <w:szCs w:val="28"/>
-                            <w:u w:color="000000"/>
-                            <w:bdr w:val="nil"/>
-                            <w:lang w:val="en-US" w:eastAsia="ru-RU"/>
-                          </w:rPr>
-                        </m:ctrlPr>
-                      </m:sSubPr>
-                      <m:e>
-                        <m:r>
-                          <w:rPr>
-                            <w:rFonts w:ascii="Cambria Math" w:eastAsia="Arial Unicode MS" w:hAnsi="Cambria Math" w:cs="Times New Roman"/>
-                            <w:color w:val="000000"/>
-                            <w:szCs w:val="28"/>
-                            <w:u w:color="000000"/>
-                            <w:bdr w:val="nil"/>
-                            <w:lang w:val="en-US" w:eastAsia="ru-RU"/>
-                          </w:rPr>
-                          <m:t>x</m:t>
-                        </m:r>
-                      </m:e>
-                      <m:sub>
-                        <m:r>
-                          <w:rPr>
-                            <w:rFonts w:ascii="Cambria Math" w:eastAsia="Arial Unicode MS" w:hAnsi="Cambria Math" w:cs="Times New Roman"/>
-                            <w:color w:val="000000"/>
-                            <w:szCs w:val="28"/>
-                            <w:u w:color="000000"/>
-                            <w:bdr w:val="nil"/>
-                            <w:lang w:val="en-US" w:eastAsia="ru-RU"/>
-                          </w:rPr>
-                          <m:t>index</m:t>
-                        </m:r>
-                      </m:sub>
-                    </m:sSub>
                   </m:e>
                 </m:d>
               </m:num>
@@ -6430,6 +6498,7 @@
           <w:bdr w:val="nil"/>
           <w:lang w:val="en-US" w:eastAsia="ru-RU"/>
         </w:rPr>
+        <w:lastRenderedPageBreak/>
         <w:t>Add  (vertex_index, neighbour_index, edge_weight) to heavy_edges</w:t>
       </w:r>
     </w:p>
@@ -6490,7 +6559,6 @@
           <w:bdr w:val="nil"/>
           <w:lang w:val="en-US" w:eastAsia="ru-RU"/>
         </w:rPr>
-        <w:lastRenderedPageBreak/>
         <w:t xml:space="preserve">If </w:t>
       </w:r>
       <w:r>
@@ -6557,14 +6625,191 @@
           <w:bdr w:val="nil"/>
           <w:lang w:val="en-US" w:eastAsia="ru-RU"/>
         </w:rPr>
-        <w:t>Add to bucket(delta, neighbour_index, distances, buckets, bucket_sizes, max_buckets)</w:t>
+        <w:t xml:space="preserve">bucket_index </w:t>
+      </w:r>
+      <m:oMath>
+        <m:r>
+          <w:rPr>
+            <w:rFonts w:ascii="Cambria Math" w:eastAsia="Arial Unicode MS" w:hAnsi="Cambria Math" w:cs="Times New Roman"/>
+            <w:color w:val="000000"/>
+            <w:szCs w:val="28"/>
+            <w:u w:color="000000"/>
+            <w:bdr w:val="nil"/>
+            <w:lang w:val="en-US" w:eastAsia="ru-RU"/>
+          </w:rPr>
+          <m:t xml:space="preserve">← </m:t>
+        </m:r>
+      </m:oMath>
+      <w:r>
+        <w:rPr>
+          <w:rFonts w:eastAsia="Arial Unicode MS" w:cs="Times New Roman"/>
+          <w:color w:val="000000"/>
+          <w:szCs w:val="28"/>
+          <w:u w:color="000000"/>
+          <w:bdr w:val="nil"/>
+          <w:lang w:val="en-US" w:eastAsia="ru-RU"/>
+        </w:rPr>
+        <w:t xml:space="preserve"> </w:t>
+      </w:r>
+      <m:oMath>
+        <m:r>
+          <w:rPr>
+            <w:rFonts w:ascii="Cambria Math" w:eastAsia="Arial Unicode MS" w:hAnsi="Cambria Math" w:cs="Times New Roman"/>
+            <w:color w:val="000000"/>
+            <w:szCs w:val="28"/>
+            <w:u w:color="000000"/>
+            <w:bdr w:val="nil"/>
+            <w:lang w:val="en-US" w:eastAsia="ru-RU"/>
+          </w:rPr>
+          <m:t>mod(floor</m:t>
+        </m:r>
+        <m:d>
+          <m:dPr>
+            <m:ctrlPr>
+              <w:rPr>
+                <w:rFonts w:ascii="Cambria Math" w:eastAsia="Arial Unicode MS" w:hAnsi="Cambria Math" w:cs="Times New Roman"/>
+                <w:bCs/>
+                <w:i/>
+                <w:color w:val="000000"/>
+                <w:szCs w:val="28"/>
+                <w:u w:color="000000"/>
+                <w:bdr w:val="nil"/>
+                <w:lang w:val="en-US" w:eastAsia="ru-RU"/>
+              </w:rPr>
+            </m:ctrlPr>
+          </m:dPr>
+          <m:e>
+            <m:f>
+              <m:fPr>
+                <m:ctrlPr>
+                  <w:rPr>
+                    <w:rFonts w:ascii="Cambria Math" w:eastAsia="Arial Unicode MS" w:hAnsi="Cambria Math" w:cs="Times New Roman"/>
+                    <w:bCs/>
+                    <w:i/>
+                    <w:color w:val="000000"/>
+                    <w:szCs w:val="28"/>
+                    <w:u w:color="000000"/>
+                    <w:bdr w:val="nil"/>
+                    <w:lang w:val="en-US" w:eastAsia="ru-RU"/>
+                  </w:rPr>
+                </m:ctrlPr>
+              </m:fPr>
+              <m:num>
+                <m:r>
+                  <w:rPr>
+                    <w:rFonts w:ascii="Cambria Math" w:eastAsia="Arial Unicode MS" w:hAnsi="Cambria Math" w:cs="Times New Roman"/>
+                    <w:color w:val="000000"/>
+                    <w:szCs w:val="28"/>
+                    <w:u w:color="000000"/>
+                    <w:bdr w:val="nil"/>
+                    <w:lang w:val="en-US" w:eastAsia="ru-RU"/>
+                  </w:rPr>
+                  <m:t>distances</m:t>
+                </m:r>
+                <m:d>
+                  <m:dPr>
+                    <m:begChr m:val="["/>
+                    <m:endChr m:val="]"/>
+                    <m:ctrlPr>
+                      <w:rPr>
+                        <w:rFonts w:ascii="Cambria Math" w:eastAsia="Arial Unicode MS" w:hAnsi="Cambria Math" w:cs="Times New Roman"/>
+                        <w:bCs/>
+                        <w:i/>
+                        <w:color w:val="000000"/>
+                        <w:szCs w:val="28"/>
+                        <w:u w:color="000000"/>
+                        <w:bdr w:val="nil"/>
+                        <w:lang w:val="en-US" w:eastAsia="ru-RU"/>
+                      </w:rPr>
+                    </m:ctrlPr>
+                  </m:dPr>
+                  <m:e>
+                    <m:r>
+                      <w:rPr>
+                        <w:rFonts w:ascii="Cambria Math" w:eastAsia="Arial Unicode MS" w:hAnsi="Cambria Math" w:cs="Times New Roman"/>
+                        <w:color w:val="000000"/>
+                        <w:szCs w:val="28"/>
+                        <w:u w:color="000000"/>
+                        <w:bdr w:val="nil"/>
+                        <w:lang w:val="en-US" w:eastAsia="ru-RU"/>
+                      </w:rPr>
+                      <m:t>neighbour_index</m:t>
+                    </m:r>
+                  </m:e>
+                </m:d>
+              </m:num>
+              <m:den>
+                <m:r>
+                  <w:rPr>
+                    <w:rFonts w:ascii="Cambria Math" w:eastAsia="Arial Unicode MS" w:hAnsi="Cambria Math" w:cs="Times New Roman"/>
+                    <w:color w:val="000000"/>
+                    <w:szCs w:val="28"/>
+                    <w:u w:color="000000"/>
+                    <w:bdr w:val="nil"/>
+                    <w:lang w:val="en-US" w:eastAsia="ru-RU"/>
+                  </w:rPr>
+                  <m:t>delta</m:t>
+                </m:r>
+              </m:den>
+            </m:f>
+          </m:e>
+        </m:d>
+        <m:r>
+          <w:rPr>
+            <w:rFonts w:ascii="Cambria Math" w:eastAsia="Arial Unicode MS" w:hAnsi="Cambria Math" w:cs="Times New Roman"/>
+            <w:color w:val="000000"/>
+            <w:szCs w:val="28"/>
+            <w:u w:color="000000"/>
+            <w:bdr w:val="nil"/>
+            <w:lang w:val="en-US" w:eastAsia="ru-RU"/>
+          </w:rPr>
+          <m:t xml:space="preserve">, </m:t>
+        </m:r>
+        <m:r>
+          <m:rPr>
+            <m:sty m:val="p"/>
+          </m:rPr>
+          <w:rPr>
+            <w:rFonts w:ascii="Cambria Math" w:eastAsia="Arial Unicode MS" w:hAnsi="Cambria Math" w:cs="Times New Roman"/>
+            <w:color w:val="000000"/>
+            <w:szCs w:val="28"/>
+            <w:u w:color="000000"/>
+            <w:bdr w:val="nil"/>
+            <w:lang w:val="en-US" w:eastAsia="ru-RU"/>
+          </w:rPr>
+          <m:t>max</m:t>
+        </m:r>
+        <m:r>
+          <w:rPr>
+            <w:rFonts w:ascii="Cambria Math" w:eastAsia="Arial Unicode MS" w:hAnsi="Cambria Math" w:cs="Times New Roman"/>
+            <w:color w:val="000000"/>
+            <w:szCs w:val="28"/>
+            <w:u w:color="000000"/>
+            <w:bdr w:val="nil"/>
+            <w:lang w:val="en-US" w:eastAsia="ru-RU"/>
+          </w:rPr>
+          <m:t>_buckets</m:t>
+        </m:r>
+      </m:oMath>
+      <w:r>
+        <w:rPr>
+          <w:rFonts w:eastAsia="Arial Unicode MS" w:cs="Times New Roman"/>
+          <w:bCs/>
+          <w:i/>
+          <w:color w:val="000000"/>
+          <w:szCs w:val="28"/>
+          <w:u w:color="000000"/>
+          <w:bdr w:val="nil"/>
+          <w:lang w:val="en-US" w:eastAsia="ru-RU"/>
+        </w:rPr>
+        <w:t>)</w:t>
       </w:r>
     </w:p>
     <w:p>
       <w:pPr>
         <w:pStyle w:val="ad"/>
         <w:numPr>
-          <w:ilvl w:val="1"/>
+          <w:ilvl w:val="4"/>
           <w:numId w:val="10"/>
         </w:numPr>
         <w:rPr>
@@ -6587,14 +6832,14 @@
           <w:bdr w:val="nil"/>
           <w:lang w:val="en-US" w:eastAsia="ru-RU"/>
         </w:rPr>
-        <w:t xml:space="preserve"> For each element in heavy_edges do:</w:t>
+        <w:t>If NOT in_bucket[bucket_index, neighbour_index] then:</w:t>
       </w:r>
     </w:p>
     <w:p>
       <w:pPr>
         <w:pStyle w:val="ad"/>
         <w:numPr>
-          <w:ilvl w:val="2"/>
+          <w:ilvl w:val="5"/>
           <w:numId w:val="10"/>
         </w:numPr>
         <w:rPr>
@@ -6617,19 +6862,7 @@
           <w:bdr w:val="nil"/>
           <w:lang w:val="en-US" w:eastAsia="ru-RU"/>
         </w:rPr>
-        <w:t>vertex_index, neighbour_index, edge_weight</w:t>
-      </w:r>
-      <w:r>
-        <w:rPr>
-          <w:rFonts w:eastAsia="Arial Unicode MS" w:cs="Times New Roman"/>
-          <w:bCs/>
-          <w:color w:val="000000"/>
-          <w:szCs w:val="28"/>
-          <w:u w:color="000000"/>
-          <w:bdr w:val="nil"/>
-          <w:lang w:val="en-US" w:eastAsia="ru-RU"/>
-        </w:rPr>
-        <w:t xml:space="preserve"> </w:t>
+        <w:t xml:space="preserve">in_bucket[bucket_index, neighbour_index] </w:t>
       </w:r>
       <m:oMath>
         <m:r>
@@ -6647,14 +6880,73 @@
       <w:r>
         <w:rPr>
           <w:rFonts w:eastAsia="Arial Unicode MS" w:cs="Times New Roman"/>
-          <w:bCs/>
-          <w:color w:val="000000"/>
-          <w:szCs w:val="28"/>
-          <w:u w:color="000000"/>
-          <w:bdr w:val="nil"/>
-          <w:lang w:val="en-US" w:eastAsia="ru-RU"/>
-        </w:rPr>
-        <w:t xml:space="preserve"> element</w:t>
+          <w:color w:val="000000"/>
+          <w:szCs w:val="28"/>
+          <w:u w:color="000000"/>
+          <w:bdr w:val="nil"/>
+          <w:lang w:val="en-US" w:eastAsia="ru-RU"/>
+        </w:rPr>
+        <w:t xml:space="preserve"> true</w:t>
+      </w:r>
+    </w:p>
+    <w:p>
+      <w:pPr>
+        <w:pStyle w:val="ad"/>
+        <w:numPr>
+          <w:ilvl w:val="5"/>
+          <w:numId w:val="10"/>
+        </w:numPr>
+        <w:rPr>
+          <w:rFonts w:eastAsia="Arial Unicode MS" w:cs="Times New Roman"/>
+          <w:bCs/>
+          <w:color w:val="000000"/>
+          <w:szCs w:val="28"/>
+          <w:u w:color="000000"/>
+          <w:bdr w:val="nil"/>
+          <w:lang w:val="en-US" w:eastAsia="ru-RU"/>
+        </w:rPr>
+      </w:pPr>
+      <w:r>
+        <w:rPr>
+          <w:rFonts w:eastAsia="Arial Unicode MS" w:cs="Times New Roman"/>
+          <w:bCs/>
+          <w:color w:val="000000"/>
+          <w:szCs w:val="28"/>
+          <w:u w:color="000000"/>
+          <w:bdr w:val="nil"/>
+          <w:lang w:val="en-US" w:eastAsia="ru-RU"/>
+        </w:rPr>
+        <w:t>Add to bucket(delta, neighbour_index, distances, buckets, bucket_sizes, max_buckets)</w:t>
+      </w:r>
+    </w:p>
+    <w:p>
+      <w:pPr>
+        <w:pStyle w:val="ad"/>
+        <w:numPr>
+          <w:ilvl w:val="1"/>
+          <w:numId w:val="10"/>
+        </w:numPr>
+        <w:rPr>
+          <w:rFonts w:eastAsia="Arial Unicode MS" w:cs="Times New Roman"/>
+          <w:bCs/>
+          <w:color w:val="000000"/>
+          <w:szCs w:val="28"/>
+          <w:u w:color="000000"/>
+          <w:bdr w:val="nil"/>
+          <w:lang w:val="en-US" w:eastAsia="ru-RU"/>
+        </w:rPr>
+      </w:pPr>
+      <w:r>
+        <w:rPr>
+          <w:rFonts w:eastAsia="Arial Unicode MS" w:cs="Times New Roman"/>
+          <w:bCs/>
+          <w:color w:val="000000"/>
+          <w:szCs w:val="28"/>
+          <w:u w:color="000000"/>
+          <w:bdr w:val="nil"/>
+          <w:lang w:val="en-US" w:eastAsia="ru-RU"/>
+        </w:rPr>
+        <w:t xml:space="preserve"> For each element in heavy_edges do:</w:t>
       </w:r>
     </w:p>
     <w:p>
@@ -6684,67 +6976,19 @@
           <w:bdr w:val="nil"/>
           <w:lang w:val="en-US" w:eastAsia="ru-RU"/>
         </w:rPr>
-        <w:t>If Relax neighbour(vertex_index, neighbour_index, edge_weight)</w:t>
-      </w:r>
-    </w:p>
-    <w:p>
-      <w:pPr>
-        <w:pStyle w:val="ad"/>
-        <w:numPr>
-          <w:ilvl w:val="3"/>
-          <w:numId w:val="10"/>
-        </w:numPr>
-        <w:rPr>
-          <w:rFonts w:eastAsia="Arial Unicode MS" w:cs="Times New Roman"/>
-          <w:bCs/>
-          <w:color w:val="000000"/>
-          <w:szCs w:val="28"/>
-          <w:u w:color="000000"/>
-          <w:bdr w:val="nil"/>
-          <w:lang w:val="en-US" w:eastAsia="ru-RU"/>
-        </w:rPr>
-      </w:pPr>
-      <w:r>
-        <w:rPr>
-          <w:rFonts w:eastAsia="Arial Unicode MS" w:cs="Times New Roman"/>
-          <w:bCs/>
-          <w:color w:val="000000"/>
-          <w:szCs w:val="28"/>
-          <w:u w:color="000000"/>
-          <w:bdr w:val="nil"/>
-          <w:lang w:val="en-US" w:eastAsia="ru-RU"/>
-        </w:rPr>
-        <w:t>Add to bucket(delta, neighbour_index, distances, buckets, bucket_sizes, max_buckets)</w:t>
-      </w:r>
-    </w:p>
-    <w:p>
-      <w:pPr>
-        <w:pStyle w:val="ad"/>
-        <w:numPr>
-          <w:ilvl w:val="1"/>
-          <w:numId w:val="10"/>
-        </w:numPr>
-        <w:rPr>
-          <w:rFonts w:eastAsia="Arial Unicode MS" w:cs="Times New Roman"/>
-          <w:bCs/>
-          <w:color w:val="000000"/>
-          <w:szCs w:val="28"/>
-          <w:u w:color="000000"/>
-          <w:bdr w:val="nil"/>
-          <w:lang w:val="en-US" w:eastAsia="ru-RU"/>
-        </w:rPr>
-      </w:pPr>
-      <w:r>
-        <w:rPr>
-          <w:rFonts w:eastAsia="Arial Unicode MS" w:cs="Times New Roman"/>
-          <w:bCs/>
-          <w:color w:val="000000"/>
-          <w:szCs w:val="28"/>
-          <w:u w:color="000000"/>
-          <w:bdr w:val="nil"/>
-          <w:lang w:val="en-US" w:eastAsia="ru-RU"/>
-        </w:rPr>
-        <w:t xml:space="preserve"> current_absolute_index </w:t>
+        <w:t>vertex_index, neighbour_index, edge_weight</w:t>
+      </w:r>
+      <w:r>
+        <w:rPr>
+          <w:rFonts w:eastAsia="Arial Unicode MS" w:cs="Times New Roman"/>
+          <w:bCs/>
+          <w:color w:val="000000"/>
+          <w:szCs w:val="28"/>
+          <w:u w:color="000000"/>
+          <w:bdr w:val="nil"/>
+          <w:lang w:val="en-US" w:eastAsia="ru-RU"/>
+        </w:rPr>
+        <w:t xml:space="preserve"> </w:t>
       </w:r>
       <m:oMath>
         <m:r>
@@ -6769,14 +7013,14 @@
           <w:bdr w:val="nil"/>
           <w:lang w:val="en-US" w:eastAsia="ru-RU"/>
         </w:rPr>
-        <w:t xml:space="preserve"> next_non_empty_bucket_absolute_index</w:t>
+        <w:t xml:space="preserve"> element</w:t>
       </w:r>
     </w:p>
     <w:p>
       <w:pPr>
         <w:pStyle w:val="ad"/>
         <w:numPr>
-          <w:ilvl w:val="1"/>
+          <w:ilvl w:val="2"/>
           <w:numId w:val="10"/>
         </w:numPr>
         <w:rPr>
@@ -6799,7 +7043,274 @@
           <w:bdr w:val="nil"/>
           <w:lang w:val="en-US" w:eastAsia="ru-RU"/>
         </w:rPr>
-        <w:t xml:space="preserve"> next_non_empty_bucket_absolute_index </w:t>
+        <w:t>If Relax neighbour(vertex_index, neighbour_index, edge_weight)</w:t>
+      </w:r>
+    </w:p>
+    <w:p>
+      <w:pPr>
+        <w:pStyle w:val="ad"/>
+        <w:numPr>
+          <w:ilvl w:val="3"/>
+          <w:numId w:val="10"/>
+        </w:numPr>
+        <w:rPr>
+          <w:rFonts w:eastAsia="Arial Unicode MS" w:cs="Times New Roman"/>
+          <w:bCs/>
+          <w:color w:val="000000"/>
+          <w:szCs w:val="28"/>
+          <w:u w:color="000000"/>
+          <w:bdr w:val="nil"/>
+          <w:lang w:val="en-US" w:eastAsia="ru-RU"/>
+        </w:rPr>
+      </w:pPr>
+      <w:r>
+        <w:rPr>
+          <w:rFonts w:eastAsia="Arial Unicode MS" w:cs="Times New Roman"/>
+          <w:bCs/>
+          <w:color w:val="000000"/>
+          <w:szCs w:val="28"/>
+          <w:u w:color="000000"/>
+          <w:bdr w:val="nil"/>
+          <w:lang w:val="en-US" w:eastAsia="ru-RU"/>
+        </w:rPr>
+        <w:t xml:space="preserve">bucket_index </w:t>
+      </w:r>
+      <m:oMath>
+        <m:r>
+          <w:rPr>
+            <w:rFonts w:ascii="Cambria Math" w:eastAsia="Arial Unicode MS" w:hAnsi="Cambria Math" w:cs="Times New Roman"/>
+            <w:color w:val="000000"/>
+            <w:szCs w:val="28"/>
+            <w:u w:color="000000"/>
+            <w:bdr w:val="nil"/>
+            <w:lang w:val="en-US" w:eastAsia="ru-RU"/>
+          </w:rPr>
+          <m:t xml:space="preserve">← </m:t>
+        </m:r>
+      </m:oMath>
+      <w:r>
+        <w:rPr>
+          <w:rFonts w:eastAsia="Arial Unicode MS" w:cs="Times New Roman"/>
+          <w:color w:val="000000"/>
+          <w:szCs w:val="28"/>
+          <w:u w:color="000000"/>
+          <w:bdr w:val="nil"/>
+          <w:lang w:val="en-US" w:eastAsia="ru-RU"/>
+        </w:rPr>
+        <w:t xml:space="preserve"> </w:t>
+      </w:r>
+      <m:oMath>
+        <m:r>
+          <w:rPr>
+            <w:rFonts w:ascii="Cambria Math" w:eastAsia="Arial Unicode MS" w:hAnsi="Cambria Math" w:cs="Times New Roman"/>
+            <w:color w:val="000000"/>
+            <w:szCs w:val="28"/>
+            <w:u w:color="000000"/>
+            <w:bdr w:val="nil"/>
+            <w:lang w:val="en-US" w:eastAsia="ru-RU"/>
+          </w:rPr>
+          <m:t>mod(floor</m:t>
+        </m:r>
+        <m:d>
+          <m:dPr>
+            <m:ctrlPr>
+              <w:rPr>
+                <w:rFonts w:ascii="Cambria Math" w:eastAsia="Arial Unicode MS" w:hAnsi="Cambria Math" w:cs="Times New Roman"/>
+                <w:bCs/>
+                <w:i/>
+                <w:color w:val="000000"/>
+                <w:szCs w:val="28"/>
+                <w:u w:color="000000"/>
+                <w:bdr w:val="nil"/>
+                <w:lang w:val="en-US" w:eastAsia="ru-RU"/>
+              </w:rPr>
+            </m:ctrlPr>
+          </m:dPr>
+          <m:e>
+            <m:f>
+              <m:fPr>
+                <m:ctrlPr>
+                  <w:rPr>
+                    <w:rFonts w:ascii="Cambria Math" w:eastAsia="Arial Unicode MS" w:hAnsi="Cambria Math" w:cs="Times New Roman"/>
+                    <w:bCs/>
+                    <w:i/>
+                    <w:color w:val="000000"/>
+                    <w:szCs w:val="28"/>
+                    <w:u w:color="000000"/>
+                    <w:bdr w:val="nil"/>
+                    <w:lang w:val="en-US" w:eastAsia="ru-RU"/>
+                  </w:rPr>
+                </m:ctrlPr>
+              </m:fPr>
+              <m:num>
+                <m:r>
+                  <w:rPr>
+                    <w:rFonts w:ascii="Cambria Math" w:eastAsia="Arial Unicode MS" w:hAnsi="Cambria Math" w:cs="Times New Roman"/>
+                    <w:color w:val="000000"/>
+                    <w:szCs w:val="28"/>
+                    <w:u w:color="000000"/>
+                    <w:bdr w:val="nil"/>
+                    <w:lang w:val="en-US" w:eastAsia="ru-RU"/>
+                  </w:rPr>
+                  <m:t>distances</m:t>
+                </m:r>
+                <m:d>
+                  <m:dPr>
+                    <m:begChr m:val="["/>
+                    <m:endChr m:val="]"/>
+                    <m:ctrlPr>
+                      <w:rPr>
+                        <w:rFonts w:ascii="Cambria Math" w:eastAsia="Arial Unicode MS" w:hAnsi="Cambria Math" w:cs="Times New Roman"/>
+                        <w:bCs/>
+                        <w:i/>
+                        <w:color w:val="000000"/>
+                        <w:szCs w:val="28"/>
+                        <w:u w:color="000000"/>
+                        <w:bdr w:val="nil"/>
+                        <w:lang w:val="en-US" w:eastAsia="ru-RU"/>
+                      </w:rPr>
+                    </m:ctrlPr>
+                  </m:dPr>
+                  <m:e>
+                    <m:r>
+                      <w:rPr>
+                        <w:rFonts w:ascii="Cambria Math" w:eastAsia="Arial Unicode MS" w:hAnsi="Cambria Math" w:cs="Times New Roman"/>
+                        <w:color w:val="000000"/>
+                        <w:szCs w:val="28"/>
+                        <w:u w:color="000000"/>
+                        <w:bdr w:val="nil"/>
+                        <w:lang w:val="en-US" w:eastAsia="ru-RU"/>
+                      </w:rPr>
+                      <m:t>neighbour_index</m:t>
+                    </m:r>
+                  </m:e>
+                </m:d>
+              </m:num>
+              <m:den>
+                <m:r>
+                  <w:rPr>
+                    <w:rFonts w:ascii="Cambria Math" w:eastAsia="Arial Unicode MS" w:hAnsi="Cambria Math" w:cs="Times New Roman"/>
+                    <w:color w:val="000000"/>
+                    <w:szCs w:val="28"/>
+                    <w:u w:color="000000"/>
+                    <w:bdr w:val="nil"/>
+                    <w:lang w:val="en-US" w:eastAsia="ru-RU"/>
+                  </w:rPr>
+                  <m:t>delta</m:t>
+                </m:r>
+              </m:den>
+            </m:f>
+          </m:e>
+        </m:d>
+        <m:r>
+          <w:rPr>
+            <w:rFonts w:ascii="Cambria Math" w:eastAsia="Arial Unicode MS" w:hAnsi="Cambria Math" w:cs="Times New Roman"/>
+            <w:color w:val="000000"/>
+            <w:szCs w:val="28"/>
+            <w:u w:color="000000"/>
+            <w:bdr w:val="nil"/>
+            <w:lang w:val="en-US" w:eastAsia="ru-RU"/>
+          </w:rPr>
+          <m:t xml:space="preserve">, </m:t>
+        </m:r>
+        <m:r>
+          <m:rPr>
+            <m:sty m:val="p"/>
+          </m:rPr>
+          <w:rPr>
+            <w:rFonts w:ascii="Cambria Math" w:eastAsia="Arial Unicode MS" w:hAnsi="Cambria Math" w:cs="Times New Roman"/>
+            <w:color w:val="000000"/>
+            <w:szCs w:val="28"/>
+            <w:u w:color="000000"/>
+            <w:bdr w:val="nil"/>
+            <w:lang w:val="en-US" w:eastAsia="ru-RU"/>
+          </w:rPr>
+          <m:t>max</m:t>
+        </m:r>
+        <m:r>
+          <w:rPr>
+            <w:rFonts w:ascii="Cambria Math" w:eastAsia="Arial Unicode MS" w:hAnsi="Cambria Math" w:cs="Times New Roman"/>
+            <w:color w:val="000000"/>
+            <w:szCs w:val="28"/>
+            <w:u w:color="000000"/>
+            <w:bdr w:val="nil"/>
+            <w:lang w:val="en-US" w:eastAsia="ru-RU"/>
+          </w:rPr>
+          <m:t>_buckets</m:t>
+        </m:r>
+      </m:oMath>
+      <w:r>
+        <w:rPr>
+          <w:rFonts w:eastAsia="Arial Unicode MS" w:cs="Times New Roman"/>
+          <w:bCs/>
+          <w:i/>
+          <w:color w:val="000000"/>
+          <w:szCs w:val="28"/>
+          <w:u w:color="000000"/>
+          <w:bdr w:val="nil"/>
+          <w:lang w:val="en-US" w:eastAsia="ru-RU"/>
+        </w:rPr>
+        <w:t>)</w:t>
+      </w:r>
+    </w:p>
+    <w:p>
+      <w:pPr>
+        <w:pStyle w:val="ad"/>
+        <w:numPr>
+          <w:ilvl w:val="3"/>
+          <w:numId w:val="10"/>
+        </w:numPr>
+        <w:rPr>
+          <w:rFonts w:eastAsia="Arial Unicode MS" w:cs="Times New Roman"/>
+          <w:bCs/>
+          <w:color w:val="000000"/>
+          <w:szCs w:val="28"/>
+          <w:u w:color="000000"/>
+          <w:bdr w:val="nil"/>
+          <w:lang w:val="en-US" w:eastAsia="ru-RU"/>
+        </w:rPr>
+      </w:pPr>
+      <w:r>
+        <w:rPr>
+          <w:rFonts w:eastAsia="Arial Unicode MS" w:cs="Times New Roman"/>
+          <w:bCs/>
+          <w:color w:val="000000"/>
+          <w:szCs w:val="28"/>
+          <w:u w:color="000000"/>
+          <w:bdr w:val="nil"/>
+          <w:lang w:val="en-US" w:eastAsia="ru-RU"/>
+        </w:rPr>
+        <w:t>If NOT in_bucket[bucket_index, neighbour_index] then:</w:t>
+      </w:r>
+    </w:p>
+    <w:p>
+      <w:pPr>
+        <w:pStyle w:val="ad"/>
+        <w:numPr>
+          <w:ilvl w:val="4"/>
+          <w:numId w:val="10"/>
+        </w:numPr>
+        <w:rPr>
+          <w:rFonts w:eastAsia="Arial Unicode MS" w:cs="Times New Roman"/>
+          <w:bCs/>
+          <w:color w:val="000000"/>
+          <w:szCs w:val="28"/>
+          <w:u w:color="000000"/>
+          <w:bdr w:val="nil"/>
+          <w:lang w:val="en-US" w:eastAsia="ru-RU"/>
+        </w:rPr>
+      </w:pPr>
+      <w:r>
+        <w:rPr>
+          <w:rFonts w:eastAsia="Arial Unicode MS" w:cs="Times New Roman"/>
+          <w:bCs/>
+          <w:color w:val="000000"/>
+          <w:szCs w:val="28"/>
+          <w:u w:color="000000"/>
+          <w:bdr w:val="nil"/>
+          <w:lang w:val="en-US" w:eastAsia="ru-RU"/>
+        </w:rPr>
+        <w:t xml:space="preserve">in_bucket[bucket_index, neighbour_index] </w:t>
       </w:r>
       <m:oMath>
         <m:r>
@@ -6817,14 +7328,43 @@
       <w:r>
         <w:rPr>
           <w:rFonts w:eastAsia="Arial Unicode MS" w:cs="Times New Roman"/>
-          <w:bCs/>
-          <w:color w:val="000000"/>
-          <w:szCs w:val="28"/>
-          <w:u w:color="000000"/>
-          <w:bdr w:val="nil"/>
-          <w:lang w:val="en-US" w:eastAsia="ru-RU"/>
-        </w:rPr>
-        <w:t xml:space="preserve"> -1</w:t>
+          <w:color w:val="000000"/>
+          <w:szCs w:val="28"/>
+          <w:u w:color="000000"/>
+          <w:bdr w:val="nil"/>
+          <w:lang w:val="en-US" w:eastAsia="ru-RU"/>
+        </w:rPr>
+        <w:t xml:space="preserve"> true</w:t>
+      </w:r>
+    </w:p>
+    <w:p>
+      <w:pPr>
+        <w:pStyle w:val="ad"/>
+        <w:numPr>
+          <w:ilvl w:val="4"/>
+          <w:numId w:val="10"/>
+        </w:numPr>
+        <w:rPr>
+          <w:rFonts w:eastAsia="Arial Unicode MS" w:cs="Times New Roman"/>
+          <w:bCs/>
+          <w:color w:val="000000"/>
+          <w:szCs w:val="28"/>
+          <w:u w:color="000000"/>
+          <w:bdr w:val="nil"/>
+          <w:lang w:val="en-US" w:eastAsia="ru-RU"/>
+        </w:rPr>
+      </w:pPr>
+      <w:r>
+        <w:rPr>
+          <w:rFonts w:eastAsia="Arial Unicode MS" w:cs="Times New Roman"/>
+          <w:bCs/>
+          <w:color w:val="000000"/>
+          <w:szCs w:val="28"/>
+          <w:u w:color="000000"/>
+          <w:bdr w:val="nil"/>
+          <w:lang w:val="en-US" w:eastAsia="ru-RU"/>
+        </w:rPr>
+        <w:t>Add to bucket(delta, neighbour_index, distances, buckets, bucket_sizes, max_buckets)</w:t>
       </w:r>
     </w:p>
     <w:p>
@@ -6854,37 +7394,7 @@
           <w:bdr w:val="nil"/>
           <w:lang w:val="en-US" w:eastAsia="ru-RU"/>
         </w:rPr>
-        <w:t xml:space="preserve"> For i in 0…max_buckets (exclusive) do:</w:t>
-      </w:r>
-    </w:p>
-    <w:p>
-      <w:pPr>
-        <w:pStyle w:val="ad"/>
-        <w:numPr>
-          <w:ilvl w:val="2"/>
-          <w:numId w:val="10"/>
-        </w:numPr>
-        <w:rPr>
-          <w:rFonts w:eastAsia="Arial Unicode MS" w:cs="Times New Roman"/>
-          <w:bCs/>
-          <w:color w:val="000000"/>
-          <w:szCs w:val="28"/>
-          <w:u w:color="000000"/>
-          <w:bdr w:val="nil"/>
-          <w:lang w:val="en-US" w:eastAsia="ru-RU"/>
-        </w:rPr>
-      </w:pPr>
-      <w:r>
-        <w:rPr>
-          <w:rFonts w:eastAsia="Arial Unicode MS" w:cs="Times New Roman"/>
-          <w:bCs/>
-          <w:color w:val="000000"/>
-          <w:szCs w:val="28"/>
-          <w:u w:color="000000"/>
-          <w:bdr w:val="nil"/>
-          <w:lang w:val="en-US" w:eastAsia="ru-RU"/>
-        </w:rPr>
-        <w:t xml:space="preserve">absolute_index </w:t>
+        <w:t xml:space="preserve"> current_absolute_index </w:t>
       </w:r>
       <m:oMath>
         <m:r>
@@ -6909,14 +7419,14 @@
           <w:bdr w:val="nil"/>
           <w:lang w:val="en-US" w:eastAsia="ru-RU"/>
         </w:rPr>
-        <w:t xml:space="preserve"> current_absolute_index + i</w:t>
+        <w:t xml:space="preserve"> next_non_empty_bucket_absolute_index</w:t>
       </w:r>
     </w:p>
     <w:p>
       <w:pPr>
         <w:pStyle w:val="ad"/>
         <w:numPr>
-          <w:ilvl w:val="2"/>
+          <w:ilvl w:val="1"/>
           <w:numId w:val="10"/>
         </w:numPr>
         <w:rPr>
@@ -6939,7 +7449,7 @@
           <w:bdr w:val="nil"/>
           <w:lang w:val="en-US" w:eastAsia="ru-RU"/>
         </w:rPr>
-        <w:t xml:space="preserve">actual_index </w:t>
+        <w:t xml:space="preserve"> next_non_empty_bucket_absolute_index </w:t>
       </w:r>
       <m:oMath>
         <m:r>
@@ -6964,6 +7474,146 @@
           <w:bdr w:val="nil"/>
           <w:lang w:val="en-US" w:eastAsia="ru-RU"/>
         </w:rPr>
+        <w:t xml:space="preserve"> -1</w:t>
+      </w:r>
+    </w:p>
+    <w:p>
+      <w:pPr>
+        <w:pStyle w:val="ad"/>
+        <w:numPr>
+          <w:ilvl w:val="1"/>
+          <w:numId w:val="10"/>
+        </w:numPr>
+        <w:rPr>
+          <w:rFonts w:eastAsia="Arial Unicode MS" w:cs="Times New Roman"/>
+          <w:bCs/>
+          <w:color w:val="000000"/>
+          <w:szCs w:val="28"/>
+          <w:u w:color="000000"/>
+          <w:bdr w:val="nil"/>
+          <w:lang w:val="en-US" w:eastAsia="ru-RU"/>
+        </w:rPr>
+      </w:pPr>
+      <w:r>
+        <w:rPr>
+          <w:rFonts w:eastAsia="Arial Unicode MS" w:cs="Times New Roman"/>
+          <w:bCs/>
+          <w:color w:val="000000"/>
+          <w:szCs w:val="28"/>
+          <w:u w:color="000000"/>
+          <w:bdr w:val="nil"/>
+          <w:lang w:val="en-US" w:eastAsia="ru-RU"/>
+        </w:rPr>
+        <w:t xml:space="preserve"> For i in 0…max_buckets (exclusive) do:</w:t>
+      </w:r>
+    </w:p>
+    <w:p>
+      <w:pPr>
+        <w:pStyle w:val="ad"/>
+        <w:numPr>
+          <w:ilvl w:val="2"/>
+          <w:numId w:val="10"/>
+        </w:numPr>
+        <w:rPr>
+          <w:rFonts w:eastAsia="Arial Unicode MS" w:cs="Times New Roman"/>
+          <w:bCs/>
+          <w:color w:val="000000"/>
+          <w:szCs w:val="28"/>
+          <w:u w:color="000000"/>
+          <w:bdr w:val="nil"/>
+          <w:lang w:val="en-US" w:eastAsia="ru-RU"/>
+        </w:rPr>
+      </w:pPr>
+      <w:r>
+        <w:rPr>
+          <w:rFonts w:eastAsia="Arial Unicode MS" w:cs="Times New Roman"/>
+          <w:bCs/>
+          <w:color w:val="000000"/>
+          <w:szCs w:val="28"/>
+          <w:u w:color="000000"/>
+          <w:bdr w:val="nil"/>
+          <w:lang w:val="en-US" w:eastAsia="ru-RU"/>
+        </w:rPr>
+        <w:t xml:space="preserve">absolute_index </w:t>
+      </w:r>
+      <m:oMath>
+        <m:r>
+          <w:rPr>
+            <w:rFonts w:ascii="Cambria Math" w:eastAsia="Arial Unicode MS" w:hAnsi="Cambria Math" w:cs="Times New Roman"/>
+            <w:color w:val="000000"/>
+            <w:szCs w:val="28"/>
+            <w:u w:color="000000"/>
+            <w:bdr w:val="nil"/>
+            <w:lang w:val="en-US" w:eastAsia="ru-RU"/>
+          </w:rPr>
+          <m:t>←</m:t>
+        </m:r>
+      </m:oMath>
+      <w:r>
+        <w:rPr>
+          <w:rFonts w:eastAsia="Arial Unicode MS" w:cs="Times New Roman"/>
+          <w:bCs/>
+          <w:color w:val="000000"/>
+          <w:szCs w:val="28"/>
+          <w:u w:color="000000"/>
+          <w:bdr w:val="nil"/>
+          <w:lang w:val="en-US" w:eastAsia="ru-RU"/>
+        </w:rPr>
+        <w:t xml:space="preserve"> current_absolute_index + i</w:t>
+      </w:r>
+    </w:p>
+    <w:p>
+      <w:pPr>
+        <w:pStyle w:val="ad"/>
+        <w:numPr>
+          <w:ilvl w:val="2"/>
+          <w:numId w:val="10"/>
+        </w:numPr>
+        <w:rPr>
+          <w:rFonts w:eastAsia="Arial Unicode MS" w:cs="Times New Roman"/>
+          <w:bCs/>
+          <w:color w:val="000000"/>
+          <w:szCs w:val="28"/>
+          <w:u w:color="000000"/>
+          <w:bdr w:val="nil"/>
+          <w:lang w:val="en-US" w:eastAsia="ru-RU"/>
+        </w:rPr>
+      </w:pPr>
+      <w:r>
+        <w:rPr>
+          <w:rFonts w:eastAsia="Arial Unicode MS" w:cs="Times New Roman"/>
+          <w:bCs/>
+          <w:color w:val="000000"/>
+          <w:szCs w:val="28"/>
+          <w:u w:color="000000"/>
+          <w:bdr w:val="nil"/>
+          <w:lang w:val="en-US" w:eastAsia="ru-RU"/>
+        </w:rPr>
+        <w:t xml:space="preserve">actual_index </w:t>
+      </w:r>
+      <m:oMath>
+        <m:r>
+          <w:rPr>
+            <w:rFonts w:ascii="Cambria Math" w:eastAsia="Arial Unicode MS" w:hAnsi="Cambria Math" w:cs="Times New Roman"/>
+            <w:color w:val="000000"/>
+            <w:szCs w:val="28"/>
+            <w:u w:color="000000"/>
+            <w:bdr w:val="nil"/>
+            <w:lang w:val="en-US" w:eastAsia="ru-RU"/>
+          </w:rPr>
+          <m:t>←</m:t>
+        </m:r>
+      </m:oMath>
+      <w:r>
+        <w:rPr>
+          <w:rFonts w:eastAsia="Arial Unicode MS" w:cs="Times New Roman"/>
+          <w:bCs/>
+          <w:color w:val="000000"/>
+          <w:szCs w:val="28"/>
+          <w:u w:color="000000"/>
+          <w:bdr w:val="nil"/>
+          <w:lang w:val="en-US" w:eastAsia="ru-RU"/>
+        </w:rPr>
         <w:t xml:space="preserve"> </w:t>
       </w:r>
       <m:oMath>
@@ -7585,7 +8235,6 @@
           <w:bdr w:val="nil"/>
           <w:lang w:val="en-US" w:eastAsia="ru-RU"/>
         </w:rPr>
-        <w:lastRenderedPageBreak/>
         <w:t xml:space="preserve"> distances[neighbour_index] </w:t>
       </w:r>
       <m:oMath>
@@ -8385,14 +9034,14 @@
           <w:lang w:val="uk-UA"/>
         </w:rPr>
       </w:pPr>
-      <w:bookmarkStart w:id="3" w:name="_Toc158713965"/>
+      <w:bookmarkStart w:id="4" w:name="_Toc158713965"/>
       <w:r>
         <w:rPr>
           <w:lang w:val="uk-UA"/>
         </w:rPr>
         <w:t xml:space="preserve">1.2 </w:t>
       </w:r>
-      <w:bookmarkEnd w:id="3"/>
+      <w:bookmarkEnd w:id="4"/>
       <w:r>
         <w:rPr>
           <w:lang w:val="uk-UA"/>
@@ -8419,8 +9068,6 @@
         </w:rPr>
         <w:t>у</w:t>
       </w:r>
-      <w:bookmarkStart w:id="4" w:name="_GoBack"/>
-      <w:bookmarkEnd w:id="4"/>
     </w:p>
     <w:p>
       <w:pPr>
@@ -8543,20 +9190,7 @@
           <w:bdr w:val="nil"/>
           <w:lang w:val="uk-UA" w:eastAsia="ru-RU"/>
         </w:rPr>
-        <w:t xml:space="preserve">. Це підтвердило життєздатність концепції розподілу вершин за </w:t>
-      </w:r>
-      <w:r>
-        <w:rPr>
-          <w:rFonts w:eastAsia="Arial Unicode MS" w:cs="Times New Roman"/>
-          <w:bCs/>
-          <w:color w:val="000000"/>
-          <w:szCs w:val="28"/>
-          <w:u w:color="000000"/>
-          <w:bdr w:val="nil"/>
-          <w:lang w:val="uk-UA" w:eastAsia="ru-RU"/>
-        </w:rPr>
-        <w:lastRenderedPageBreak/>
-        <w:t>«кошиками» та можливість безпечної паралельної релаксації «легких» ребер у меж</w:t>
+        <w:t>. Це підтвердило життєздатність концепції розподілу вершин за «кошиками» та можливість безпечної паралельної релаксації «легких» ребер у меж</w:t>
       </w:r>
       <w:r>
         <w:rPr>
@@ -8681,19 +9315,7 @@
           <w:bdr w:val="nil"/>
           <w:lang w:val="uk-UA" w:eastAsia="ru-RU"/>
         </w:rPr>
-        <w:t xml:space="preserve">під час виконання, що разом із механізмами динамічного балансування навантаження та злиття кошиків дозволило досягти прискорення до 65 разів порівняно з найкращими послідовними аналогами </w:t>
-      </w:r>
-      <w:r>
-        <w:rPr>
-          <w:rFonts w:eastAsia="Arial Unicode MS" w:cs="Times New Roman"/>
-          <w:bCs/>
-          <w:color w:val="000000"/>
-          <w:szCs w:val="28"/>
-          <w:u w:color="000000"/>
-          <w:bdr w:val="nil"/>
-          <w:lang w:val="uk-UA" w:eastAsia="ru-RU"/>
-        </w:rPr>
-        <w:t xml:space="preserve">на </w:t>
+        <w:t xml:space="preserve">під час виконання, що разом із механізмами динамічного балансування навантаження та злиття кошиків дозволило досягти прискорення до 65 разів порівняно з найкращими послідовними аналогами на </w:t>
       </w:r>
       <w:r>
         <w:rPr>
@@ -8955,7 +9577,20 @@
           <w:bdr w:val="nil"/>
           <w:lang w:val="uk-UA" w:eastAsia="ru-RU"/>
         </w:rPr>
-        <w:t>яттю на базі стандарту MPI. У таких реалізаціях використовується слабке масштабування, а вершини графу розподіляються між обчислювальними вузлами, які локально обробляють свої «кошики» та обмінюються повідо</w:t>
+        <w:t xml:space="preserve">яттю на базі стандарту MPI. У таких реалізаціях використовується слабке масштабування, а вершини графу розподіляються між обчислювальними вузлами, які локально </w:t>
+      </w:r>
+      <w:r>
+        <w:rPr>
+          <w:rFonts w:eastAsia="Arial Unicode MS" w:cs="Times New Roman"/>
+          <w:bCs/>
+          <w:color w:val="000000"/>
+          <w:szCs w:val="28"/>
+          <w:u w:color="000000"/>
+          <w:bdr w:val="nil"/>
+          <w:lang w:val="uk-UA" w:eastAsia="ru-RU"/>
+        </w:rPr>
+        <w:lastRenderedPageBreak/>
+        <w:t>обробляють свої «кошики» та обмінюються повідо</w:t>
       </w:r>
       <w:r>
         <w:rPr>
@@ -9193,20 +9828,7 @@
           <w:bdr w:val="nil"/>
           <w:lang w:val="uk-UA" w:eastAsia="ru-RU"/>
         </w:rPr>
-        <w:t xml:space="preserve">проте більшість популярних бібліотек обробки графів пропонують переважно послідовні реалізації алгоритмів. Розробка паралельного </w:t>
-      </w:r>
-      <w:r>
-        <w:rPr>
-          <w:rFonts w:eastAsia="Arial Unicode MS" w:cs="Times New Roman"/>
-          <w:bCs/>
-          <w:color w:val="000000"/>
-          <w:szCs w:val="28"/>
-          <w:u w:color="000000"/>
-          <w:bdr w:val="nil"/>
-          <w:lang w:val="uk-UA" w:eastAsia="ru-RU"/>
-        </w:rPr>
-        <w:lastRenderedPageBreak/>
-        <w:t xml:space="preserve">алгоритму </w:t>
+        <w:t xml:space="preserve">проте більшість популярних бібліотек обробки графів пропонують переважно послідовні реалізації алгоритмів. Розробка паралельного алгоритму </w:t>
       </w:r>
       <m:oMath>
         <m:r>
@@ -13534,7 +14156,7 @@
 </file>
 
 <file path=customXml/itemProps1.xml><?xml version="1.0" encoding="utf-8"?>
-<ds:datastoreItem xmlns:ds="http://schemas.openxmlformats.org/officeDocument/2006/customXml" ds:itemID="{AD09532D-D7A0-44B3-8E74-18D551E7967B}">
+<ds:datastoreItem xmlns:ds="http://schemas.openxmlformats.org/officeDocument/2006/customXml" ds:itemID="{AF9A4A00-86BC-4FDD-81CE-D982BE1D7E81}">
   <ds:schemaRefs>
     <ds:schemaRef ds:uri="http://schemas.openxmlformats.org/officeDocument/2006/bibliography"/>
   </ds:schemaRefs>

</xml_diff>

<commit_message>
docs: little addition to chapter 2.3
</commit_message>
<xml_diff>
--- a/docs/ПЗ.docx
+++ b/docs/ПЗ.docx
@@ -12737,8 +12737,6 @@
         </w:rPr>
         <w:t>Код тестування та його результати наведено у додатку Д.</w:t>
       </w:r>
-      <w:bookmarkStart w:id="5" w:name="_GoBack"/>
-      <w:bookmarkEnd w:id="5"/>
     </w:p>
     <w:p>
       <w:pPr>
@@ -15538,6 +15536,164 @@
           <w:lang w:val="uk-UA" w:eastAsia="ru-RU"/>
         </w:rPr>
       </w:pPr>
+      <w:r>
+        <w:rPr>
+          <w:rFonts w:eastAsia="Arial Unicode MS" w:cs="Times New Roman"/>
+          <w:bCs/>
+          <w:color w:val="000000"/>
+          <w:szCs w:val="28"/>
+          <w:u w:color="000000"/>
+          <w:bdr w:val="nil"/>
+          <w:lang w:val="uk-UA" w:eastAsia="ru-RU"/>
+        </w:rPr>
+        <w:t xml:space="preserve">Окремо слід зазначити, що, незважаючи на те, що результати були усереднені за показником </w:t>
+      </w:r>
+      <m:oMath>
+        <m:r>
+          <w:rPr>
+            <w:rFonts w:ascii="Cambria Math" w:eastAsia="Arial Unicode MS" w:hAnsi="Cambria Math" w:cs="Times New Roman"/>
+            <w:color w:val="000000"/>
+            <w:szCs w:val="28"/>
+            <w:u w:color="000000"/>
+            <w:bdr w:val="nil"/>
+            <w:lang w:val="uk-UA" w:eastAsia="ru-RU"/>
+          </w:rPr>
+          <m:t>∆</m:t>
+        </m:r>
+      </m:oMath>
+      <w:r>
+        <w:rPr>
+          <w:rFonts w:eastAsia="Arial Unicode MS" w:cs="Times New Roman"/>
+          <w:color w:val="000000"/>
+          <w:szCs w:val="28"/>
+          <w:u w:color="000000"/>
+          <w:bdr w:val="nil"/>
+          <w:lang w:val="uk-UA" w:eastAsia="ru-RU"/>
+        </w:rPr>
+        <w:t xml:space="preserve"> </w:t>
+      </w:r>
+      <w:r>
+        <w:rPr>
+          <w:rFonts w:eastAsia="Arial Unicode MS" w:cs="Times New Roman"/>
+          <w:bCs/>
+          <w:color w:val="000000"/>
+          <w:szCs w:val="28"/>
+          <w:u w:color="000000"/>
+          <w:bdr w:val="nil"/>
+          <w:lang w:val="uk-UA" w:eastAsia="ru-RU"/>
+        </w:rPr>
+        <w:t xml:space="preserve">для спрощення порівнняння з теоретичною складністю, цей показних ширини «кошика» </w:t>
+      </w:r>
+      <w:r>
+        <w:rPr>
+          <w:rFonts w:eastAsia="Arial Unicode MS" w:cs="Times New Roman"/>
+          <w:bCs/>
+          <w:color w:val="000000"/>
+          <w:szCs w:val="28"/>
+          <w:u w:color="000000"/>
+          <w:bdr w:val="nil"/>
+          <w:lang w:val="uk-UA" w:eastAsia="ru-RU"/>
+        </w:rPr>
+        <w:t>сильно впливає</w:t>
+      </w:r>
+      <w:r>
+        <w:rPr>
+          <w:rFonts w:eastAsia="Arial Unicode MS" w:cs="Times New Roman"/>
+          <w:bCs/>
+          <w:color w:val="000000"/>
+          <w:szCs w:val="28"/>
+          <w:u w:color="000000"/>
+          <w:bdr w:val="nil"/>
+          <w:lang w:val="uk-UA" w:eastAsia="ru-RU"/>
+        </w:rPr>
+        <w:t xml:space="preserve"> </w:t>
+      </w:r>
+      <w:r>
+        <w:rPr>
+          <w:rFonts w:eastAsia="Arial Unicode MS" w:cs="Times New Roman"/>
+          <w:bCs/>
+          <w:color w:val="000000"/>
+          <w:szCs w:val="28"/>
+          <w:u w:color="000000"/>
+          <w:bdr w:val="nil"/>
+          <w:lang w:val="uk-UA" w:eastAsia="ru-RU"/>
+        </w:rPr>
+        <w:t>на швидкість виконання алгоритму</w:t>
+      </w:r>
+      <w:r>
+        <w:rPr>
+          <w:rFonts w:eastAsia="Arial Unicode MS" w:cs="Times New Roman"/>
+          <w:bCs/>
+          <w:color w:val="000000"/>
+          <w:szCs w:val="28"/>
+          <w:u w:color="000000"/>
+          <w:bdr w:val="nil"/>
+          <w:lang w:val="uk-UA" w:eastAsia="ru-RU"/>
+        </w:rPr>
+        <w:t>. Більш д</w:t>
+      </w:r>
+      <w:r>
+        <w:rPr>
+          <w:rFonts w:eastAsia="Arial Unicode MS" w:cs="Times New Roman"/>
+          <w:bCs/>
+          <w:color w:val="000000"/>
+          <w:szCs w:val="28"/>
+          <w:u w:color="000000"/>
+          <w:bdr w:val="nil"/>
+          <w:lang w:val="uk-UA" w:eastAsia="ru-RU"/>
+        </w:rPr>
+        <w:t>етальне досл</w:t>
+      </w:r>
+      <w:bookmarkStart w:id="5" w:name="_GoBack"/>
+      <w:bookmarkEnd w:id="5"/>
+      <w:r>
+        <w:rPr>
+          <w:rFonts w:eastAsia="Arial Unicode MS" w:cs="Times New Roman"/>
+          <w:bCs/>
+          <w:color w:val="000000"/>
+          <w:szCs w:val="28"/>
+          <w:u w:color="000000"/>
+          <w:bdr w:val="nil"/>
+          <w:lang w:val="uk-UA" w:eastAsia="ru-RU"/>
+        </w:rPr>
+        <w:t xml:space="preserve">ідження впливу параметра </w:t>
+      </w:r>
+      <m:oMath>
+        <m:r>
+          <w:rPr>
+            <w:rFonts w:ascii="Cambria Math" w:eastAsia="Arial Unicode MS" w:hAnsi="Cambria Math" w:cs="Times New Roman"/>
+            <w:color w:val="000000"/>
+            <w:szCs w:val="28"/>
+            <w:u w:color="000000"/>
+            <w:bdr w:val="nil"/>
+            <w:lang w:val="uk-UA" w:eastAsia="ru-RU"/>
+          </w:rPr>
+          <m:t>∆</m:t>
+        </m:r>
+      </m:oMath>
+      <w:r>
+        <w:rPr>
+          <w:rFonts w:eastAsia="Arial Unicode MS" w:cs="Times New Roman"/>
+          <w:color w:val="000000"/>
+          <w:szCs w:val="28"/>
+          <w:u w:color="000000"/>
+          <w:bdr w:val="nil"/>
+          <w:lang w:val="uk-UA" w:eastAsia="ru-RU"/>
+        </w:rPr>
+        <w:t xml:space="preserve"> </w:t>
+      </w:r>
+      <w:r>
+        <w:rPr>
+          <w:rFonts w:eastAsia="Arial Unicode MS" w:cs="Times New Roman"/>
+          <w:bCs/>
+          <w:color w:val="000000"/>
+          <w:szCs w:val="28"/>
+          <w:u w:color="000000"/>
+          <w:bdr w:val="nil"/>
+          <w:lang w:val="uk-UA" w:eastAsia="ru-RU"/>
+        </w:rPr>
+        <w:t>на загальну обчислювальну складність, ефективність та масштабованість алгоритму буде наведено у відповідному розділі при аналізі паралельної реалізації.</w:t>
+      </w:r>
       <w:r>
         <w:rPr>
           <w:rFonts w:eastAsia="Arial Unicode MS" w:cs="Times New Roman"/>
@@ -17702,7 +17858,7 @@
             <w:noProof/>
             <w:szCs w:val="28"/>
           </w:rPr>
-          <w:t>36</w:t>
+          <w:t>29</w:t>
         </w:r>
         <w:r>
           <w:rPr>
@@ -20261,7 +20417,7 @@
 </file>
 
 <file path=customXml/itemProps1.xml><?xml version="1.0" encoding="utf-8"?>
-<ds:datastoreItem xmlns:ds="http://schemas.openxmlformats.org/officeDocument/2006/customXml" ds:itemID="{C1452302-5D47-4633-A62E-E7DFB4DCDB58}">
+<ds:datastoreItem xmlns:ds="http://schemas.openxmlformats.org/officeDocument/2006/customXml" ds:itemID="{3A2DB5DE-8170-430D-B09F-11D37E43BF97}">
   <ds:schemaRefs>
     <ds:schemaRef ds:uri="http://schemas.openxmlformats.org/officeDocument/2006/bibliography"/>
   </ds:schemaRefs>

</xml_diff>

<commit_message>
docs: add sources and mentions
</commit_message>
<xml_diff>
--- a/docs/ПЗ.docx
+++ b/docs/ПЗ.docx
@@ -295,17 +295,47 @@
           <w:szCs w:val="32"/>
           <w:lang w:val="uk-UA"/>
         </w:rPr>
-        <w:t xml:space="preserve">Тема: </w:t>
+        <w:t>Тема</w:t>
       </w:r>
       <w:r>
         <w:rPr>
           <w:rFonts w:cs="Times New Roman"/>
           <w:sz w:val="32"/>
           <w:szCs w:val="32"/>
-          <w:highlight w:val="green"/>
           <w:lang w:val="uk-UA"/>
         </w:rPr>
-        <w:t>Назва теми</w:t>
+        <w:t xml:space="preserve">: </w:t>
+      </w:r>
+      <m:oMath>
+        <m:r>
+          <w:rPr>
+            <w:rFonts w:ascii="Cambria Math" w:hAnsi="Cambria Math" w:cs="Times New Roman"/>
+            <w:sz w:val="32"/>
+            <w:szCs w:val="32"/>
+            <w:lang w:val="uk-UA"/>
+          </w:rPr>
+          <m:t>∆</m:t>
+        </m:r>
+      </m:oMath>
+      <w:r>
+        <w:rPr>
+          <w:rFonts w:cs="Times New Roman"/>
+          <w:bCs/>
+          <w:sz w:val="32"/>
+          <w:szCs w:val="32"/>
+          <w:lang w:val="uk-UA"/>
+        </w:rPr>
+        <w:t xml:space="preserve">-степінг алгоритм пошуку найкоротших шляхів мовою </w:t>
+      </w:r>
+      <w:r>
+        <w:rPr>
+          <w:rFonts w:cs="Times New Roman"/>
+          <w:bCs/>
+          <w:sz w:val="32"/>
+          <w:szCs w:val="32"/>
+          <w:lang w:val="en-US"/>
+        </w:rPr>
+        <w:t>Python</w:t>
       </w:r>
     </w:p>
     <w:p>
@@ -400,10 +430,9 @@
               <w:rPr>
                 <w:rFonts w:cs="Times New Roman"/>
                 <w:color w:val="auto"/>
-                <w:highlight w:val="green"/>
                 <w:lang w:val="uk-UA"/>
               </w:rPr>
-              <w:t>Посада та ПІБ керівника</w:t>
+              <w:t>старший викладач кафедри ІПІ</w:t>
             </w:r>
           </w:p>
           <w:p>
@@ -414,6 +443,23 @@
               <w:rPr>
                 <w:rFonts w:cs="Times New Roman"/>
                 <w:lang w:val="uk-UA"/>
+              </w:rPr>
+            </w:pPr>
+            <w:r>
+              <w:rPr>
+                <w:rFonts w:cs="Times New Roman"/>
+                <w:lang w:val="uk-UA"/>
+              </w:rPr>
+              <w:t>Дифучин Антон Юрійович</w:t>
+            </w:r>
+          </w:p>
+          <w:p>
+            <w:pPr>
+              <w:pStyle w:val="A7"/>
+              <w:spacing w:line="240" w:lineRule="auto"/>
+              <w:ind w:firstLine="0"/>
+              <w:rPr>
+                <w:rFonts w:cs="Times New Roman"/>
               </w:rPr>
             </w:pPr>
           </w:p>
@@ -491,9 +537,8 @@
             <w:r>
               <w:rPr>
                 <w:rFonts w:cs="Times New Roman"/>
-                <w:lang w:val="uk-UA"/>
-              </w:rPr>
-              <w:t>4</w:t>
+              </w:rPr>
+              <w:t>6</w:t>
             </w:r>
             <w:r>
               <w:rPr>
@@ -710,30 +755,8 @@
                 <w:rFonts w:cs="Times New Roman"/>
                 <w:iCs/>
                 <w:color w:val="auto"/>
-                <w:highlight w:val="green"/>
-                <w:lang w:val="uk-UA"/>
-              </w:rPr>
-              <w:t>ПІ</w:t>
-            </w:r>
-            <w:r>
-              <w:rPr>
-                <w:rFonts w:cs="Times New Roman"/>
-                <w:iCs/>
-                <w:color w:val="auto"/>
-                <w:highlight w:val="green"/>
-                <w:lang w:val="uk-UA"/>
-              </w:rPr>
-              <w:t>Б</w:t>
-            </w:r>
-            <w:r>
-              <w:rPr>
-                <w:rFonts w:cs="Times New Roman"/>
-                <w:iCs/>
-                <w:color w:val="auto"/>
-                <w:highlight w:val="green"/>
-                <w:lang w:val="uk-UA"/>
-              </w:rPr>
-              <w:t xml:space="preserve"> студента</w:t>
+              </w:rPr>
+              <w:t>Віжуткін Іляя Дмитрович</w:t>
             </w:r>
           </w:p>
           <w:p>
@@ -756,10 +779,9 @@
             <w:r>
               <w:rPr>
                 <w:rFonts w:cs="Times New Roman"/>
-                <w:highlight w:val="green"/>
                 <w:lang w:val="uk-UA"/>
               </w:rPr>
-              <w:t>____</w:t>
+              <w:t>ІП-31</w:t>
             </w:r>
           </w:p>
           <w:p>
@@ -791,15 +813,7 @@
                 <w:rFonts w:cs="Times New Roman"/>
                 <w:lang w:val="uk-UA"/>
               </w:rPr>
-              <w:t xml:space="preserve">№ </w:t>
-            </w:r>
-            <w:r>
-              <w:rPr>
-                <w:rFonts w:cs="Times New Roman"/>
-                <w:highlight w:val="green"/>
-                <w:lang w:val="uk-UA"/>
-              </w:rPr>
-              <w:t>_____</w:t>
+              <w:t>№4</w:t>
             </w:r>
           </w:p>
           <w:p>
@@ -1018,7 +1032,6 @@
               <w:pStyle w:val="A7"/>
               <w:spacing w:line="240" w:lineRule="auto"/>
               <w:ind w:firstLine="0"/>
-              <w:jc w:val="left"/>
               <w:rPr>
                 <w:rFonts w:cs="Times New Roman"/>
                 <w:lang w:val="uk-UA"/>
@@ -1027,11 +1040,9 @@
             <w:r>
               <w:rPr>
                 <w:rFonts w:cs="Times New Roman"/>
-                <w:color w:val="auto"/>
-                <w:highlight w:val="green"/>
                 <w:lang w:val="uk-UA"/>
               </w:rPr>
-              <w:t>Ім’я ПРІЗВИЩЕ керівника</w:t>
+              <w:t>Антон ДИФУЧИН</w:t>
             </w:r>
           </w:p>
         </w:tc>
@@ -1104,7 +1115,7 @@
           <w:bCs/>
           <w:lang w:val="uk-UA"/>
         </w:rPr>
-        <w:t>4</w:t>
+        <w:t>6</w:t>
       </w:r>
       <w:r>
         <w:rPr>
@@ -1350,8 +1361,6 @@
           <w:bCs/>
         </w:rPr>
       </w:pPr>
-      <w:bookmarkStart w:id="0" w:name="_GoBack"/>
-      <w:bookmarkEnd w:id="0"/>
       <w:r>
         <w:rPr>
           <w:rFonts w:cs="Times New Roman"/>
@@ -1587,14 +1596,12 @@
         <w:rPr>
           <w:rFonts w:cs="Times New Roman"/>
           <w:bCs/>
-          <w:lang w:val="ru-RU"/>
-        </w:rPr>
-      </w:pPr>
-      <w:r>
-        <w:rPr>
-          <w:rFonts w:cs="Times New Roman"/>
-          <w:bCs/>
-          <w:lang w:val="ru-RU"/>
+        </w:rPr>
+      </w:pPr>
+      <w:r>
+        <w:rPr>
+          <w:rFonts w:cs="Times New Roman"/>
+          <w:bCs/>
         </w:rPr>
         <w:t>Розроблений послі</w:t>
       </w:r>
@@ -1602,7 +1609,6 @@
         <w:rPr>
           <w:rFonts w:cs="Times New Roman"/>
           <w:bCs/>
-          <w:lang w:val="ru-RU"/>
         </w:rPr>
         <w:t xml:space="preserve">довний та паралельний алгоритм </w:t>
       </w:r>
@@ -1619,7 +1625,6 @@
         <w:rPr>
           <w:rFonts w:cs="Times New Roman"/>
           <w:bCs/>
-          <w:lang w:val="ru-RU"/>
         </w:rPr>
         <w:t>-степінгу адаптовано для</w:t>
       </w:r>
@@ -1643,7 +1648,6 @@
         <w:rPr>
           <w:rFonts w:cs="Times New Roman"/>
           <w:bCs/>
-          <w:lang w:val="ru-RU"/>
         </w:rPr>
         <w:t xml:space="preserve">. В розробці використано мову програмування Python, бібліотеку NumPy </w:t>
       </w:r>
@@ -1651,7 +1655,6 @@
         <w:rPr>
           <w:rFonts w:cs="Times New Roman"/>
           <w:bCs/>
-          <w:lang w:val="ru-RU"/>
         </w:rPr>
         <w:t>для ефективного збереження графа, необхідних додаткових масивів</w:t>
       </w:r>
@@ -1707,7 +1710,6 @@
         <w:rPr>
           <w:rFonts w:cs="Times New Roman"/>
           <w:bCs/>
-          <w:lang w:val="ru-RU"/>
         </w:rPr>
         <w:t>, а також вбудовані модулі multiprocessing та shared_memory для обходу обмежень GIL.</w:t>
       </w:r>
@@ -3031,12 +3033,12 @@
       <w:pPr>
         <w:pStyle w:val="1"/>
       </w:pPr>
-      <w:bookmarkStart w:id="1" w:name="_Toc158713962"/>
+      <w:bookmarkStart w:id="0" w:name="_Toc158713962"/>
       <w:r>
         <w:lastRenderedPageBreak/>
         <w:t>ВСТУП</w:t>
       </w:r>
-      <w:bookmarkEnd w:id="1"/>
+      <w:bookmarkEnd w:id="0"/>
     </w:p>
     <w:p>
       <w:pPr>
@@ -3103,7 +3105,29 @@
           <w:bdr w:val="nil"/>
           <w:lang w:val="uk-UA" w:eastAsia="ru-RU"/>
         </w:rPr>
-        <w:t>, а також раціонально використовувати апаратні ресурси сучасних серверів і робочих станцій.</w:t>
+        <w:t>, а також раціонально використовувати апаратні ресурси сучасних серверів і робочих станцій</w:t>
+      </w:r>
+      <w:r>
+        <w:rPr>
+          <w:rFonts w:eastAsia="Arial Unicode MS" w:cs="Times New Roman"/>
+          <w:bCs/>
+          <w:szCs w:val="28"/>
+          <w:u w:color="000000"/>
+          <w:bdr w:val="nil"/>
+          <w:lang w:eastAsia="ru-RU"/>
+        </w:rPr>
+        <w:t xml:space="preserve"> [1]</w:t>
+      </w:r>
+      <w:r>
+        <w:rPr>
+          <w:rFonts w:eastAsia="Arial Unicode MS" w:cs="Times New Roman"/>
+          <w:bCs/>
+          <w:szCs w:val="28"/>
+          <w:u w:color="000000"/>
+          <w:bdr w:val="nil"/>
+          <w:lang w:val="uk-UA" w:eastAsia="ru-RU"/>
+        </w:rPr>
+        <w:t>.</w:t>
       </w:r>
     </w:p>
     <w:p>
@@ -3149,7 +3173,29 @@
           <w:bdr w:val="nil"/>
           <w:lang w:val="uk-UA" w:eastAsia="ru-RU"/>
         </w:rPr>
-        <w:t>). Вона є критично важливою для систем маршрутизації, аналізу соціальних</w:t>
+        <w:t>)</w:t>
+      </w:r>
+      <w:r>
+        <w:rPr>
+          <w:rFonts w:eastAsia="Arial Unicode MS" w:cs="Times New Roman"/>
+          <w:bCs/>
+          <w:szCs w:val="28"/>
+          <w:u w:color="000000"/>
+          <w:bdr w:val="nil"/>
+          <w:lang w:val="uk-UA" w:eastAsia="ru-RU"/>
+        </w:rPr>
+        <w:t xml:space="preserve"> [2]</w:t>
+      </w:r>
+      <w:r>
+        <w:rPr>
+          <w:rFonts w:eastAsia="Arial Unicode MS" w:cs="Times New Roman"/>
+          <w:bCs/>
+          <w:szCs w:val="28"/>
+          <w:u w:color="000000"/>
+          <w:bdr w:val="nil"/>
+          <w:lang w:val="uk-UA" w:eastAsia="ru-RU"/>
+        </w:rPr>
+        <w:t>. Вона є критично важливою для систем маршрутизації, аналізу соціальних</w:t>
       </w:r>
       <w:r>
         <w:rPr>
@@ -3204,7 +3250,29 @@
           <w:bdr w:val="nil"/>
           <w:lang w:val="uk-UA" w:eastAsia="ru-RU"/>
         </w:rPr>
-        <w:t xml:space="preserve">язання цієї задачі мають суттєві обмеження: алгоритм Дейкстри погано піддається розпаралелюванню через строгу послідовність вибору вершин, а алгоритм Беллмана-Форда виконує занадто багато надлишкових обчислень. У цьому контексті алгоритм </w:t>
+        <w:t>язання цієї задачі мають суттєві обмеження: алгоритм Дейкстри погано піддається розпаралелюванню через строгу послідовність вибору вершин, а алгоритм Беллмана-Форда виконує занадто багато надлишкових обчислень</w:t>
+      </w:r>
+      <w:r>
+        <w:rPr>
+          <w:rFonts w:eastAsia="Arial Unicode MS" w:cs="Times New Roman"/>
+          <w:bCs/>
+          <w:szCs w:val="28"/>
+          <w:u w:color="000000"/>
+          <w:bdr w:val="nil"/>
+          <w:lang w:val="uk-UA" w:eastAsia="ru-RU"/>
+        </w:rPr>
+        <w:t xml:space="preserve"> [3]</w:t>
+      </w:r>
+      <w:r>
+        <w:rPr>
+          <w:rFonts w:eastAsia="Arial Unicode MS" w:cs="Times New Roman"/>
+          <w:bCs/>
+          <w:szCs w:val="28"/>
+          <w:u w:color="000000"/>
+          <w:bdr w:val="nil"/>
+          <w:lang w:val="uk-UA" w:eastAsia="ru-RU"/>
+        </w:rPr>
+        <w:t xml:space="preserve">. У цьому контексті алгоритм </w:t>
       </w:r>
       <m:oMath>
         <m:r>
@@ -3293,7 +3361,29 @@
           <w:bdr w:val="nil"/>
           <w:lang w:val="uk-UA" w:eastAsia="ru-RU"/>
         </w:rPr>
-        <w:t xml:space="preserve"> і паралельно обробляти незалежні ребра. Паралельна реалізація цього алгоритму є вкрай важливою для забезпечення масштабованості та швидкої обробки графів великих розмірів, де </w:t>
+        <w:t xml:space="preserve"> і паралельно обробляти незалежні ребра</w:t>
+      </w:r>
+      <w:r>
+        <w:rPr>
+          <w:rFonts w:eastAsia="Arial Unicode MS" w:cs="Times New Roman"/>
+          <w:bCs/>
+          <w:szCs w:val="28"/>
+          <w:u w:color="000000"/>
+          <w:bdr w:val="nil"/>
+          <w:lang w:eastAsia="ru-RU"/>
+        </w:rPr>
+        <w:t xml:space="preserve"> [4]</w:t>
+      </w:r>
+      <w:r>
+        <w:rPr>
+          <w:rFonts w:eastAsia="Arial Unicode MS" w:cs="Times New Roman"/>
+          <w:bCs/>
+          <w:szCs w:val="28"/>
+          <w:u w:color="000000"/>
+          <w:bdr w:val="nil"/>
+          <w:lang w:val="uk-UA" w:eastAsia="ru-RU"/>
+        </w:rPr>
+        <w:t xml:space="preserve">. Паралельна реалізація цього алгоритму є вкрай важливою для забезпечення масштабованості та швидкої обробки графів великих розмірів, де </w:t>
       </w:r>
       <w:r>
         <w:rPr>
@@ -3428,6 +3518,17 @@
           <w:bdr w:val="nil"/>
           <w:lang w:val="uk-UA" w:eastAsia="ru-RU"/>
         </w:rPr>
+        <w:t xml:space="preserve"> [18]</w:t>
+      </w:r>
+      <w:r>
+        <w:rPr>
+          <w:rFonts w:eastAsia="Arial Unicode MS" w:cs="Times New Roman"/>
+          <w:bCs/>
+          <w:szCs w:val="28"/>
+          <w:u w:color="000000"/>
+          <w:bdr w:val="nil"/>
+          <w:lang w:val="uk-UA" w:eastAsia="ru-RU"/>
+        </w:rPr>
         <w:t xml:space="preserve"> для розв</w:t>
       </w:r>
       <w:r>
@@ -3707,7 +3808,7 @@
           <w:lang w:val="uk-UA" w:eastAsia="ru-RU"/>
         </w:rPr>
       </w:pPr>
-      <w:bookmarkStart w:id="2" w:name="_Toc158713963"/>
+      <w:bookmarkStart w:id="1" w:name="_Toc158713963"/>
       <w:r>
         <w:rPr>
           <w:rFonts w:eastAsia="Arial Unicode MS" w:cs="Times New Roman"/>
@@ -3733,7 +3834,7 @@
         </w:rPr>
         <w:t xml:space="preserve"> ОПИС АЛГОРИТМУ ТА ЙОГО ВІДОМИХ ПАРАЛЕЛЬНИХ РЕАЛІЗАЦІЙ</w:t>
       </w:r>
-      <w:bookmarkEnd w:id="2"/>
+      <w:bookmarkEnd w:id="1"/>
     </w:p>
     <w:p>
       <w:pPr>
@@ -3745,7 +3846,7 @@
           <w:lang w:val="uk-UA" w:eastAsia="ru-RU"/>
         </w:rPr>
       </w:pPr>
-      <w:bookmarkStart w:id="3" w:name="_Toc158713964"/>
+      <w:bookmarkStart w:id="2" w:name="_Toc158713964"/>
       <w:r>
         <w:rPr>
           <w:rFonts w:eastAsia="Arial Unicode MS"/>
@@ -3762,7 +3863,7 @@
       <w:r>
         <w:t xml:space="preserve"> </w:t>
       </w:r>
-      <w:bookmarkEnd w:id="3"/>
+      <w:bookmarkEnd w:id="2"/>
       <w:r>
         <w:t xml:space="preserve">Опис алгоритму </w:t>
       </w:r>
@@ -3885,7 +3986,31 @@
           <w:bdr w:val="nil"/>
           <w:lang w:val="uk-UA" w:eastAsia="ru-RU"/>
         </w:rPr>
-        <w:t xml:space="preserve">ром та Пітером Сандерсом як метод, що поєднує переваги </w:t>
+        <w:t xml:space="preserve">ром та Пітером Сандерсом </w:t>
+      </w:r>
+      <w:r>
+        <w:rPr>
+          <w:rFonts w:eastAsia="Arial Unicode MS" w:cs="Times New Roman"/>
+          <w:bCs/>
+          <w:color w:val="000000"/>
+          <w:szCs w:val="28"/>
+          <w:u w:color="000000"/>
+          <w:bdr w:val="nil"/>
+          <w:lang w:val="uk-UA" w:eastAsia="ru-RU"/>
+        </w:rPr>
+        <w:t xml:space="preserve">[4] </w:t>
+      </w:r>
+      <w:r>
+        <w:rPr>
+          <w:rFonts w:eastAsia="Arial Unicode MS" w:cs="Times New Roman"/>
+          <w:bCs/>
+          <w:color w:val="000000"/>
+          <w:szCs w:val="28"/>
+          <w:u w:color="000000"/>
+          <w:bdr w:val="nil"/>
+          <w:lang w:val="uk-UA" w:eastAsia="ru-RU"/>
+        </w:rPr>
+        <w:t xml:space="preserve">як метод, що поєднує переваги </w:t>
       </w:r>
       <w:r>
         <w:rPr>
@@ -10132,7 +10257,7 @@
           <w:lang w:val="uk-UA"/>
         </w:rPr>
       </w:pPr>
-      <w:bookmarkStart w:id="4" w:name="_Toc158713965"/>
+      <w:bookmarkStart w:id="3" w:name="_Toc158713965"/>
       <w:r>
         <w:rPr>
           <w:lang w:val="uk-UA"/>
@@ -10140,7 +10265,7 @@
         <w:lastRenderedPageBreak/>
         <w:t xml:space="preserve">1.2 </w:t>
       </w:r>
-      <w:bookmarkEnd w:id="4"/>
+      <w:bookmarkEnd w:id="3"/>
       <w:r>
         <w:rPr>
           <w:lang w:val="uk-UA"/>
@@ -10287,6 +10412,18 @@
           <w:szCs w:val="28"/>
           <w:u w:color="000000"/>
           <w:bdr w:val="nil"/>
+          <w:lang w:eastAsia="ru-RU"/>
+        </w:rPr>
+        <w:t xml:space="preserve"> [4]</w:t>
+      </w:r>
+      <w:r>
+        <w:rPr>
+          <w:rFonts w:eastAsia="Arial Unicode MS" w:cs="Times New Roman"/>
+          <w:bCs/>
+          <w:color w:val="000000"/>
+          <w:szCs w:val="28"/>
+          <w:u w:color="000000"/>
+          <w:bdr w:val="nil"/>
           <w:lang w:val="uk-UA" w:eastAsia="ru-RU"/>
         </w:rPr>
         <w:t>. Це підтвердило життєздатність концепції розподілу вершин за «кошиками» та можливість безпечної паралельної релаксації «легких» ребер у меж</w:t>
@@ -10375,6 +10512,18 @@
           <w:lang w:val="uk-UA" w:eastAsia="ru-RU"/>
         </w:rPr>
         <w:t>Stepping with Decreasing Delta)</w:t>
+      </w:r>
+      <w:r>
+        <w:rPr>
+          <w:rFonts w:eastAsia="Arial Unicode MS" w:cs="Times New Roman"/>
+          <w:bCs/>
+          <w:color w:val="000000"/>
+          <w:szCs w:val="28"/>
+          <w:u w:color="000000"/>
+          <w:bdr w:val="nil"/>
+          <w:lang w:val="uk-UA" w:eastAsia="ru-RU"/>
+        </w:rPr>
+        <w:t xml:space="preserve"> [5]</w:t>
       </w:r>
       <w:r>
         <w:rPr>
@@ -10589,6 +10738,18 @@
           <w:szCs w:val="28"/>
           <w:u w:color="000000"/>
           <w:bdr w:val="nil"/>
+          <w:lang w:val="en-US" w:eastAsia="ru-RU"/>
+        </w:rPr>
+        <w:t xml:space="preserve"> [6]</w:t>
+      </w:r>
+      <w:r>
+        <w:rPr>
+          <w:rFonts w:eastAsia="Arial Unicode MS" w:cs="Times New Roman"/>
+          <w:bCs/>
+          <w:color w:val="000000"/>
+          <w:szCs w:val="28"/>
+          <w:u w:color="000000"/>
+          <w:bdr w:val="nil"/>
           <w:lang w:val="uk-UA" w:eastAsia="ru-RU"/>
         </w:rPr>
         <w:t xml:space="preserve">. Використання асинхронного механізму обробки </w:t>
@@ -10772,7 +10933,31 @@
           <w:bdr w:val="nil"/>
           <w:lang w:val="uk-UA" w:eastAsia="ru-RU"/>
         </w:rPr>
-        <w:t xml:space="preserve">яттю на базі стандарту MPI. У таких реалізаціях використовується слабке масштабування, а вершини графу розподіляються між обчислювальними вузлами, які локально </w:t>
+        <w:t>яттю на базі стандарту MPI</w:t>
+      </w:r>
+      <w:r>
+        <w:rPr>
+          <w:rFonts w:eastAsia="Arial Unicode MS" w:cs="Times New Roman"/>
+          <w:bCs/>
+          <w:color w:val="000000"/>
+          <w:szCs w:val="28"/>
+          <w:u w:color="000000"/>
+          <w:bdr w:val="nil"/>
+          <w:lang w:val="uk-UA" w:eastAsia="ru-RU"/>
+        </w:rPr>
+        <w:t xml:space="preserve"> [7]</w:t>
+      </w:r>
+      <w:r>
+        <w:rPr>
+          <w:rFonts w:eastAsia="Arial Unicode MS" w:cs="Times New Roman"/>
+          <w:bCs/>
+          <w:color w:val="000000"/>
+          <w:szCs w:val="28"/>
+          <w:u w:color="000000"/>
+          <w:bdr w:val="nil"/>
+          <w:lang w:val="uk-UA" w:eastAsia="ru-RU"/>
+        </w:rPr>
+        <w:t xml:space="preserve">. У таких реалізаціях використовується слабке масштабування, а вершини графу розподіляються між обчислювальними вузлами, які локально </w:t>
       </w:r>
       <w:r>
         <w:rPr>
@@ -10914,7 +11099,31 @@
           <w:bdr w:val="nil"/>
           <w:lang w:val="uk-UA" w:eastAsia="ru-RU"/>
         </w:rPr>
-        <w:t xml:space="preserve"> Neo4j Graph Data Science [5].</w:t>
+        <w:t xml:space="preserve"> Neo4j Graph Data Science [</w:t>
+      </w:r>
+      <w:r>
+        <w:rPr>
+          <w:rFonts w:eastAsia="Arial Unicode MS" w:cs="Times New Roman"/>
+          <w:bCs/>
+          <w:color w:val="000000"/>
+          <w:szCs w:val="28"/>
+          <w:u w:color="000000"/>
+          <w:bdr w:val="nil"/>
+          <w:lang w:val="uk-UA" w:eastAsia="ru-RU"/>
+        </w:rPr>
+        <w:t>8</w:t>
+      </w:r>
+      <w:r>
+        <w:rPr>
+          <w:rFonts w:eastAsia="Arial Unicode MS" w:cs="Times New Roman"/>
+          <w:bCs/>
+          <w:color w:val="000000"/>
+          <w:szCs w:val="28"/>
+          <w:u w:color="000000"/>
+          <w:bdr w:val="nil"/>
+          <w:lang w:val="uk-UA" w:eastAsia="ru-RU"/>
+        </w:rPr>
+        <w:t>].</w:t>
       </w:r>
     </w:p>
     <w:p>
@@ -11179,7 +11388,7 @@
           <w:lang w:val="uk-UA" w:eastAsia="ru-RU"/>
         </w:rPr>
       </w:pPr>
-      <w:bookmarkStart w:id="5" w:name="_Toc158713966"/>
+      <w:bookmarkStart w:id="4" w:name="_Toc158713966"/>
       <w:r>
         <w:rPr>
           <w:rFonts w:eastAsia="Arial Unicode MS"/>
@@ -11211,7 +11420,7 @@
       <w:r>
         <w:t>ШВИДКОДІЇ</w:t>
       </w:r>
-      <w:bookmarkEnd w:id="5"/>
+      <w:bookmarkEnd w:id="4"/>
     </w:p>
     <w:p>
       <w:pPr>
@@ -11830,14 +12039,42 @@
           <w:rFonts w:cs="Times New Roman"/>
           <w:lang w:val="uk-UA" w:eastAsia="ru-RU"/>
         </w:rPr>
-        <w:t xml:space="preserve"> (рисунок 2.3)</w:t>
-      </w:r>
-      <w:r>
-        <w:rPr>
-          <w:rFonts w:cs="Times New Roman"/>
-          <w:lang w:val="uk-UA" w:eastAsia="ru-RU"/>
-        </w:rPr>
-        <w:t>. Даний тип даних був обраний, оскільки він підтримує «підключення» до даних у пам’яті, що дозволяє створювати спільну пам’ять у паралельній версії та легко підключатися до неї у процесах. Хоч це</w:t>
+        <w:t xml:space="preserve"> </w:t>
+      </w:r>
+      <w:r>
+        <w:rPr>
+          <w:rFonts w:cs="Times New Roman"/>
+          <w:lang w:val="uk-UA" w:eastAsia="ru-RU"/>
+        </w:rPr>
+        <w:t xml:space="preserve">[9] </w:t>
+      </w:r>
+      <w:r>
+        <w:rPr>
+          <w:rFonts w:cs="Times New Roman"/>
+          <w:lang w:val="uk-UA" w:eastAsia="ru-RU"/>
+        </w:rPr>
+        <w:t>(рисунок 2.3)</w:t>
+      </w:r>
+      <w:r>
+        <w:rPr>
+          <w:rFonts w:cs="Times New Roman"/>
+          <w:lang w:val="uk-UA" w:eastAsia="ru-RU"/>
+        </w:rPr>
+        <w:t>. Даний тип даних був обраний, оскільки він підтримує «підключення» до даних у пам’яті, що дозволяє створювати спільну пам’ять</w:t>
+      </w:r>
+      <w:r>
+        <w:rPr>
+          <w:rFonts w:cs="Times New Roman"/>
+          <w:lang w:val="uk-UA" w:eastAsia="ru-RU"/>
+        </w:rPr>
+        <w:t xml:space="preserve"> [10]</w:t>
+      </w:r>
+      <w:r>
+        <w:rPr>
+          <w:rFonts w:cs="Times New Roman"/>
+          <w:lang w:val="uk-UA" w:eastAsia="ru-RU"/>
+        </w:rPr>
+        <w:t xml:space="preserve"> у паралельній версії та легко підключатися до неї у процесах. Хоч це</w:t>
       </w:r>
       <w:r>
         <w:rPr>
@@ -14188,6 +14425,18 @@
         <w:rPr>
           <w:lang w:val="uk-UA" w:eastAsia="ru-RU"/>
         </w:rPr>
+        <w:t xml:space="preserve"> [11]</w:t>
+      </w:r>
+      <w:r>
+        <w:rPr>
+          <w:lang w:val="uk-UA" w:eastAsia="ru-RU"/>
+        </w:rPr>
+        <w:t xml:space="preserve"> </w:t>
+      </w:r>
+      <w:r>
+        <w:rPr>
+          <w:lang w:val="uk-UA" w:eastAsia="ru-RU"/>
+        </w:rPr>
         <w:t xml:space="preserve">. </w:t>
       </w:r>
     </w:p>
@@ -14267,6 +14516,12 @@
           <w:lang w:val="uk-UA" w:eastAsia="ru-RU"/>
         </w:rPr>
         <w:lastRenderedPageBreak/>
+        <w:t xml:space="preserve">[12] </w:t>
+      </w:r>
+      <w:r>
+        <w:rPr>
+          <w:lang w:val="uk-UA" w:eastAsia="ru-RU"/>
+        </w:rPr>
         <w:t xml:space="preserve">та подальшому повузловому порівнянні цих відстаней із результатами роботи розробленого алгоритму. </w:t>
       </w:r>
     </w:p>
@@ -17328,7 +17583,7 @@
           <w:lang w:val="uk-UA" w:eastAsia="ru-RU"/>
         </w:rPr>
       </w:pPr>
-      <w:bookmarkStart w:id="6" w:name="_Toc158713967"/>
+      <w:bookmarkStart w:id="5" w:name="_Toc158713967"/>
       <w:r>
         <w:rPr>
           <w:rFonts w:eastAsia="Arial Unicode MS" w:cs="Times New Roman"/>
@@ -17366,7 +17621,7 @@
         </w:rPr>
         <w:t>ВИБІР ПРОГРАМНОГО ЗАБЕЗПЕЧЕННЯ ДЛЯ РОЗРОБКИ ПАРАЛЕЛЬНИХ ОБЧИСЛЕНЬ ТА ЙОГО КОРОТКИЙ ОПИС</w:t>
       </w:r>
-      <w:bookmarkEnd w:id="6"/>
+      <w:bookmarkEnd w:id="5"/>
     </w:p>
     <w:p>
       <w:pPr>
@@ -17413,9 +17668,45 @@
           <w:szCs w:val="28"/>
           <w:u w:color="000000"/>
           <w:bdr w:val="nil"/>
-          <w:lang w:val="uk-UA" w:eastAsia="ru-RU"/>
-        </w:rPr>
-        <w:t xml:space="preserve">. Цей механізм гарантує потокобезпечність виконання коду, проте унеможливлює одночасне виконання інструкцій кількома потоками на різних фізичних ядрах процесора. Відповідно, використання класичної </w:t>
+          <w:lang w:eastAsia="ru-RU"/>
+        </w:rPr>
+        <w:t xml:space="preserve"> [13]</w:t>
+      </w:r>
+      <w:r>
+        <w:rPr>
+          <w:rFonts w:eastAsia="Arial Unicode MS" w:cs="Times New Roman"/>
+          <w:bCs/>
+          <w:color w:val="000000"/>
+          <w:szCs w:val="28"/>
+          <w:u w:color="000000"/>
+          <w:bdr w:val="nil"/>
+          <w:lang w:val="uk-UA" w:eastAsia="ru-RU"/>
+        </w:rPr>
+        <w:t>. Цей механізм гарантує потокобезпечність виконання коду</w:t>
+      </w:r>
+      <w:r>
+        <w:rPr>
+          <w:rFonts w:eastAsia="Arial Unicode MS" w:cs="Times New Roman"/>
+          <w:bCs/>
+          <w:color w:val="000000"/>
+          <w:szCs w:val="28"/>
+          <w:u w:color="000000"/>
+          <w:bdr w:val="nil"/>
+          <w:lang w:val="uk-UA" w:eastAsia="ru-RU"/>
+        </w:rPr>
+        <w:t xml:space="preserve"> [14]</w:t>
+      </w:r>
+      <w:r>
+        <w:rPr>
+          <w:rFonts w:eastAsia="Arial Unicode MS" w:cs="Times New Roman"/>
+          <w:bCs/>
+          <w:color w:val="000000"/>
+          <w:szCs w:val="28"/>
+          <w:u w:color="000000"/>
+          <w:bdr w:val="nil"/>
+          <w:lang w:val="uk-UA" w:eastAsia="ru-RU"/>
+        </w:rPr>
+        <w:t xml:space="preserve">, проте унеможливлює одночасне виконання інструкцій кількома потоками на різних фізичних ядрах процесора. Відповідно, використання класичної </w:t>
       </w:r>
       <w:r>
         <w:rPr>
@@ -17478,6 +17769,18 @@
           <w:lang w:val="en-US" w:eastAsia="ru-RU"/>
         </w:rPr>
         <w:t>multiprocessing</w:t>
+      </w:r>
+      <w:r>
+        <w:rPr>
+          <w:rFonts w:eastAsia="Arial Unicode MS" w:cs="Times New Roman"/>
+          <w:bCs/>
+          <w:color w:val="000000"/>
+          <w:szCs w:val="28"/>
+          <w:u w:color="000000"/>
+          <w:bdr w:val="nil"/>
+          <w:lang w:val="uk-UA" w:eastAsia="ru-RU"/>
+        </w:rPr>
+        <w:t xml:space="preserve"> [15]</w:t>
       </w:r>
       <w:r>
         <w:rPr>
@@ -17734,7 +18037,79 @@
           <w:bdr w:val="nil"/>
           <w:lang w:val="uk-UA" w:eastAsia="ru-RU"/>
         </w:rPr>
-        <w:t>яті. У поєднанні з масивами бібліотеки NumPy це забезпечує прямий одночасний доступ усіх робочих процесів до глобальних структур даних графа та масивів «кошиків» без жод</w:t>
+        <w:t>яті</w:t>
+      </w:r>
+      <w:r>
+        <w:rPr>
+          <w:rFonts w:eastAsia="Arial Unicode MS" w:cs="Times New Roman"/>
+          <w:bCs/>
+          <w:color w:val="000000"/>
+          <w:szCs w:val="28"/>
+          <w:u w:color="000000"/>
+          <w:bdr w:val="nil"/>
+          <w:lang w:val="uk-UA" w:eastAsia="ru-RU"/>
+        </w:rPr>
+        <w:t xml:space="preserve"> [10]</w:t>
+      </w:r>
+      <w:r>
+        <w:rPr>
+          <w:rFonts w:eastAsia="Arial Unicode MS" w:cs="Times New Roman"/>
+          <w:bCs/>
+          <w:color w:val="000000"/>
+          <w:szCs w:val="28"/>
+          <w:u w:color="000000"/>
+          <w:bdr w:val="nil"/>
+          <w:lang w:val="uk-UA" w:eastAsia="ru-RU"/>
+        </w:rPr>
+        <w:t xml:space="preserve">. У поєднанні з масивами бібліотеки NumPy </w:t>
+      </w:r>
+      <w:r>
+        <w:rPr>
+          <w:rFonts w:eastAsia="Arial Unicode MS" w:cs="Times New Roman"/>
+          <w:bCs/>
+          <w:color w:val="000000"/>
+          <w:szCs w:val="28"/>
+          <w:u w:color="000000"/>
+          <w:bdr w:val="nil"/>
+          <w:lang w:val="uk-UA" w:eastAsia="ru-RU"/>
+        </w:rPr>
+        <w:t>[</w:t>
+      </w:r>
+      <w:r>
+        <w:rPr>
+          <w:rFonts w:eastAsia="Arial Unicode MS" w:cs="Times New Roman"/>
+          <w:bCs/>
+          <w:color w:val="000000"/>
+          <w:szCs w:val="28"/>
+          <w:u w:color="000000"/>
+          <w:bdr w:val="nil"/>
+          <w:lang w:val="uk-UA" w:eastAsia="ru-RU"/>
+        </w:rPr>
+        <w:t>16</w:t>
+      </w:r>
+      <w:r>
+        <w:rPr>
+          <w:rFonts w:eastAsia="Arial Unicode MS" w:cs="Times New Roman"/>
+          <w:bCs/>
+          <w:color w:val="000000"/>
+          <w:szCs w:val="28"/>
+          <w:u w:color="000000"/>
+          <w:bdr w:val="nil"/>
+          <w:lang w:val="uk-UA" w:eastAsia="ru-RU"/>
+        </w:rPr>
+        <w:t xml:space="preserve">] </w:t>
+      </w:r>
+      <w:r>
+        <w:rPr>
+          <w:rFonts w:eastAsia="Arial Unicode MS" w:cs="Times New Roman"/>
+          <w:bCs/>
+          <w:color w:val="000000"/>
+          <w:szCs w:val="28"/>
+          <w:u w:color="000000"/>
+          <w:bdr w:val="nil"/>
+          <w:lang w:val="uk-UA" w:eastAsia="ru-RU"/>
+        </w:rPr>
+        <w:t>це забезпечує прямий одночасний доступ усіх робочих процесів до глобальних структур даних графа та масивів «кошиків» без жод</w:t>
       </w:r>
       <w:r>
         <w:rPr>
@@ -17797,7 +18172,31 @@
           <w:bdr w:val="nil"/>
           <w:lang w:val="uk-UA" w:eastAsia="ru-RU"/>
         </w:rPr>
-        <w:t xml:space="preserve">за допомогою механізму пулу процесів. Цей інструмент дозволяє ініціалізувати задану кількість робочих процесів лише один раз на початку роботи програми та динамічно розподіляти між ними вершини поточного </w:t>
+        <w:t>за допомогою механізму пулу процесів</w:t>
+      </w:r>
+      <w:r>
+        <w:rPr>
+          <w:rFonts w:eastAsia="Arial Unicode MS" w:cs="Times New Roman"/>
+          <w:bCs/>
+          <w:color w:val="000000"/>
+          <w:szCs w:val="28"/>
+          <w:u w:color="000000"/>
+          <w:bdr w:val="nil"/>
+          <w:lang w:eastAsia="ru-RU"/>
+        </w:rPr>
+        <w:t xml:space="preserve"> [15]</w:t>
+      </w:r>
+      <w:r>
+        <w:rPr>
+          <w:rFonts w:eastAsia="Arial Unicode MS" w:cs="Times New Roman"/>
+          <w:bCs/>
+          <w:color w:val="000000"/>
+          <w:szCs w:val="28"/>
+          <w:u w:color="000000"/>
+          <w:bdr w:val="nil"/>
+          <w:lang w:val="uk-UA" w:eastAsia="ru-RU"/>
+        </w:rPr>
+        <w:t xml:space="preserve">. Цей інструмент дозволяє ініціалізувати задану кількість робочих процесів лише один раз на початку роботи програми та динамічно розподіляти між ними вершини поточного </w:t>
       </w:r>
       <w:r>
         <w:rPr>
@@ -17979,7 +18378,55 @@
           <w:bdr w:val="nil"/>
           <w:lang w:val="uk-UA" w:eastAsia="ru-RU"/>
         </w:rPr>
-        <w:t xml:space="preserve">механізм локерів, що дозволяє </w:t>
+        <w:t>механізм локерів</w:t>
+      </w:r>
+      <w:r>
+        <w:rPr>
+          <w:rFonts w:eastAsia="Arial Unicode MS" w:cs="Times New Roman"/>
+          <w:bCs/>
+          <w:color w:val="000000"/>
+          <w:szCs w:val="28"/>
+          <w:u w:color="000000"/>
+          <w:bdr w:val="nil"/>
+          <w:lang w:val="uk-UA" w:eastAsia="ru-RU"/>
+        </w:rPr>
+        <w:t xml:space="preserve"> [</w:t>
+      </w:r>
+      <w:r>
+        <w:rPr>
+          <w:rFonts w:eastAsia="Arial Unicode MS" w:cs="Times New Roman"/>
+          <w:bCs/>
+          <w:color w:val="000000"/>
+          <w:szCs w:val="28"/>
+          <w:u w:color="000000"/>
+          <w:bdr w:val="nil"/>
+          <w:lang w:val="uk-UA" w:eastAsia="ru-RU"/>
+        </w:rPr>
+        <w:t>17</w:t>
+      </w:r>
+      <w:r>
+        <w:rPr>
+          <w:rFonts w:eastAsia="Arial Unicode MS" w:cs="Times New Roman"/>
+          <w:bCs/>
+          <w:color w:val="000000"/>
+          <w:szCs w:val="28"/>
+          <w:u w:color="000000"/>
+          <w:bdr w:val="nil"/>
+          <w:lang w:val="uk-UA" w:eastAsia="ru-RU"/>
+        </w:rPr>
+        <w:t>]</w:t>
+      </w:r>
+      <w:r>
+        <w:rPr>
+          <w:rFonts w:eastAsia="Arial Unicode MS" w:cs="Times New Roman"/>
+          <w:bCs/>
+          <w:color w:val="000000"/>
+          <w:szCs w:val="28"/>
+          <w:u w:color="000000"/>
+          <w:bdr w:val="nil"/>
+          <w:lang w:val="uk-UA" w:eastAsia="ru-RU"/>
+        </w:rPr>
+        <w:t xml:space="preserve">, що дозволяє </w:t>
       </w:r>
       <w:r>
         <w:rPr>
@@ -18035,7 +18482,7 @@
           <w:lang w:val="uk-UA" w:eastAsia="ru-RU"/>
         </w:rPr>
       </w:pPr>
-      <w:bookmarkStart w:id="7" w:name="_Toc158713968"/>
+      <w:bookmarkStart w:id="6" w:name="_Toc158713968"/>
       <w:r>
         <w:rPr>
           <w:rFonts w:eastAsia="Arial Unicode MS" w:cs="Times New Roman"/>
@@ -18122,7 +18569,7 @@
         </w:rPr>
         <w:t>КТУВАННЯ, РЕАЛІЗАЦІЯ, ТЕСТУВАННЯ</w:t>
       </w:r>
-      <w:bookmarkEnd w:id="7"/>
+      <w:bookmarkEnd w:id="6"/>
     </w:p>
     <w:p>
       <w:pPr>
@@ -21578,7 +22025,7 @@
           <w:lang w:val="uk-UA" w:eastAsia="ru-RU"/>
         </w:rPr>
       </w:pPr>
-      <w:bookmarkStart w:id="8" w:name="_Toc158713969"/>
+      <w:bookmarkStart w:id="7" w:name="_Toc158713969"/>
       <w:r>
         <w:rPr>
           <w:rFonts w:eastAsia="Arial Unicode MS" w:cs="Times New Roman"/>
@@ -21616,7 +22063,7 @@
         </w:rPr>
         <w:t>ДОСЛІДЖЕННЯ ЕФЕКТИВНОСТІ ПАРАЛЕЛЬНИХ ОБЧИСЛЕНЬ АЛГОРИТМУ</w:t>
       </w:r>
-      <w:bookmarkEnd w:id="8"/>
+      <w:bookmarkEnd w:id="7"/>
     </w:p>
     <w:p>
       <w:pPr>
@@ -23053,10 +23500,11 @@
         <w:rPr>
           <w:rFonts w:eastAsia="Arial Unicode MS" w:cs="Times New Roman"/>
           <w:bCs/>
-          <w:szCs w:val="28"/>
-          <w:u w:color="000000"/>
-          <w:bdr w:val="nil"/>
-          <w:lang w:val="uk-UA" w:eastAsia="ru-RU"/>
+          <w:noProof/>
+          <w:szCs w:val="28"/>
+          <w:u w:color="000000"/>
+          <w:bdr w:val="nil"/>
+          <w:lang w:eastAsia="ru-RU"/>
         </w:rPr>
         <w:drawing>
           <wp:inline distT="0" distB="0" distL="0" distR="0" wp14:anchorId="10CF6F7B" wp14:editId="1C4A7C93">
@@ -23588,18 +24036,7 @@
           <w:bdr w:val="nil"/>
           <w:lang w:val="uk-UA" w:eastAsia="ru-RU"/>
         </w:rPr>
-        <w:t>процесів</w:t>
-      </w:r>
-      <w:r>
-        <w:rPr>
-          <w:rFonts w:eastAsia="Arial Unicode MS" w:cs="Times New Roman"/>
-          <w:bCs/>
-          <w:szCs w:val="28"/>
-          <w:u w:color="000000"/>
-          <w:bdr w:val="nil"/>
-          <w:lang w:val="uk-UA" w:eastAsia="ru-RU"/>
-        </w:rPr>
-        <w:t xml:space="preserve"> </w:t>
+        <w:t xml:space="preserve">процесів </w:t>
       </w:r>
       <w:r>
         <w:rPr>
@@ -24221,7 +24658,7 @@
           <w:szCs w:val="28"/>
           <w:u w:color="000000"/>
           <w:bdr w:val="nil"/>
-          <w:lang w:val="ru-RU" w:eastAsia="ru-RU"/>
+          <w:lang w:eastAsia="ru-RU"/>
         </w:rPr>
         <w:t>, що дорівнює кількості логічних ядер процесору,</w:t>
       </w:r>
@@ -27326,7 +27763,13 @@
         <w:rPr>
           <w:lang w:val="uk-UA" w:eastAsia="ru-RU"/>
         </w:rPr>
-        <w:t>чотири осонвних</w:t>
+        <w:t>чотири осно</w:t>
+      </w:r>
+      <w:r>
+        <w:rPr>
+          <w:lang w:val="uk-UA" w:eastAsia="ru-RU"/>
+        </w:rPr>
+        <w:t>вних</w:t>
       </w:r>
       <w:r>
         <w:rPr>
@@ -28249,7 +28692,7 @@
           <w:szCs w:val="28"/>
           <w:u w:color="000000"/>
           <w:bdr w:val="nil"/>
-          <w:lang w:val="ru-RU" w:eastAsia="ru-RU"/>
+          <w:lang w:val="uk-UA" w:eastAsia="ru-RU"/>
         </w:rPr>
         <w:t xml:space="preserve"> хоч, як правило, ми і бачимо збільшення прискорення, проте це викликано не </w:t>
       </w:r>
@@ -28365,7 +28808,7 @@
             <w:bdr w:val="nil"/>
             <w:lang w:val="uk-UA" w:eastAsia="ru-RU"/>
           </w:rPr>
-          <m:t>∆</m:t>
+          <m:t xml:space="preserve">∆ </m:t>
         </m:r>
         <m:r>
           <w:rPr>
@@ -28374,18 +28817,7 @@
             <w:szCs w:val="28"/>
             <w:u w:color="000000"/>
             <w:bdr w:val="nil"/>
-            <w:lang w:val="uk-UA" w:eastAsia="ru-RU"/>
-          </w:rPr>
-          <m:t xml:space="preserve"> </m:t>
-        </m:r>
-        <m:r>
-          <w:rPr>
-            <w:rFonts w:ascii="Cambria Math" w:eastAsia="Arial Unicode MS" w:hAnsi="Cambria Math" w:cs="Times New Roman"/>
-            <w:color w:val="000000"/>
-            <w:szCs w:val="28"/>
-            <w:u w:color="000000"/>
-            <w:bdr w:val="nil"/>
-            <w:lang w:val="ru-RU" w:eastAsia="ru-RU"/>
+            <w:lang w:eastAsia="ru-RU"/>
           </w:rPr>
           <m:t>&gt;2</m:t>
         </m:r>
@@ -28397,7 +28829,7 @@
           <w:szCs w:val="28"/>
           <w:u w:color="000000"/>
           <w:bdr w:val="nil"/>
-          <w:lang w:val="ru-RU" w:eastAsia="ru-RU"/>
+          <w:lang w:eastAsia="ru-RU"/>
         </w:rPr>
         <w:t xml:space="preserve"> значного пришвидшення не в</w:t>
       </w:r>
@@ -28422,7 +28854,7 @@
             <w:bdr w:val="nil"/>
             <w:lang w:val="uk-UA" w:eastAsia="ru-RU"/>
           </w:rPr>
-          <m:t>∆</m:t>
+          <m:t xml:space="preserve">∆ </m:t>
         </m:r>
         <m:r>
           <w:rPr>
@@ -28431,18 +28863,7 @@
             <w:szCs w:val="28"/>
             <w:u w:color="000000"/>
             <w:bdr w:val="nil"/>
-            <w:lang w:val="uk-UA" w:eastAsia="ru-RU"/>
-          </w:rPr>
-          <m:t xml:space="preserve"> </m:t>
-        </m:r>
-        <m:r>
-          <w:rPr>
-            <w:rFonts w:ascii="Cambria Math" w:eastAsia="Arial Unicode MS" w:hAnsi="Cambria Math" w:cs="Times New Roman"/>
-            <w:color w:val="000000"/>
-            <w:szCs w:val="28"/>
-            <w:u w:color="000000"/>
-            <w:bdr w:val="nil"/>
-            <w:lang w:val="ru-RU" w:eastAsia="ru-RU"/>
+            <w:lang w:eastAsia="ru-RU"/>
           </w:rPr>
           <m:t>&gt;5</m:t>
         </m:r>
@@ -28454,7 +28875,7 @@
           <w:szCs w:val="28"/>
           <w:u w:color="000000"/>
           <w:bdr w:val="nil"/>
-          <w:lang w:val="ru-RU" w:eastAsia="ru-RU"/>
+          <w:lang w:eastAsia="ru-RU"/>
         </w:rPr>
         <w:t xml:space="preserve"> майже зупиняється</w:t>
       </w:r>
@@ -28475,7 +28896,7 @@
         <w:ind w:firstLine="708"/>
         <w:rPr>
           <w:i/>
-          <w:lang w:val="en-US" w:eastAsia="ru-RU"/>
+          <w:lang w:val="uk-UA" w:eastAsia="ru-RU"/>
         </w:rPr>
       </w:pPr>
       <w:r>
@@ -28590,7 +29011,7 @@
           <w:bdr w:val="nil"/>
           <w:lang w:val="uk-UA" w:eastAsia="ru-RU"/>
         </w:rPr>
-        <w:t>-степінгу, фактично, у реалізацію Дайла.</w:t>
+        <w:t>-степінгу, фактично, у реалізацію Дайла</w:t>
       </w:r>
       <w:r>
         <w:rPr>
@@ -28599,7 +29020,29 @@
           <w:szCs w:val="28"/>
           <w:u w:color="000000"/>
           <w:bdr w:val="nil"/>
-          <w:lang w:val="ru-RU" w:eastAsia="ru-RU"/>
+          <w:lang w:val="en-US" w:eastAsia="ru-RU"/>
+        </w:rPr>
+        <w:t xml:space="preserve"> [19]</w:t>
+      </w:r>
+      <w:r>
+        <w:rPr>
+          <w:rFonts w:eastAsiaTheme="minorEastAsia"/>
+          <w:color w:val="000000"/>
+          <w:szCs w:val="28"/>
+          <w:u w:color="000000"/>
+          <w:bdr w:val="nil"/>
+          <w:lang w:val="uk-UA" w:eastAsia="ru-RU"/>
+        </w:rPr>
+        <w:t>.</w:t>
+      </w:r>
+      <w:r>
+        <w:rPr>
+          <w:rFonts w:eastAsiaTheme="minorEastAsia"/>
+          <w:color w:val="000000"/>
+          <w:szCs w:val="28"/>
+          <w:u w:color="000000"/>
+          <w:bdr w:val="nil"/>
+          <w:lang w:eastAsia="ru-RU"/>
         </w:rPr>
         <w:t xml:space="preserve"> В той час паралельна версія </w:t>
       </w:r>
@@ -28745,7 +29188,7 @@
           <w:lang w:val="uk-UA" w:eastAsia="ru-RU"/>
         </w:rPr>
       </w:pPr>
-      <w:bookmarkStart w:id="9" w:name="_Toc158713970"/>
+      <w:bookmarkStart w:id="8" w:name="_Toc158713970"/>
       <w:r>
         <w:rPr>
           <w:rFonts w:eastAsia="Arial Unicode MS" w:cs="Times New Roman"/>
@@ -28771,7 +29214,7 @@
         </w:rPr>
         <w:t>ВКИ</w:t>
       </w:r>
-      <w:bookmarkEnd w:id="9"/>
+      <w:bookmarkEnd w:id="8"/>
     </w:p>
     <w:p>
       <w:pPr>
@@ -29635,7 +30078,7 @@
           <w:lang w:val="uk-UA" w:eastAsia="ru-RU"/>
         </w:rPr>
       </w:pPr>
-      <w:bookmarkStart w:id="10" w:name="_Toc158713971"/>
+      <w:bookmarkStart w:id="9" w:name="_Toc158713971"/>
       <w:r>
         <w:rPr>
           <w:rFonts w:eastAsia="Arial Unicode MS"/>
@@ -29658,7 +30101,7 @@
         </w:rPr>
         <w:t xml:space="preserve"> ДЖЕРЕЛ</w:t>
       </w:r>
-      <w:bookmarkEnd w:id="10"/>
+      <w:bookmarkEnd w:id="9"/>
     </w:p>
     <w:p>
       <w:pPr>
@@ -29696,31 +30139,7 @@
           <w:bdr w:val="nil"/>
           <w:lang w:val="uk-UA" w:eastAsia="ru-RU"/>
         </w:rPr>
-        <w:t>https://www.researchgate.net/publication/47843063_Heaps_Are_Better_than_Buckets_Parallel_Sho</w:t>
-      </w:r>
-      <w:r>
-        <w:rPr>
-          <w:rFonts w:eastAsia="Arial Unicode MS" w:cs="Times New Roman"/>
-          <w:bCs/>
-          <w:color w:val="000000"/>
-          <w:szCs w:val="28"/>
-          <w:u w:color="000000"/>
-          <w:bdr w:val="nil"/>
-          <w:lang w:val="uk-UA" w:eastAsia="ru-RU"/>
-        </w:rPr>
-        <w:t>rtest_Paths_on_Unbalanced_Graph</w:t>
-      </w:r>
-      <w:r>
-        <w:rPr>
-          <w:rFonts w:eastAsia="Arial Unicode MS" w:cs="Times New Roman"/>
-          <w:bCs/>
-          <w:color w:val="000000"/>
-          <w:szCs w:val="28"/>
-          <w:u w:color="000000"/>
-          <w:bdr w:val="nil"/>
-          <w:lang w:val="en-US" w:eastAsia="ru-RU"/>
-        </w:rPr>
-        <w:t>s</w:t>
+        <w:t>https://dspace.uzhnu.edu.ua/server/api/core/bitstreams/8cd37afa-6366-4f93-b420-b5b838295f75/content</w:t>
       </w:r>
     </w:p>
     <w:p>
@@ -29740,18 +30159,20 @@
           <w:lang w:val="uk-UA" w:eastAsia="ru-RU"/>
         </w:rPr>
       </w:pPr>
-      <w:r>
-        <w:rPr>
-          <w:rFonts w:eastAsia="Arial Unicode MS" w:cs="Times New Roman"/>
-          <w:bCs/>
-          <w:color w:val="000000"/>
-          <w:szCs w:val="28"/>
-          <w:u w:color="000000"/>
-          <w:bdr w:val="nil"/>
-          <w:lang w:val="uk-UA" w:eastAsia="ru-RU"/>
-        </w:rPr>
-        <w:t>https://ieeexplore.ieee.org/document/10938422</w:t>
-      </w:r>
+      <w:hyperlink r:id="rId32" w:history="1">
+        <w:r>
+          <w:rPr>
+            <w:rStyle w:val="aa"/>
+            <w:rFonts w:eastAsia="Arial Unicode MS" w:cs="Times New Roman"/>
+            <w:bCs/>
+            <w:szCs w:val="28"/>
+            <w:u w:color="000000"/>
+            <w:bdr w:val="nil"/>
+            <w:lang w:val="uk-UA" w:eastAsia="ru-RU"/>
+          </w:rPr>
+          <w:t>https://visualgo.net/en/sssp/print</w:t>
+        </w:r>
+      </w:hyperlink>
     </w:p>
     <w:p>
       <w:pPr>
@@ -29770,18 +30191,20 @@
           <w:lang w:val="uk-UA" w:eastAsia="ru-RU"/>
         </w:rPr>
       </w:pPr>
-      <w:r>
-        <w:rPr>
-          <w:rFonts w:eastAsia="Arial Unicode MS" w:cs="Times New Roman"/>
-          <w:bCs/>
-          <w:color w:val="000000"/>
-          <w:szCs w:val="28"/>
-          <w:u w:color="000000"/>
-          <w:bdr w:val="nil"/>
-          <w:lang w:val="uk-UA" w:eastAsia="ru-RU"/>
-        </w:rPr>
-        <w:t>https://arifuzzaman.faculty.unlv.edu/paper/HPEC24_sssp.pdf</w:t>
-      </w:r>
+      <w:hyperlink r:id="rId33" w:history="1">
+        <w:r>
+          <w:rPr>
+            <w:rStyle w:val="aa"/>
+            <w:rFonts w:eastAsia="Arial Unicode MS" w:cs="Times New Roman"/>
+            <w:bCs/>
+            <w:szCs w:val="28"/>
+            <w:u w:color="000000"/>
+            <w:bdr w:val="nil"/>
+            <w:lang w:val="uk-UA" w:eastAsia="ru-RU"/>
+          </w:rPr>
+          <w:t>https://www.geeksforgeeks.org/dsa/what-are-the-differences-between-bellman-fords-and-dijkstras-algorithms/</w:t>
+        </w:r>
+      </w:hyperlink>
     </w:p>
     <w:p>
       <w:pPr>
@@ -29800,7 +30223,132 @@
           <w:lang w:val="uk-UA" w:eastAsia="ru-RU"/>
         </w:rPr>
       </w:pPr>
-      <w:hyperlink r:id="rId32" w:history="1">
+      <w:hyperlink r:id="rId34" w:history="1">
+        <w:r>
+          <w:rPr>
+            <w:rStyle w:val="aa"/>
+            <w:rFonts w:eastAsia="Arial Unicode MS" w:cs="Times New Roman"/>
+            <w:bCs/>
+            <w:szCs w:val="28"/>
+            <w:u w:color="000000"/>
+            <w:bdr w:val="nil"/>
+            <w:lang w:val="uk-UA" w:eastAsia="ru-RU"/>
+          </w:rPr>
+          <w:t>https://www.sciencedirect.com/science/article/pii/S0196677403000762/pdf?md5=d983238fee2b391bbf57ac27f14c7937&amp;pid=1-s2.0-S0196677403000762-main.pdf</w:t>
+        </w:r>
+      </w:hyperlink>
+    </w:p>
+    <w:p>
+      <w:pPr>
+        <w:pStyle w:val="ad"/>
+        <w:numPr>
+          <w:ilvl w:val="0"/>
+          <w:numId w:val="6"/>
+        </w:numPr>
+        <w:rPr>
+          <w:rFonts w:eastAsia="Arial Unicode MS" w:cs="Times New Roman"/>
+          <w:bCs/>
+          <w:color w:val="000000"/>
+          <w:szCs w:val="28"/>
+          <w:u w:color="000000"/>
+          <w:bdr w:val="nil"/>
+          <w:lang w:val="uk-UA" w:eastAsia="ru-RU"/>
+        </w:rPr>
+      </w:pPr>
+      <w:hyperlink r:id="rId35" w:history="1">
+        <w:r>
+          <w:rPr>
+            <w:rStyle w:val="aa"/>
+            <w:rFonts w:eastAsia="Arial Unicode MS" w:cs="Times New Roman"/>
+            <w:bCs/>
+            <w:szCs w:val="28"/>
+            <w:u w:color="000000"/>
+            <w:bdr w:val="nil"/>
+            <w:lang w:val="uk-UA" w:eastAsia="ru-RU"/>
+          </w:rPr>
+          <w:t>https://arifuzzaman.faculty.unlv.edu/paper/HPEC24_sssp.pdf</w:t>
+        </w:r>
+      </w:hyperlink>
+    </w:p>
+    <w:p>
+      <w:pPr>
+        <w:pStyle w:val="ad"/>
+        <w:numPr>
+          <w:ilvl w:val="0"/>
+          <w:numId w:val="6"/>
+        </w:numPr>
+        <w:rPr>
+          <w:rFonts w:eastAsia="Arial Unicode MS" w:cs="Times New Roman"/>
+          <w:bCs/>
+          <w:color w:val="000000"/>
+          <w:szCs w:val="28"/>
+          <w:u w:color="000000"/>
+          <w:bdr w:val="nil"/>
+          <w:lang w:val="uk-UA" w:eastAsia="ru-RU"/>
+        </w:rPr>
+      </w:pPr>
+      <w:r>
+        <w:rPr>
+          <w:rFonts w:eastAsia="Arial Unicode MS" w:cs="Times New Roman"/>
+          <w:bCs/>
+          <w:color w:val="000000"/>
+          <w:szCs w:val="28"/>
+          <w:u w:color="000000"/>
+          <w:bdr w:val="nil"/>
+          <w:lang w:val="uk-UA" w:eastAsia="ru-RU"/>
+        </w:rPr>
+        <w:t>https://www.diva-portal.org/smash/get/diva2:1894324/FULLTEXT01.pdf</w:t>
+      </w:r>
+    </w:p>
+    <w:p>
+      <w:pPr>
+        <w:pStyle w:val="ad"/>
+        <w:numPr>
+          <w:ilvl w:val="0"/>
+          <w:numId w:val="6"/>
+        </w:numPr>
+        <w:rPr>
+          <w:rFonts w:eastAsia="Arial Unicode MS" w:cs="Times New Roman"/>
+          <w:bCs/>
+          <w:color w:val="000000"/>
+          <w:szCs w:val="28"/>
+          <w:u w:color="000000"/>
+          <w:bdr w:val="nil"/>
+          <w:lang w:val="uk-UA" w:eastAsia="ru-RU"/>
+        </w:rPr>
+      </w:pPr>
+      <w:r>
+        <w:rPr>
+          <w:rFonts w:eastAsia="Arial Unicode MS" w:cs="Times New Roman"/>
+          <w:bCs/>
+          <w:color w:val="000000"/>
+          <w:szCs w:val="28"/>
+          <w:u w:color="000000"/>
+          <w:bdr w:val="nil"/>
+          <w:lang w:val="uk-UA" w:eastAsia="ru-RU"/>
+        </w:rPr>
+        <w:t>https://github.com/laertispappas/MPI-delta-stepping</w:t>
+      </w:r>
+    </w:p>
+    <w:p>
+      <w:pPr>
+        <w:pStyle w:val="ad"/>
+        <w:numPr>
+          <w:ilvl w:val="0"/>
+          <w:numId w:val="6"/>
+        </w:numPr>
+        <w:rPr>
+          <w:rStyle w:val="aa"/>
+          <w:rFonts w:eastAsia="Arial Unicode MS" w:cs="Times New Roman"/>
+          <w:bCs/>
+          <w:color w:val="000000"/>
+          <w:szCs w:val="28"/>
+          <w:u w:val="none" w:color="000000"/>
+          <w:bdr w:val="nil"/>
+          <w:lang w:val="uk-UA" w:eastAsia="ru-RU"/>
+        </w:rPr>
+      </w:pPr>
+      <w:hyperlink r:id="rId36" w:history="1">
         <w:r>
           <w:rPr>
             <w:rStyle w:val="aa"/>
@@ -29823,37 +30371,390 @@
           <w:numId w:val="6"/>
         </w:numPr>
         <w:rPr>
-          <w:rFonts w:eastAsia="Arial Unicode MS" w:cs="Times New Roman"/>
-          <w:bCs/>
-          <w:color w:val="000000"/>
-          <w:szCs w:val="28"/>
-          <w:u w:color="000000"/>
-          <w:bdr w:val="nil"/>
-          <w:lang w:val="uk-UA" w:eastAsia="ru-RU"/>
-        </w:rPr>
-      </w:pPr>
-      <w:r>
-        <w:rPr>
-          <w:rFonts w:eastAsia="Arial Unicode MS" w:cs="Times New Roman"/>
-          <w:bCs/>
-          <w:color w:val="000000"/>
-          <w:szCs w:val="28"/>
-          <w:u w:color="000000"/>
-          <w:bdr w:val="nil"/>
-          <w:lang w:val="uk-UA" w:eastAsia="ru-RU"/>
-        </w:rPr>
-        <w:t>https://www.sciencedirect.com/science/article/pii/S0196677403000762/pdf?md5=d983238fee2b391bbf57ac27f14c7937&amp;pid=1-s2.0-S0196677403000762-main.pdf</w:t>
-      </w:r>
-      <w:r>
-        <w:rPr>
-          <w:rFonts w:eastAsia="Arial Unicode MS" w:cs="Times New Roman"/>
-          <w:bCs/>
-          <w:color w:val="000000"/>
-          <w:szCs w:val="28"/>
-          <w:u w:color="000000"/>
-          <w:bdr w:val="nil"/>
-          <w:lang w:val="uk-UA" w:eastAsia="ru-RU"/>
-        </w:rPr>
+          <w:rStyle w:val="aa"/>
+          <w:rFonts w:eastAsia="Arial Unicode MS" w:cs="Times New Roman"/>
+          <w:bCs/>
+          <w:color w:val="000000"/>
+          <w:szCs w:val="28"/>
+          <w:u w:val="none" w:color="000000"/>
+          <w:bdr w:val="nil"/>
+          <w:lang w:val="uk-UA" w:eastAsia="ru-RU"/>
+        </w:rPr>
+      </w:pPr>
+      <w:hyperlink r:id="rId37" w:history="1">
+        <w:r>
+          <w:rPr>
+            <w:rStyle w:val="aa"/>
+            <w:rFonts w:eastAsia="Arial Unicode MS" w:cs="Times New Roman"/>
+            <w:bCs/>
+            <w:szCs w:val="28"/>
+            <w:u w:color="000000"/>
+            <w:bdr w:val="nil"/>
+            <w:lang w:val="uk-UA" w:eastAsia="ru-RU"/>
+          </w:rPr>
+          <w:t>https://numpy.org/doc/2.2/reference/generated/numpy.ndarray.html</w:t>
+        </w:r>
+      </w:hyperlink>
+    </w:p>
+    <w:p>
+      <w:pPr>
+        <w:pStyle w:val="ad"/>
+        <w:numPr>
+          <w:ilvl w:val="0"/>
+          <w:numId w:val="6"/>
+        </w:numPr>
+        <w:rPr>
+          <w:rStyle w:val="aa"/>
+          <w:rFonts w:eastAsia="Arial Unicode MS" w:cs="Times New Roman"/>
+          <w:bCs/>
+          <w:color w:val="000000"/>
+          <w:szCs w:val="28"/>
+          <w:u w:val="none" w:color="000000"/>
+          <w:bdr w:val="nil"/>
+          <w:lang w:val="uk-UA" w:eastAsia="ru-RU"/>
+        </w:rPr>
+      </w:pPr>
+      <w:hyperlink r:id="rId38" w:history="1">
+        <w:r>
+          <w:rPr>
+            <w:rStyle w:val="aa"/>
+            <w:rFonts w:eastAsia="Arial Unicode MS" w:cs="Times New Roman"/>
+            <w:bCs/>
+            <w:szCs w:val="28"/>
+            <w:u w:color="000000"/>
+            <w:bdr w:val="nil"/>
+            <w:lang w:val="uk-UA" w:eastAsia="ru-RU"/>
+          </w:rPr>
+          <w:t>https://docs.python.org/3/library/multiprocessing.shared_memory.html</w:t>
+        </w:r>
+      </w:hyperlink>
+    </w:p>
+    <w:p>
+      <w:pPr>
+        <w:pStyle w:val="ad"/>
+        <w:numPr>
+          <w:ilvl w:val="0"/>
+          <w:numId w:val="6"/>
+        </w:numPr>
+        <w:rPr>
+          <w:rStyle w:val="aa"/>
+          <w:rFonts w:eastAsia="Arial Unicode MS" w:cs="Times New Roman"/>
+          <w:bCs/>
+          <w:color w:val="000000"/>
+          <w:szCs w:val="28"/>
+          <w:u w:val="none" w:color="000000"/>
+          <w:bdr w:val="nil"/>
+          <w:lang w:val="uk-UA" w:eastAsia="ru-RU"/>
+        </w:rPr>
+      </w:pPr>
+      <w:hyperlink r:id="rId39" w:history="1">
+        <w:r>
+          <w:rPr>
+            <w:rStyle w:val="aa"/>
+            <w:rFonts w:eastAsia="Arial Unicode MS" w:cs="Times New Roman"/>
+            <w:bCs/>
+            <w:szCs w:val="28"/>
+            <w:u w:color="000000"/>
+            <w:bdr w:val="nil"/>
+            <w:lang w:val="uk-UA" w:eastAsia="ru-RU"/>
+          </w:rPr>
+          <w:t>https://networkx.org/en/</w:t>
+        </w:r>
+      </w:hyperlink>
+    </w:p>
+    <w:p>
+      <w:pPr>
+        <w:pStyle w:val="ad"/>
+        <w:numPr>
+          <w:ilvl w:val="0"/>
+          <w:numId w:val="6"/>
+        </w:numPr>
+        <w:rPr>
+          <w:rStyle w:val="aa"/>
+          <w:rFonts w:eastAsia="Arial Unicode MS" w:cs="Times New Roman"/>
+          <w:bCs/>
+          <w:color w:val="000000"/>
+          <w:szCs w:val="28"/>
+          <w:u w:val="none" w:color="000000"/>
+          <w:bdr w:val="nil"/>
+          <w:lang w:val="uk-UA" w:eastAsia="ru-RU"/>
+        </w:rPr>
+      </w:pPr>
+      <w:hyperlink r:id="rId40" w:history="1">
+        <w:r>
+          <w:rPr>
+            <w:rStyle w:val="aa"/>
+            <w:rFonts w:eastAsia="Arial Unicode MS" w:cs="Times New Roman"/>
+            <w:bCs/>
+            <w:szCs w:val="28"/>
+            <w:u w:color="000000"/>
+            <w:bdr w:val="nil"/>
+            <w:lang w:val="uk-UA" w:eastAsia="ru-RU"/>
+          </w:rPr>
+          <w:t>https://networkx.org/documentation/stable/reference/algorithms/generated/networkx.algorithms.shortest_paths.weighted.single_source_dijkstra_path_length.html</w:t>
+        </w:r>
+      </w:hyperlink>
+    </w:p>
+    <w:p>
+      <w:pPr>
+        <w:pStyle w:val="ad"/>
+        <w:numPr>
+          <w:ilvl w:val="0"/>
+          <w:numId w:val="6"/>
+        </w:numPr>
+        <w:rPr>
+          <w:rStyle w:val="aa"/>
+          <w:rFonts w:eastAsia="Arial Unicode MS" w:cs="Times New Roman"/>
+          <w:bCs/>
+          <w:color w:val="000000"/>
+          <w:szCs w:val="28"/>
+          <w:u w:val="none" w:color="000000"/>
+          <w:bdr w:val="nil"/>
+          <w:lang w:val="uk-UA" w:eastAsia="ru-RU"/>
+        </w:rPr>
+      </w:pPr>
+      <w:hyperlink r:id="rId41" w:history="1">
+        <w:r>
+          <w:rPr>
+            <w:rStyle w:val="aa"/>
+            <w:rFonts w:eastAsia="Arial Unicode MS" w:cs="Times New Roman"/>
+            <w:bCs/>
+            <w:szCs w:val="28"/>
+            <w:u w:color="000000"/>
+            <w:bdr w:val="nil"/>
+            <w:lang w:val="uk-UA" w:eastAsia="ru-RU"/>
+          </w:rPr>
+          <w:t>https://realpython.com/python-gil/</w:t>
+        </w:r>
+      </w:hyperlink>
+    </w:p>
+    <w:p>
+      <w:pPr>
+        <w:pStyle w:val="ad"/>
+        <w:numPr>
+          <w:ilvl w:val="0"/>
+          <w:numId w:val="6"/>
+        </w:numPr>
+        <w:rPr>
+          <w:rStyle w:val="aa"/>
+          <w:rFonts w:eastAsia="Arial Unicode MS" w:cs="Times New Roman"/>
+          <w:bCs/>
+          <w:color w:val="000000"/>
+          <w:szCs w:val="28"/>
+          <w:u w:val="none" w:color="000000"/>
+          <w:bdr w:val="nil"/>
+          <w:lang w:val="uk-UA" w:eastAsia="ru-RU"/>
+        </w:rPr>
+      </w:pPr>
+      <w:hyperlink r:id="rId42" w:history="1">
+        <w:r>
+          <w:rPr>
+            <w:rStyle w:val="aa"/>
+            <w:rFonts w:eastAsia="Arial Unicode MS" w:cs="Times New Roman"/>
+            <w:bCs/>
+            <w:szCs w:val="28"/>
+            <w:u w:color="000000"/>
+            <w:bdr w:val="nil"/>
+            <w:lang w:val="uk-UA" w:eastAsia="ru-RU"/>
+          </w:rPr>
+          <w:t>https://realpython.com/python-thread-lock/</w:t>
+        </w:r>
+      </w:hyperlink>
+    </w:p>
+    <w:p>
+      <w:pPr>
+        <w:pStyle w:val="ad"/>
+        <w:numPr>
+          <w:ilvl w:val="0"/>
+          <w:numId w:val="6"/>
+        </w:numPr>
+        <w:rPr>
+          <w:rStyle w:val="aa"/>
+          <w:rFonts w:eastAsia="Arial Unicode MS" w:cs="Times New Roman"/>
+          <w:bCs/>
+          <w:color w:val="000000"/>
+          <w:szCs w:val="28"/>
+          <w:u w:val="none" w:color="000000"/>
+          <w:bdr w:val="nil"/>
+          <w:lang w:val="uk-UA" w:eastAsia="ru-RU"/>
+        </w:rPr>
+      </w:pPr>
+      <w:hyperlink r:id="rId43" w:history="1">
+        <w:r>
+          <w:rPr>
+            <w:rStyle w:val="aa"/>
+            <w:rFonts w:eastAsia="Arial Unicode MS" w:cs="Times New Roman"/>
+            <w:bCs/>
+            <w:szCs w:val="28"/>
+            <w:u w:color="000000"/>
+            <w:bdr w:val="nil"/>
+            <w:lang w:val="uk-UA" w:eastAsia="ru-RU"/>
+          </w:rPr>
+          <w:t>https://docs.python.org/3/library/multiprocessing.html</w:t>
+        </w:r>
+      </w:hyperlink>
+    </w:p>
+    <w:p>
+      <w:pPr>
+        <w:pStyle w:val="ad"/>
+        <w:numPr>
+          <w:ilvl w:val="0"/>
+          <w:numId w:val="6"/>
+        </w:numPr>
+        <w:rPr>
+          <w:rStyle w:val="aa"/>
+          <w:rFonts w:eastAsia="Arial Unicode MS" w:cs="Times New Roman"/>
+          <w:bCs/>
+          <w:color w:val="000000"/>
+          <w:szCs w:val="28"/>
+          <w:u w:val="none" w:color="000000"/>
+          <w:bdr w:val="nil"/>
+          <w:lang w:val="uk-UA" w:eastAsia="ru-RU"/>
+        </w:rPr>
+      </w:pPr>
+      <w:hyperlink r:id="rId44" w:history="1">
+        <w:r>
+          <w:rPr>
+            <w:rStyle w:val="aa"/>
+            <w:rFonts w:eastAsia="Arial Unicode MS" w:cs="Times New Roman"/>
+            <w:bCs/>
+            <w:szCs w:val="28"/>
+            <w:u w:color="000000"/>
+            <w:bdr w:val="nil"/>
+            <w:lang w:val="uk-UA" w:eastAsia="ru-RU"/>
+          </w:rPr>
+          <w:t>https://numpy.org/</w:t>
+        </w:r>
+      </w:hyperlink>
+    </w:p>
+    <w:p>
+      <w:pPr>
+        <w:pStyle w:val="ad"/>
+        <w:numPr>
+          <w:ilvl w:val="0"/>
+          <w:numId w:val="6"/>
+        </w:numPr>
+        <w:rPr>
+          <w:rStyle w:val="aa"/>
+          <w:rFonts w:eastAsia="Arial Unicode MS" w:cs="Times New Roman"/>
+          <w:bCs/>
+          <w:color w:val="000000"/>
+          <w:szCs w:val="28"/>
+          <w:u w:val="none" w:color="000000"/>
+          <w:bdr w:val="nil"/>
+          <w:lang w:val="uk-UA" w:eastAsia="ru-RU"/>
+        </w:rPr>
+      </w:pPr>
+      <w:hyperlink r:id="rId45" w:history="1">
+        <w:r>
+          <w:rPr>
+            <w:rStyle w:val="aa"/>
+            <w:rFonts w:eastAsia="Arial Unicode MS" w:cs="Times New Roman"/>
+            <w:bCs/>
+            <w:szCs w:val="28"/>
+            <w:u w:color="000000"/>
+            <w:bdr w:val="nil"/>
+            <w:lang w:val="uk-UA" w:eastAsia="ru-RU"/>
+          </w:rPr>
+          <w:t>https://medium.com/swlh/protect-your-shared-resource-using-multiprocessing-locks-in-python-21fc90ad5af1</w:t>
+        </w:r>
+      </w:hyperlink>
+    </w:p>
+    <w:p>
+      <w:pPr>
+        <w:pStyle w:val="ad"/>
+        <w:numPr>
+          <w:ilvl w:val="0"/>
+          <w:numId w:val="6"/>
+        </w:numPr>
+        <w:rPr>
+          <w:rStyle w:val="aa"/>
+          <w:rFonts w:eastAsia="Arial Unicode MS" w:cs="Times New Roman"/>
+          <w:bCs/>
+          <w:color w:val="000000"/>
+          <w:szCs w:val="28"/>
+          <w:u w:val="none" w:color="000000"/>
+          <w:bdr w:val="nil"/>
+          <w:lang w:val="uk-UA" w:eastAsia="ru-RU"/>
+        </w:rPr>
+      </w:pPr>
+      <w:hyperlink r:id="rId46" w:history="1">
+        <w:r>
+          <w:rPr>
+            <w:rStyle w:val="aa"/>
+            <w:rFonts w:eastAsia="Arial Unicode MS" w:cs="Times New Roman"/>
+            <w:bCs/>
+            <w:szCs w:val="28"/>
+            <w:u w:color="000000"/>
+            <w:bdr w:val="nil"/>
+            <w:lang w:val="uk-UA" w:eastAsia="ru-RU"/>
+          </w:rPr>
+          <w:t>https://www.python.org/</w:t>
+        </w:r>
+      </w:hyperlink>
+    </w:p>
+    <w:p>
+      <w:pPr>
+        <w:pStyle w:val="ad"/>
+        <w:numPr>
+          <w:ilvl w:val="0"/>
+          <w:numId w:val="6"/>
+        </w:numPr>
+        <w:rPr>
+          <w:rStyle w:val="aa"/>
+          <w:rFonts w:eastAsia="Arial Unicode MS" w:cs="Times New Roman"/>
+          <w:bCs/>
+          <w:color w:val="000000"/>
+          <w:szCs w:val="28"/>
+          <w:u w:val="none" w:color="000000"/>
+          <w:bdr w:val="nil"/>
+          <w:lang w:val="uk-UA" w:eastAsia="ru-RU"/>
+        </w:rPr>
+      </w:pPr>
+      <w:r>
+        <w:rPr>
+          <w:rStyle w:val="aa"/>
+          <w:rFonts w:eastAsia="Arial Unicode MS" w:cs="Times New Roman"/>
+          <w:bCs/>
+          <w:color w:val="000000"/>
+          <w:szCs w:val="28"/>
+          <w:u w:val="none" w:color="000000"/>
+          <w:bdr w:val="nil"/>
+          <w:lang w:val="uk-UA" w:eastAsia="ru-RU"/>
+        </w:rPr>
+        <w:t>https://www.geeksforgeeks.org/dsa/dials-algorithm-optimized-dijkstra-for-small-range-weights/</w:t>
+      </w:r>
+      <w:bookmarkStart w:id="10" w:name="_GoBack"/>
+      <w:bookmarkEnd w:id="10"/>
+    </w:p>
+    <w:p>
+      <w:pPr>
+        <w:pStyle w:val="ad"/>
+        <w:numPr>
+          <w:ilvl w:val="0"/>
+          <w:numId w:val="6"/>
+        </w:numPr>
+        <w:rPr>
+          <w:rFonts w:eastAsia="Arial Unicode MS" w:cs="Times New Roman"/>
+          <w:bCs/>
+          <w:color w:val="000000"/>
+          <w:szCs w:val="28"/>
+          <w:u w:color="000000"/>
+          <w:bdr w:val="nil"/>
+          <w:lang w:val="uk-UA" w:eastAsia="ru-RU"/>
+        </w:rPr>
+      </w:pPr>
+      <w:r>
+        <w:rPr>
+          <w:rFonts w:eastAsia="Arial Unicode MS" w:cs="Times New Roman"/>
+          <w:bCs/>
+          <w:color w:val="000000"/>
+          <w:szCs w:val="28"/>
+          <w:u w:color="000000"/>
+          <w:bdr w:val="nil"/>
+          <w:lang w:val="uk-UA" w:eastAsia="ru-RU"/>
+        </w:rPr>
+        <w:lastRenderedPageBreak/>
         <w:br w:type="page"/>
       </w:r>
     </w:p>
@@ -30111,7 +31012,7 @@
       </w:pPr>
     </w:p>
     <w:sectPr>
-      <w:headerReference w:type="default" r:id="rId33"/>
+      <w:headerReference w:type="default" r:id="rId47"/>
       <w:pgSz w:w="11906" w:h="16838"/>
       <w:pgMar w:top="1134" w:right="1134" w:bottom="1134" w:left="1134" w:header="709" w:footer="709" w:gutter="0"/>
       <w:cols w:space="708"/>
@@ -30225,7 +31126,7 @@
             <w:noProof/>
             <w:szCs w:val="28"/>
           </w:rPr>
-          <w:t>3</w:t>
+          <w:t>60</w:t>
         </w:r>
         <w:r>
           <w:rPr>
@@ -32529,568 +33430,6 @@
 </w:styles>
 </file>
 
-<file path=word/glossary/document.xml><?xml version="1.0" encoding="utf-8"?>
-<w:glossaryDocument xmlns:wpc="http://schemas.microsoft.com/office/word/2010/wordprocessingCanvas" xmlns:mc="http://schemas.openxmlformats.org/markup-compatibility/2006" xmlns:o="urn:schemas-microsoft-com:office:office" xmlns:r="http://schemas.openxmlformats.org/officeDocument/2006/relationships" xmlns:m="http://schemas.openxmlformats.org/officeDocument/2006/math" xmlns:v="urn:schemas-microsoft-com:vml" xmlns:wp14="http://schemas.microsoft.com/office/word/2010/wordprocessingDrawing" xmlns:wp="http://schemas.openxmlformats.org/drawingml/2006/wordprocessingDrawing" xmlns:w10="urn:schemas-microsoft-com:office:word" xmlns:w="http://schemas.openxmlformats.org/wordprocessingml/2006/main" xmlns:w14="http://schemas.microsoft.com/office/word/2010/wordml" xmlns:w15="http://schemas.microsoft.com/office/word/2012/wordml" xmlns:wpg="http://schemas.microsoft.com/office/word/2010/wordprocessingGroup" xmlns:wpi="http://schemas.microsoft.com/office/word/2010/wordprocessingInk" xmlns:wne="http://schemas.microsoft.com/office/word/2006/wordml" xmlns:wps="http://schemas.microsoft.com/office/word/2010/wordprocessingShape" mc:Ignorable="w14 w15 wp14"/>
-</file>
-
-<file path=word/glossary/fontTable.xml><?xml version="1.0" encoding="utf-8"?>
-<w:fonts xmlns:mc="http://schemas.openxmlformats.org/markup-compatibility/2006" xmlns:r="http://schemas.openxmlformats.org/officeDocument/2006/relationships" xmlns:w="http://schemas.openxmlformats.org/wordprocessingml/2006/main" xmlns:w14="http://schemas.microsoft.com/office/word/2010/wordml" xmlns:w15="http://schemas.microsoft.com/office/word/2012/wordml" mc:Ignorable="w14 w15">
-  <w:font w:name="Symbol">
-    <w:panose1 w:val="05050102010706020507"/>
-    <w:charset w:val="02"/>
-    <w:family w:val="roman"/>
-    <w:pitch w:val="variable"/>
-    <w:sig w:usb0="00000000" w:usb1="10000000" w:usb2="00000000" w:usb3="00000000" w:csb0="80000000" w:csb1="00000000"/>
-  </w:font>
-  <w:font w:name="Times New Roman">
-    <w:panose1 w:val="02020603050405020304"/>
-    <w:charset w:val="CC"/>
-    <w:family w:val="roman"/>
-    <w:pitch w:val="variable"/>
-    <w:sig w:usb0="E0002EFF" w:usb1="C000785B" w:usb2="00000009" w:usb3="00000000" w:csb0="000001FF" w:csb1="00000000"/>
-  </w:font>
-  <w:font w:name="Courier New">
-    <w:panose1 w:val="02070309020205020404"/>
-    <w:charset w:val="CC"/>
-    <w:family w:val="modern"/>
-    <w:pitch w:val="fixed"/>
-    <w:sig w:usb0="E0002EFF" w:usb1="C0007843" w:usb2="00000009" w:usb3="00000000" w:csb0="000001FF" w:csb1="00000000"/>
-  </w:font>
-  <w:font w:name="Wingdings">
-    <w:panose1 w:val="05000000000000000000"/>
-    <w:charset w:val="02"/>
-    <w:family w:val="auto"/>
-    <w:pitch w:val="variable"/>
-    <w:sig w:usb0="00000000" w:usb1="10000000" w:usb2="00000000" w:usb3="00000000" w:csb0="80000000" w:csb1="00000000"/>
-  </w:font>
-  <w:font w:name="Arial Unicode MS">
-    <w:panose1 w:val="020B0604020202020204"/>
-    <w:charset w:val="80"/>
-    <w:family w:val="swiss"/>
-    <w:pitch w:val="variable"/>
-    <w:sig w:usb0="F7FFAFFF" w:usb1="E9DFFFFF" w:usb2="0000003F" w:usb3="00000000" w:csb0="003F01FF" w:csb1="00000000"/>
-  </w:font>
-  <w:font w:name="Calibri">
-    <w:panose1 w:val="020F0502020204030204"/>
-    <w:charset w:val="CC"/>
-    <w:family w:val="swiss"/>
-    <w:pitch w:val="variable"/>
-    <w:sig w:usb0="E4002EFF" w:usb1="C000247B" w:usb2="00000009" w:usb3="00000000" w:csb0="000001FF" w:csb1="00000000"/>
-  </w:font>
-  <w:font w:name="Times New Roman (Headings CS)">
-    <w:altName w:val="Times New Roman"/>
-    <w:panose1 w:val="00000000000000000000"/>
-    <w:charset w:val="00"/>
-    <w:family w:val="roman"/>
-    <w:notTrueType/>
-    <w:pitch w:val="default"/>
-  </w:font>
-  <w:font w:name="Segoe UI">
-    <w:panose1 w:val="020B0502040204020203"/>
-    <w:charset w:val="CC"/>
-    <w:family w:val="swiss"/>
-    <w:pitch w:val="variable"/>
-    <w:sig w:usb0="E4002EFF" w:usb1="C000E47F" w:usb2="00000009" w:usb3="00000000" w:csb0="000001FF" w:csb1="00000000"/>
-  </w:font>
-  <w:font w:name="Cambria Math">
-    <w:panose1 w:val="02040503050406030204"/>
-    <w:charset w:val="CC"/>
-    <w:family w:val="roman"/>
-    <w:pitch w:val="variable"/>
-    <w:sig w:usb0="E00006FF" w:usb1="420024FF" w:usb2="02000000" w:usb3="00000000" w:csb0="0000019F" w:csb1="00000000"/>
-  </w:font>
-  <w:font w:name="Calibri Light">
-    <w:panose1 w:val="020F0302020204030204"/>
-    <w:charset w:val="CC"/>
-    <w:family w:val="swiss"/>
-    <w:pitch w:val="variable"/>
-    <w:sig w:usb0="E4002EFF" w:usb1="C000247B" w:usb2="00000009" w:usb3="00000000" w:csb0="000001FF" w:csb1="00000000"/>
-  </w:font>
-</w:fonts>
-</file>
-
-<file path=word/glossary/settings.xml><?xml version="1.0" encoding="utf-8"?>
-<w:settings xmlns:mc="http://schemas.openxmlformats.org/markup-compatibility/2006" xmlns:o="urn:schemas-microsoft-com:office:office" xmlns:r="http://schemas.openxmlformats.org/officeDocument/2006/relationships" xmlns:m="http://schemas.openxmlformats.org/officeDocument/2006/math" xmlns:v="urn:schemas-microsoft-com:vml" xmlns:w10="urn:schemas-microsoft-com:office:word" xmlns:w="http://schemas.openxmlformats.org/wordprocessingml/2006/main" xmlns:w14="http://schemas.microsoft.com/office/word/2010/wordml" xmlns:w15="http://schemas.microsoft.com/office/word/2012/wordml" xmlns:sl="http://schemas.openxmlformats.org/schemaLibrary/2006/main" mc:Ignorable="w14 w15">
-  <w:view w:val="normal"/>
-  <w:revisionView w:markup="0" w:comments="0" w:insDel="0" w:formatting="0" w:inkAnnotations="0"/>
-  <w:defaultTabStop w:val="708"/>
-  <w:characterSpacingControl w:val="doNotCompress"/>
-  <w:compat>
-    <w:useFELayout/>
-    <w:compatSetting w:name="compatibilityMode" w:uri="http://schemas.microsoft.com/office/word" w:val="15"/>
-    <w:compatSetting w:name="overrideTableStyleFontSizeAndJustification" w:uri="http://schemas.microsoft.com/office/word" w:val="1"/>
-    <w:compatSetting w:name="enableOpenTypeFeatures" w:uri="http://schemas.microsoft.com/office/word" w:val="1"/>
-    <w:compatSetting w:name="doNotFlipMirrorIndents" w:uri="http://schemas.microsoft.com/office/word" w:val="1"/>
-    <w:compatSetting w:name="differentiateMultirowTableHeaders" w:uri="http://schemas.microsoft.com/office/word" w:val="1"/>
-  </w:compat>
-  <w:rsids>
-    <w:rsidRoot w:val="006C7E06"/>
-    <w:rsid w:val="006C7E06"/>
-    <w:rsid w:val="00985685"/>
-    <w:rsid w:val="00B03DBD"/>
-  </w:rsids>
-  <m:mathPr>
-    <m:mathFont m:val="Cambria Math"/>
-    <m:brkBin m:val="before"/>
-    <m:brkBinSub m:val="--"/>
-    <m:smallFrac m:val="0"/>
-    <m:dispDef/>
-    <m:lMargin m:val="0"/>
-    <m:rMargin m:val="0"/>
-    <m:defJc m:val="centerGroup"/>
-    <m:wrapIndent m:val="1440"/>
-    <m:intLim m:val="subSup"/>
-    <m:naryLim m:val="undOvr"/>
-  </m:mathPr>
-  <w:themeFontLang w:val="ru-RU"/>
-  <w:clrSchemeMapping w:bg1="light1" w:t1="dark1" w:bg2="light2" w:t2="dark2" w:accent1="accent1" w:accent2="accent2" w:accent3="accent3" w:accent4="accent4" w:accent5="accent5" w:accent6="accent6" w:hyperlink="hyperlink" w:followedHyperlink="followedHyperlink"/>
-  <w:decimalSymbol w:val=","/>
-  <w:listSeparator w:val=";"/>
-  <w15:chartTrackingRefBased/>
-</w:settings>
-</file>
-
-<file path=word/glossary/styles.xml><?xml version="1.0" encoding="utf-8"?>
-<w:styles xmlns:mc="http://schemas.openxmlformats.org/markup-compatibility/2006" xmlns:r="http://schemas.openxmlformats.org/officeDocument/2006/relationships" xmlns:w="http://schemas.openxmlformats.org/wordprocessingml/2006/main" xmlns:w14="http://schemas.microsoft.com/office/word/2010/wordml" xmlns:w15="http://schemas.microsoft.com/office/word/2012/wordml" mc:Ignorable="w14 w15">
-  <w:docDefaults>
-    <w:rPrDefault>
-      <w:rPr>
-        <w:rFonts w:asciiTheme="minorHAnsi" w:eastAsiaTheme="minorEastAsia" w:hAnsiTheme="minorHAnsi" w:cstheme="minorBidi"/>
-        <w:sz w:val="22"/>
-        <w:szCs w:val="22"/>
-        <w:lang w:val="ru-RU" w:eastAsia="ru-RU" w:bidi="ar-SA"/>
-      </w:rPr>
-    </w:rPrDefault>
-    <w:pPrDefault>
-      <w:pPr>
-        <w:spacing w:after="160" w:line="259" w:lineRule="auto"/>
-      </w:pPr>
-    </w:pPrDefault>
-  </w:docDefaults>
-  <w:latentStyles w:defLockedState="0" w:defUIPriority="99" w:defSemiHidden="0" w:defUnhideWhenUsed="0" w:defQFormat="0" w:count="371">
-    <w:lsdException w:name="Normal" w:uiPriority="0" w:qFormat="1"/>
-    <w:lsdException w:name="heading 1" w:uiPriority="9" w:qFormat="1"/>
-    <w:lsdException w:name="heading 2" w:semiHidden="1" w:uiPriority="9" w:unhideWhenUsed="1" w:qFormat="1"/>
-    <w:lsdException w:name="heading 3" w:semiHidden="1" w:uiPriority="9" w:unhideWhenUsed="1" w:qFormat="1"/>
-    <w:lsdException w:name="heading 4" w:semiHidden="1" w:uiPriority="9" w:unhideWhenUsed="1" w:qFormat="1"/>
-    <w:lsdException w:name="heading 5" w:semiHidden="1" w:uiPriority="9" w:unhideWhenUsed="1" w:qFormat="1"/>
-    <w:lsdException w:name="heading 6" w:semiHidden="1" w:uiPriority="9" w:unhideWhenUsed="1" w:qFormat="1"/>
-    <w:lsdException w:name="heading 7" w:semiHidden="1" w:uiPriority="9" w:unhideWhenUsed="1" w:qFormat="1"/>
-    <w:lsdException w:name="heading 8" w:semiHidden="1" w:uiPriority="9" w:unhideWhenUsed="1" w:qFormat="1"/>
-    <w:lsdException w:name="heading 9" w:semiHidden="1" w:uiPriority="9" w:unhideWhenUsed="1" w:qFormat="1"/>
-    <w:lsdException w:name="index 1" w:semiHidden="1" w:unhideWhenUsed="1"/>
-    <w:lsdException w:name="index 2" w:semiHidden="1" w:unhideWhenUsed="1"/>
-    <w:lsdException w:name="index 3" w:semiHidden="1" w:unhideWhenUsed="1"/>
-    <w:lsdException w:name="index 4" w:semiHidden="1" w:unhideWhenUsed="1"/>
-    <w:lsdException w:name="index 5" w:semiHidden="1" w:unhideWhenUsed="1"/>
-    <w:lsdException w:name="index 6" w:semiHidden="1" w:unhideWhenUsed="1"/>
-    <w:lsdException w:name="index 7" w:semiHidden="1" w:unhideWhenUsed="1"/>
-    <w:lsdException w:name="index 8" w:semiHidden="1" w:unhideWhenUsed="1"/>
-    <w:lsdException w:name="index 9" w:semiHidden="1" w:unhideWhenUsed="1"/>
-    <w:lsdException w:name="toc 1" w:semiHidden="1" w:uiPriority="39" w:unhideWhenUsed="1"/>
-    <w:lsdException w:name="toc 2" w:semiHidden="1" w:uiPriority="39" w:unhideWhenUsed="1"/>
-    <w:lsdException w:name="toc 3" w:semiHidden="1" w:uiPriority="39" w:unhideWhenUsed="1"/>
-    <w:lsdException w:name="toc 4" w:semiHidden="1" w:uiPriority="39" w:unhideWhenUsed="1"/>
-    <w:lsdException w:name="toc 5" w:semiHidden="1" w:uiPriority="39" w:unhideWhenUsed="1"/>
-    <w:lsdException w:name="toc 6" w:semiHidden="1" w:uiPriority="39" w:unhideWhenUsed="1"/>
-    <w:lsdException w:name="toc 7" w:semiHidden="1" w:uiPriority="39" w:unhideWhenUsed="1"/>
-    <w:lsdException w:name="toc 8" w:semiHidden="1" w:uiPriority="39" w:unhideWhenUsed="1"/>
-    <w:lsdException w:name="toc 9" w:semiHidden="1" w:uiPriority="39" w:unhideWhenUsed="1"/>
-    <w:lsdException w:name="Normal Indent" w:semiHidden="1" w:unhideWhenUsed="1"/>
-    <w:lsdException w:name="footnote text" w:semiHidden="1" w:unhideWhenUsed="1"/>
-    <w:lsdException w:name="annotation text" w:semiHidden="1" w:unhideWhenUsed="1"/>
-    <w:lsdException w:name="header" w:semiHidden="1" w:unhideWhenUsed="1"/>
-    <w:lsdException w:name="footer" w:semiHidden="1" w:unhideWhenUsed="1"/>
-    <w:lsdException w:name="index heading" w:semiHidden="1" w:unhideWhenUsed="1"/>
-    <w:lsdException w:name="caption" w:semiHidden="1" w:uiPriority="35" w:unhideWhenUsed="1" w:qFormat="1"/>
-    <w:lsdException w:name="table of figures" w:semiHidden="1" w:unhideWhenUsed="1"/>
-    <w:lsdException w:name="envelope address" w:semiHidden="1" w:unhideWhenUsed="1"/>
-    <w:lsdException w:name="envelope return" w:semiHidden="1" w:unhideWhenUsed="1"/>
-    <w:lsdException w:name="footnote reference" w:semiHidden="1" w:unhideWhenUsed="1"/>
-    <w:lsdException w:name="annotation reference" w:semiHidden="1" w:unhideWhenUsed="1"/>
-    <w:lsdException w:name="line number" w:semiHidden="1" w:unhideWhenUsed="1"/>
-    <w:lsdException w:name="page number" w:semiHidden="1" w:unhideWhenUsed="1"/>
-    <w:lsdException w:name="endnote reference" w:semiHidden="1" w:unhideWhenUsed="1"/>
-    <w:lsdException w:name="endnote text" w:semiHidden="1" w:unhideWhenUsed="1"/>
-    <w:lsdException w:name="table of authorities" w:semiHidden="1" w:unhideWhenUsed="1"/>
-    <w:lsdException w:name="macro" w:semiHidden="1" w:unhideWhenUsed="1"/>
-    <w:lsdException w:name="toa heading" w:semiHidden="1" w:unhideWhenUsed="1"/>
-    <w:lsdException w:name="List" w:semiHidden="1" w:unhideWhenUsed="1"/>
-    <w:lsdException w:name="List Bullet" w:semiHidden="1" w:unhideWhenUsed="1"/>
-    <w:lsdException w:name="List Number" w:semiHidden="1" w:unhideWhenUsed="1"/>
-    <w:lsdException w:name="List 2" w:semiHidden="1" w:unhideWhenUsed="1"/>
-    <w:lsdException w:name="List 3" w:semiHidden="1" w:unhideWhenUsed="1"/>
-    <w:lsdException w:name="List 4" w:semiHidden="1" w:unhideWhenUsed="1"/>
-    <w:lsdException w:name="List 5" w:semiHidden="1" w:unhideWhenUsed="1"/>
-    <w:lsdException w:name="List Bullet 2" w:semiHidden="1" w:unhideWhenUsed="1"/>
-    <w:lsdException w:name="List Bullet 3" w:semiHidden="1" w:unhideWhenUsed="1"/>
-    <w:lsdException w:name="List Bullet 4" w:semiHidden="1" w:unhideWhenUsed="1"/>
-    <w:lsdException w:name="List Bullet 5" w:semiHidden="1" w:unhideWhenUsed="1"/>
-    <w:lsdException w:name="List Number 2" w:semiHidden="1" w:unhideWhenUsed="1"/>
-    <w:lsdException w:name="List Number 3" w:semiHidden="1" w:unhideWhenUsed="1"/>
-    <w:lsdException w:name="List Number 4" w:semiHidden="1" w:unhideWhenUsed="1"/>
-    <w:lsdException w:name="List Number 5" w:semiHidden="1" w:unhideWhenUsed="1"/>
-    <w:lsdException w:name="Title" w:uiPriority="10" w:qFormat="1"/>
-    <w:lsdException w:name="Closing" w:semiHidden="1" w:unhideWhenUsed="1"/>
-    <w:lsdException w:name="Signature" w:semiHidden="1" w:unhideWhenUsed="1"/>
-    <w:lsdException w:name="Default Paragraph Font" w:semiHidden="1" w:uiPriority="1" w:unhideWhenUsed="1"/>
-    <w:lsdException w:name="Body Text" w:semiHidden="1" w:unhideWhenUsed="1"/>
-    <w:lsdException w:name="Body Text Indent" w:semiHidden="1" w:unhideWhenUsed="1"/>
-    <w:lsdException w:name="List Continue" w:semiHidden="1" w:unhideWhenUsed="1"/>
-    <w:lsdException w:name="List Continue 2" w:semiHidden="1" w:unhideWhenUsed="1"/>
-    <w:lsdException w:name="List Continue 3" w:semiHidden="1" w:unhideWhenUsed="1"/>
-    <w:lsdException w:name="List Continue 4" w:semiHidden="1" w:unhideWhenUsed="1"/>
-    <w:lsdException w:name="List Continue 5" w:semiHidden="1" w:unhideWhenUsed="1"/>
-    <w:lsdException w:name="Message Header" w:semiHidden="1" w:unhideWhenUsed="1"/>
-    <w:lsdException w:name="Subtitle" w:uiPriority="11" w:qFormat="1"/>
-    <w:lsdException w:name="Salutation" w:semiHidden="1" w:unhideWhenUsed="1"/>
-    <w:lsdException w:name="Date" w:semiHidden="1" w:unhideWhenUsed="1"/>
-    <w:lsdException w:name="Body Text First Indent" w:semiHidden="1" w:unhideWhenUsed="1"/>
-    <w:lsdException w:name="Body Text First Indent 2" w:semiHidden="1" w:unhideWhenUsed="1"/>
-    <w:lsdException w:name="Note Heading" w:semiHidden="1" w:unhideWhenUsed="1"/>
-    <w:lsdException w:name="Body Text 2" w:semiHidden="1" w:unhideWhenUsed="1"/>
-    <w:lsdException w:name="Body Text 3" w:semiHidden="1" w:unhideWhenUsed="1"/>
-    <w:lsdException w:name="Body Text Indent 2" w:semiHidden="1" w:unhideWhenUsed="1"/>
-    <w:lsdException w:name="Body Text Indent 3" w:semiHidden="1" w:unhideWhenUsed="1"/>
-    <w:lsdException w:name="Block Text" w:semiHidden="1" w:unhideWhenUsed="1"/>
-    <w:lsdException w:name="Hyperlink" w:semiHidden="1" w:unhideWhenUsed="1"/>
-    <w:lsdException w:name="FollowedHyperlink" w:semiHidden="1" w:unhideWhenUsed="1"/>
-    <w:lsdException w:name="Strong" w:uiPriority="22" w:qFormat="1"/>
-    <w:lsdException w:name="Emphasis" w:uiPriority="20" w:qFormat="1"/>
-    <w:lsdException w:name="Document Map" w:semiHidden="1" w:unhideWhenUsed="1"/>
-    <w:lsdException w:name="Plain Text" w:semiHidden="1" w:unhideWhenUsed="1"/>
-    <w:lsdException w:name="E-mail Signature" w:semiHidden="1" w:unhideWhenUsed="1"/>
-    <w:lsdException w:name="HTML Top of Form" w:semiHidden="1" w:unhideWhenUsed="1"/>
-    <w:lsdException w:name="HTML Bottom of Form" w:semiHidden="1" w:unhideWhenUsed="1"/>
-    <w:lsdException w:name="Normal (Web)" w:semiHidden="1" w:unhideWhenUsed="1"/>
-    <w:lsdException w:name="HTML Acronym" w:semiHidden="1" w:unhideWhenUsed="1"/>
-    <w:lsdException w:name="HTML Address" w:semiHidden="1" w:unhideWhenUsed="1"/>
-    <w:lsdException w:name="HTML Cite" w:semiHidden="1" w:unhideWhenUsed="1"/>
-    <w:lsdException w:name="HTML Code" w:semiHidden="1" w:unhideWhenUsed="1"/>
-    <w:lsdException w:name="HTML Definition" w:semiHidden="1" w:unhideWhenUsed="1"/>
-    <w:lsdException w:name="HTML Keyboard" w:semiHidden="1" w:unhideWhenUsed="1"/>
-    <w:lsdException w:name="HTML Preformatted" w:semiHidden="1" w:unhideWhenUsed="1"/>
-    <w:lsdException w:name="HTML Sample" w:semiHidden="1" w:unhideWhenUsed="1"/>
-    <w:lsdException w:name="HTML Typewriter" w:semiHidden="1" w:unhideWhenUsed="1"/>
-    <w:lsdException w:name="HTML Variable" w:semiHidden="1" w:unhideWhenUsed="1"/>
-    <w:lsdException w:name="Normal Table" w:semiHidden="1" w:unhideWhenUsed="1"/>
-    <w:lsdException w:name="annotation subject" w:semiHidden="1" w:unhideWhenUsed="1"/>
-    <w:lsdException w:name="No List" w:semiHidden="1" w:unhideWhenUsed="1"/>
-    <w:lsdException w:name="Outline List 1" w:semiHidden="1" w:unhideWhenUsed="1"/>
-    <w:lsdException w:name="Outline List 2" w:semiHidden="1" w:unhideWhenUsed="1"/>
-    <w:lsdException w:name="Outline List 3" w:semiHidden="1" w:unhideWhenUsed="1"/>
-    <w:lsdException w:name="Table Simple 1" w:semiHidden="1" w:unhideWhenUsed="1"/>
-    <w:lsdException w:name="Table Simple 2" w:semiHidden="1" w:unhideWhenUsed="1"/>
-    <w:lsdException w:name="Table Simple 3" w:semiHidden="1" w:unhideWhenUsed="1"/>
-    <w:lsdException w:name="Table Classic 1" w:semiHidden="1" w:unhideWhenUsed="1"/>
-    <w:lsdException w:name="Table Classic 2" w:semiHidden="1" w:unhideWhenUsed="1"/>
-    <w:lsdException w:name="Table Classic 3" w:semiHidden="1" w:unhideWhenUsed="1"/>
-    <w:lsdException w:name="Table Classic 4" w:semiHidden="1" w:unhideWhenUsed="1"/>
-    <w:lsdException w:name="Table Colorful 1" w:semiHidden="1" w:unhideWhenUsed="1"/>
-    <w:lsdException w:name="Table Colorful 2" w:semiHidden="1" w:unhideWhenUsed="1"/>
-    <w:lsdException w:name="Table Colorful 3" w:semiHidden="1" w:unhideWhenUsed="1"/>
-    <w:lsdException w:name="Table Columns 1" w:semiHidden="1" w:unhideWhenUsed="1"/>
-    <w:lsdException w:name="Table Columns 2" w:semiHidden="1" w:unhideWhenUsed="1"/>
-    <w:lsdException w:name="Table Columns 3" w:semiHidden="1" w:unhideWhenUsed="1"/>
-    <w:lsdException w:name="Table Columns 4" w:semiHidden="1" w:unhideWhenUsed="1"/>
-    <w:lsdException w:name="Table Columns 5" w:semiHidden="1" w:unhideWhenUsed="1"/>
-    <w:lsdException w:name="Table Grid 1" w:semiHidden="1" w:unhideWhenUsed="1"/>
-    <w:lsdException w:name="Table Grid 2" w:semiHidden="1" w:unhideWhenUsed="1"/>
-    <w:lsdException w:name="Table Grid 3" w:semiHidden="1" w:unhideWhenUsed="1"/>
-    <w:lsdException w:name="Table Grid 4" w:semiHidden="1" w:unhideWhenUsed="1"/>
-    <w:lsdException w:name="Table Grid 5" w:semiHidden="1" w:unhideWhenUsed="1"/>
-    <w:lsdException w:name="Table Grid 6" w:semiHidden="1" w:unhideWhenUsed="1"/>
-    <w:lsdException w:name="Table Grid 7" w:semiHidden="1" w:unhideWhenUsed="1"/>
-    <w:lsdException w:name="Table Grid 8" w:semiHidden="1" w:unhideWhenUsed="1"/>
-    <w:lsdException w:name="Table List 1" w:semiHidden="1" w:unhideWhenUsed="1"/>
-    <w:lsdException w:name="Table List 2" w:semiHidden="1" w:unhideWhenUsed="1"/>
-    <w:lsdException w:name="Table List 3" w:semiHidden="1" w:unhideWhenUsed="1"/>
-    <w:lsdException w:name="Table List 4" w:semiHidden="1" w:unhideWhenUsed="1"/>
-    <w:lsdException w:name="Table List 5" w:semiHidden="1" w:unhideWhenUsed="1"/>
-    <w:lsdException w:name="Table List 6" w:semiHidden="1" w:unhideWhenUsed="1"/>
-    <w:lsdException w:name="Table List 7" w:semiHidden="1" w:unhideWhenUsed="1"/>
-    <w:lsdException w:name="Table List 8" w:semiHidden="1" w:unhideWhenUsed="1"/>
-    <w:lsdException w:name="Table 3D effects 1" w:semiHidden="1" w:unhideWhenUsed="1"/>
-    <w:lsdException w:name="Table 3D effects 2" w:semiHidden="1" w:unhideWhenUsed="1"/>
-    <w:lsdException w:name="Table 3D effects 3" w:semiHidden="1" w:unhideWhenUsed="1"/>
-    <w:lsdException w:name="Table Contemporary" w:semiHidden="1" w:unhideWhenUsed="1"/>
-    <w:lsdException w:name="Table Elegant" w:semiHidden="1" w:unhideWhenUsed="1"/>
-    <w:lsdException w:name="Table Professional" w:semiHidden="1" w:unhideWhenUsed="1"/>
-    <w:lsdException w:name="Table Subtle 1" w:semiHidden="1" w:unhideWhenUsed="1"/>
-    <w:lsdException w:name="Table Subtle 2" w:semiHidden="1" w:unhideWhenUsed="1"/>
-    <w:lsdException w:name="Table Web 1" w:semiHidden="1" w:unhideWhenUsed="1"/>
-    <w:lsdException w:name="Table Web 2" w:semiHidden="1" w:unhideWhenUsed="1"/>
-    <w:lsdException w:name="Table Web 3" w:semiHidden="1" w:unhideWhenUsed="1"/>
-    <w:lsdException w:name="Balloon Text" w:semiHidden="1" w:unhideWhenUsed="1"/>
-    <w:lsdException w:name="Table Grid" w:uiPriority="39"/>
-    <w:lsdException w:name="Table Theme" w:semiHidden="1" w:unhideWhenUsed="1"/>
-    <w:lsdException w:name="Placeholder Text" w:semiHidden="1"/>
-    <w:lsdException w:name="No Spacing" w:uiPriority="1" w:qFormat="1"/>
-    <w:lsdException w:name="Light Shading" w:uiPriority="60"/>
-    <w:lsdException w:name="Light List" w:uiPriority="61"/>
-    <w:lsdException w:name="Light Grid" w:uiPriority="62"/>
-    <w:lsdException w:name="Medium Shading 1" w:uiPriority="63"/>
-    <w:lsdException w:name="Medium Shading 2" w:uiPriority="64"/>
-    <w:lsdException w:name="Medium List 1" w:uiPriority="65"/>
-    <w:lsdException w:name="Medium List 2" w:uiPriority="66"/>
-    <w:lsdException w:name="Medium Grid 1" w:uiPriority="67"/>
-    <w:lsdException w:name="Medium Grid 2" w:uiPriority="68"/>
-    <w:lsdException w:name="Medium Grid 3" w:uiPriority="69"/>
-    <w:lsdException w:name="Dark List" w:uiPriority="70"/>
-    <w:lsdException w:name="Colorful Shading" w:uiPriority="71"/>
-    <w:lsdException w:name="Colorful List" w:uiPriority="72"/>
-    <w:lsdException w:name="Colorful Grid" w:uiPriority="73"/>
-    <w:lsdException w:name="Light Shading Accent 1" w:uiPriority="60"/>
-    <w:lsdException w:name="Light List Accent 1" w:uiPriority="61"/>
-    <w:lsdException w:name="Light Grid Accent 1" w:uiPriority="62"/>
-    <w:lsdException w:name="Medium Shading 1 Accent 1" w:uiPriority="63"/>
-    <w:lsdException w:name="Medium Shading 2 Accent 1" w:uiPriority="64"/>
-    <w:lsdException w:name="Medium List 1 Accent 1" w:uiPriority="65"/>
-    <w:lsdException w:name="Revision" w:semiHidden="1"/>
-    <w:lsdException w:name="List Paragraph" w:uiPriority="34" w:qFormat="1"/>
-    <w:lsdException w:name="Quote" w:uiPriority="29" w:qFormat="1"/>
-    <w:lsdException w:name="Intense Quote" w:uiPriority="30" w:qFormat="1"/>
-    <w:lsdException w:name="Medium List 2 Accent 1" w:uiPriority="66"/>
-    <w:lsdException w:name="Medium Grid 1 Accent 1" w:uiPriority="67"/>
-    <w:lsdException w:name="Medium Grid 2 Accent 1" w:uiPriority="68"/>
-    <w:lsdException w:name="Medium Grid 3 Accent 1" w:uiPriority="69"/>
-    <w:lsdException w:name="Dark List Accent 1" w:uiPriority="70"/>
-    <w:lsdException w:name="Colorful Shading Accent 1" w:uiPriority="71"/>
-    <w:lsdException w:name="Colorful List Accent 1" w:uiPriority="72"/>
-    <w:lsdException w:name="Colorful Grid Accent 1" w:uiPriority="73"/>
-    <w:lsdException w:name="Light Shading Accent 2" w:uiPriority="60"/>
-    <w:lsdException w:name="Light List Accent 2" w:uiPriority="61"/>
-    <w:lsdException w:name="Light Grid Accent 2" w:uiPriority="62"/>
-    <w:lsdException w:name="Medium Shading 1 Accent 2" w:uiPriority="63"/>
-    <w:lsdException w:name="Medium Shading 2 Accent 2" w:uiPriority="64"/>
-    <w:lsdException w:name="Medium List 1 Accent 2" w:uiPriority="65"/>
-    <w:lsdException w:name="Medium List 2 Accent 2" w:uiPriority="66"/>
-    <w:lsdException w:name="Medium Grid 1 Accent 2" w:uiPriority="67"/>
-    <w:lsdException w:name="Medium Grid 2 Accent 2" w:uiPriority="68"/>
-    <w:lsdException w:name="Medium Grid 3 Accent 2" w:uiPriority="69"/>
-    <w:lsdException w:name="Dark List Accent 2" w:uiPriority="70"/>
-    <w:lsdException w:name="Colorful Shading Accent 2" w:uiPriority="71"/>
-    <w:lsdException w:name="Colorful List Accent 2" w:uiPriority="72"/>
-    <w:lsdException w:name="Colorful Grid Accent 2" w:uiPriority="73"/>
-    <w:lsdException w:name="Light Shading Accent 3" w:uiPriority="60"/>
-    <w:lsdException w:name="Light List Accent 3" w:uiPriority="61"/>
-    <w:lsdException w:name="Light Grid Accent 3" w:uiPriority="62"/>
-    <w:lsdException w:name="Medium Shading 1 Accent 3" w:uiPriority="63"/>
-    <w:lsdException w:name="Medium Shading 2 Accent 3" w:uiPriority="64"/>
-    <w:lsdException w:name="Medium List 1 Accent 3" w:uiPriority="65"/>
-    <w:lsdException w:name="Medium List 2 Accent 3" w:uiPriority="66"/>
-    <w:lsdException w:name="Medium Grid 1 Accent 3" w:uiPriority="67"/>
-    <w:lsdException w:name="Medium Grid 2 Accent 3" w:uiPriority="68"/>
-    <w:lsdException w:name="Medium Grid 3 Accent 3" w:uiPriority="69"/>
-    <w:lsdException w:name="Dark List Accent 3" w:uiPriority="70"/>
-    <w:lsdException w:name="Colorful Shading Accent 3" w:uiPriority="71"/>
-    <w:lsdException w:name="Colorful List Accent 3" w:uiPriority="72"/>
-    <w:lsdException w:name="Colorful Grid Accent 3" w:uiPriority="73"/>
-    <w:lsdException w:name="Light Shading Accent 4" w:uiPriority="60"/>
-    <w:lsdException w:name="Light List Accent 4" w:uiPriority="61"/>
-    <w:lsdException w:name="Light Grid Accent 4" w:uiPriority="62"/>
-    <w:lsdException w:name="Medium Shading 1 Accent 4" w:uiPriority="63"/>
-    <w:lsdException w:name="Medium Shading 2 Accent 4" w:uiPriority="64"/>
-    <w:lsdException w:name="Medium List 1 Accent 4" w:uiPriority="65"/>
-    <w:lsdException w:name="Medium List 2 Accent 4" w:uiPriority="66"/>
-    <w:lsdException w:name="Medium Grid 1 Accent 4" w:uiPriority="67"/>
-    <w:lsdException w:name="Medium Grid 2 Accent 4" w:uiPriority="68"/>
-    <w:lsdException w:name="Medium Grid 3 Accent 4" w:uiPriority="69"/>
-    <w:lsdException w:name="Dark List Accent 4" w:uiPriority="70"/>
-    <w:lsdException w:name="Colorful Shading Accent 4" w:uiPriority="71"/>
-    <w:lsdException w:name="Colorful List Accent 4" w:uiPriority="72"/>
-    <w:lsdException w:name="Colorful Grid Accent 4" w:uiPriority="73"/>
-    <w:lsdException w:name="Light Shading Accent 5" w:uiPriority="60"/>
-    <w:lsdException w:name="Light List Accent 5" w:uiPriority="61"/>
-    <w:lsdException w:name="Light Grid Accent 5" w:uiPriority="62"/>
-    <w:lsdException w:name="Medium Shading 1 Accent 5" w:uiPriority="63"/>
-    <w:lsdException w:name="Medium Shading 2 Accent 5" w:uiPriority="64"/>
-    <w:lsdException w:name="Medium List 1 Accent 5" w:uiPriority="65"/>
-    <w:lsdException w:name="Medium List 2 Accent 5" w:uiPriority="66"/>
-    <w:lsdException w:name="Medium Grid 1 Accent 5" w:uiPriority="67"/>
-    <w:lsdException w:name="Medium Grid 2 Accent 5" w:uiPriority="68"/>
-    <w:lsdException w:name="Medium Grid 3 Accent 5" w:uiPriority="69"/>
-    <w:lsdException w:name="Dark List Accent 5" w:uiPriority="70"/>
-    <w:lsdException w:name="Colorful Shading Accent 5" w:uiPriority="71"/>
-    <w:lsdException w:name="Colorful List Accent 5" w:uiPriority="72"/>
-    <w:lsdException w:name="Colorful Grid Accent 5" w:uiPriority="73"/>
-    <w:lsdException w:name="Light Shading Accent 6" w:uiPriority="60"/>
-    <w:lsdException w:name="Light List Accent 6" w:uiPriority="61"/>
-    <w:lsdException w:name="Light Grid Accent 6" w:uiPriority="62"/>
-    <w:lsdException w:name="Medium Shading 1 Accent 6" w:uiPriority="63"/>
-    <w:lsdException w:name="Medium Shading 2 Accent 6" w:uiPriority="64"/>
-    <w:lsdException w:name="Medium List 1 Accent 6" w:uiPriority="65"/>
-    <w:lsdException w:name="Medium List 2 Accent 6" w:uiPriority="66"/>
-    <w:lsdException w:name="Medium Grid 1 Accent 6" w:uiPriority="67"/>
-    <w:lsdException w:name="Medium Grid 2 Accent 6" w:uiPriority="68"/>
-    <w:lsdException w:name="Medium Grid 3 Accent 6" w:uiPriority="69"/>
-    <w:lsdException w:name="Dark List Accent 6" w:uiPriority="70"/>
-    <w:lsdException w:name="Colorful Shading Accent 6" w:uiPriority="71"/>
-    <w:lsdException w:name="Colorful List Accent 6" w:uiPriority="72"/>
-    <w:lsdException w:name="Colorful Grid Accent 6" w:uiPriority="73"/>
-    <w:lsdException w:name="Subtle Emphasis" w:uiPriority="19" w:qFormat="1"/>
-    <w:lsdException w:name="Intense Emphasis" w:uiPriority="21" w:qFormat="1"/>
-    <w:lsdException w:name="Subtle Reference" w:uiPriority="31" w:qFormat="1"/>
-    <w:lsdException w:name="Intense Reference" w:uiPriority="32" w:qFormat="1"/>
-    <w:lsdException w:name="Book Title" w:uiPriority="33" w:qFormat="1"/>
-    <w:lsdException w:name="Bibliography" w:semiHidden="1" w:uiPriority="37" w:unhideWhenUsed="1"/>
-    <w:lsdException w:name="TOC Heading" w:semiHidden="1" w:uiPriority="39" w:unhideWhenUsed="1" w:qFormat="1"/>
-    <w:lsdException w:name="Plain Table 1" w:uiPriority="41"/>
-    <w:lsdException w:name="Plain Table 2" w:uiPriority="42"/>
-    <w:lsdException w:name="Plain Table 3" w:uiPriority="43"/>
-    <w:lsdException w:name="Plain Table 4" w:uiPriority="44"/>
-    <w:lsdException w:name="Plain Table 5" w:uiPriority="45"/>
-    <w:lsdException w:name="Grid Table Light" w:uiPriority="40"/>
-    <w:lsdException w:name="Grid Table 1 Light" w:uiPriority="46"/>
-    <w:lsdException w:name="Grid Table 2" w:uiPriority="47"/>
-    <w:lsdException w:name="Grid Table 3" w:uiPriority="48"/>
-    <w:lsdException w:name="Grid Table 4" w:uiPriority="49"/>
-    <w:lsdException w:name="Grid Table 5 Dark" w:uiPriority="50"/>
-    <w:lsdException w:name="Grid Table 6 Colorful" w:uiPriority="51"/>
-    <w:lsdException w:name="Grid Table 7 Colorful" w:uiPriority="52"/>
-    <w:lsdException w:name="Grid Table 1 Light Accent 1" w:uiPriority="46"/>
-    <w:lsdException w:name="Grid Table 2 Accent 1" w:uiPriority="47"/>
-    <w:lsdException w:name="Grid Table 3 Accent 1" w:uiPriority="48"/>
-    <w:lsdException w:name="Grid Table 4 Accent 1" w:uiPriority="49"/>
-    <w:lsdException w:name="Grid Table 5 Dark Accent 1" w:uiPriority="50"/>
-    <w:lsdException w:name="Grid Table 6 Colorful Accent 1" w:uiPriority="51"/>
-    <w:lsdException w:name="Grid Table 7 Colorful Accent 1" w:uiPriority="52"/>
-    <w:lsdException w:name="Grid Table 1 Light Accent 2" w:uiPriority="46"/>
-    <w:lsdException w:name="Grid Table 2 Accent 2" w:uiPriority="47"/>
-    <w:lsdException w:name="Grid Table 3 Accent 2" w:uiPriority="48"/>
-    <w:lsdException w:name="Grid Table 4 Accent 2" w:uiPriority="49"/>
-    <w:lsdException w:name="Grid Table 5 Dark Accent 2" w:uiPriority="50"/>
-    <w:lsdException w:name="Grid Table 6 Colorful Accent 2" w:uiPriority="51"/>
-    <w:lsdException w:name="Grid Table 7 Colorful Accent 2" w:uiPriority="52"/>
-    <w:lsdException w:name="Grid Table 1 Light Accent 3" w:uiPriority="46"/>
-    <w:lsdException w:name="Grid Table 2 Accent 3" w:uiPriority="47"/>
-    <w:lsdException w:name="Grid Table 3 Accent 3" w:uiPriority="48"/>
-    <w:lsdException w:name="Grid Table 4 Accent 3" w:uiPriority="49"/>
-    <w:lsdException w:name="Grid Table 5 Dark Accent 3" w:uiPriority="50"/>
-    <w:lsdException w:name="Grid Table 6 Colorful Accent 3" w:uiPriority="51"/>
-    <w:lsdException w:name="Grid Table 7 Colorful Accent 3" w:uiPriority="52"/>
-    <w:lsdException w:name="Grid Table 1 Light Accent 4" w:uiPriority="46"/>
-    <w:lsdException w:name="Grid Table 2 Accent 4" w:uiPriority="47"/>
-    <w:lsdException w:name="Grid Table 3 Accent 4" w:uiPriority="48"/>
-    <w:lsdException w:name="Grid Table 4 Accent 4" w:uiPriority="49"/>
-    <w:lsdException w:name="Grid Table 5 Dark Accent 4" w:uiPriority="50"/>
-    <w:lsdException w:name="Grid Table 6 Colorful Accent 4" w:uiPriority="51"/>
-    <w:lsdException w:name="Grid Table 7 Colorful Accent 4" w:uiPriority="52"/>
-    <w:lsdException w:name="Grid Table 1 Light Accent 5" w:uiPriority="46"/>
-    <w:lsdException w:name="Grid Table 2 Accent 5" w:uiPriority="47"/>
-    <w:lsdException w:name="Grid Table 3 Accent 5" w:uiPriority="48"/>
-    <w:lsdException w:name="Grid Table 4 Accent 5" w:uiPriority="49"/>
-    <w:lsdException w:name="Grid Table 5 Dark Accent 5" w:uiPriority="50"/>
-    <w:lsdException w:name="Grid Table 6 Colorful Accent 5" w:uiPriority="51"/>
-    <w:lsdException w:name="Grid Table 7 Colorful Accent 5" w:uiPriority="52"/>
-    <w:lsdException w:name="Grid Table 1 Light Accent 6" w:uiPriority="46"/>
-    <w:lsdException w:name="Grid Table 2 Accent 6" w:uiPriority="47"/>
-    <w:lsdException w:name="Grid Table 3 Accent 6" w:uiPriority="48"/>
-    <w:lsdException w:name="Grid Table 4 Accent 6" w:uiPriority="49"/>
-    <w:lsdException w:name="Grid Table 5 Dark Accent 6" w:uiPriority="50"/>
-    <w:lsdException w:name="Grid Table 6 Colorful Accent 6" w:uiPriority="51"/>
-    <w:lsdException w:name="Grid Table 7 Colorful Accent 6" w:uiPriority="52"/>
-    <w:lsdException w:name="List Table 1 Light" w:uiPriority="46"/>
-    <w:lsdException w:name="List Table 2" w:uiPriority="47"/>
-    <w:lsdException w:name="List Table 3" w:uiPriority="48"/>
-    <w:lsdException w:name="List Table 4" w:uiPriority="49"/>
-    <w:lsdException w:name="List Table 5 Dark" w:uiPriority="50"/>
-    <w:lsdException w:name="List Table 6 Colorful" w:uiPriority="51"/>
-    <w:lsdException w:name="List Table 7 Colorful" w:uiPriority="52"/>
-    <w:lsdException w:name="List Table 1 Light Accent 1" w:uiPriority="46"/>
-    <w:lsdException w:name="List Table 2 Accent 1" w:uiPriority="47"/>
-    <w:lsdException w:name="List Table 3 Accent 1" w:uiPriority="48"/>
-    <w:lsdException w:name="List Table 4 Accent 1" w:uiPriority="49"/>
-    <w:lsdException w:name="List Table 5 Dark Accent 1" w:uiPriority="50"/>
-    <w:lsdException w:name="List Table 6 Colorful Accent 1" w:uiPriority="51"/>
-    <w:lsdException w:name="List Table 7 Colorful Accent 1" w:uiPriority="52"/>
-    <w:lsdException w:name="List Table 1 Light Accent 2" w:uiPriority="46"/>
-    <w:lsdException w:name="List Table 2 Accent 2" w:uiPriority="47"/>
-    <w:lsdException w:name="List Table 3 Accent 2" w:uiPriority="48"/>
-    <w:lsdException w:name="List Table 4 Accent 2" w:uiPriority="49"/>
-    <w:lsdException w:name="List Table 5 Dark Accent 2" w:uiPriority="50"/>
-    <w:lsdException w:name="List Table 6 Colorful Accent 2" w:uiPriority="51"/>
-    <w:lsdException w:name="List Table 7 Colorful Accent 2" w:uiPriority="52"/>
-    <w:lsdException w:name="List Table 1 Light Accent 3" w:uiPriority="46"/>
-    <w:lsdException w:name="List Table 2 Accent 3" w:uiPriority="47"/>
-    <w:lsdException w:name="List Table 3 Accent 3" w:uiPriority="48"/>
-    <w:lsdException w:name="List Table 4 Accent 3" w:uiPriority="49"/>
-    <w:lsdException w:name="List Table 5 Dark Accent 3" w:uiPriority="50"/>
-    <w:lsdException w:name="List Table 6 Colorful Accent 3" w:uiPriority="51"/>
-    <w:lsdException w:name="List Table 7 Colorful Accent 3" w:uiPriority="52"/>
-    <w:lsdException w:name="List Table 1 Light Accent 4" w:uiPriority="46"/>
-    <w:lsdException w:name="List Table 2 Accent 4" w:uiPriority="47"/>
-    <w:lsdException w:name="List Table 3 Accent 4" w:uiPriority="48"/>
-    <w:lsdException w:name="List Table 4 Accent 4" w:uiPriority="49"/>
-    <w:lsdException w:name="List Table 5 Dark Accent 4" w:uiPriority="50"/>
-    <w:lsdException w:name="List Table 6 Colorful Accent 4" w:uiPriority="51"/>
-    <w:lsdException w:name="List Table 7 Colorful Accent 4" w:uiPriority="52"/>
-    <w:lsdException w:name="List Table 1 Light Accent 5" w:uiPriority="46"/>
-    <w:lsdException w:name="List Table 2 Accent 5" w:uiPriority="47"/>
-    <w:lsdException w:name="List Table 3 Accent 5" w:uiPriority="48"/>
-    <w:lsdException w:name="List Table 4 Accent 5" w:uiPriority="49"/>
-    <w:lsdException w:name="List Table 5 Dark Accent 5" w:uiPriority="50"/>
-    <w:lsdException w:name="List Table 6 Colorful Accent 5" w:uiPriority="51"/>
-    <w:lsdException w:name="List Table 7 Colorful Accent 5" w:uiPriority="52"/>
-    <w:lsdException w:name="List Table 1 Light Accent 6" w:uiPriority="46"/>
-    <w:lsdException w:name="List Table 2 Accent 6" w:uiPriority="47"/>
-    <w:lsdException w:name="List Table 3 Accent 6" w:uiPriority="48"/>
-    <w:lsdException w:name="List Table 4 Accent 6" w:uiPriority="49"/>
-    <w:lsdException w:name="List Table 5 Dark Accent 6" w:uiPriority="50"/>
-    <w:lsdException w:name="List Table 6 Colorful Accent 6" w:uiPriority="51"/>
-    <w:lsdException w:name="List Table 7 Colorful Accent 6" w:uiPriority="52"/>
-  </w:latentStyles>
-  <w:style w:type="paragraph" w:default="1" w:styleId="a">
-    <w:name w:val="Normal"/>
-    <w:qFormat/>
-  </w:style>
-  <w:style w:type="character" w:default="1" w:styleId="a0">
-    <w:name w:val="Default Paragraph Font"/>
-    <w:uiPriority w:val="1"/>
-    <w:semiHidden/>
-    <w:unhideWhenUsed/>
-  </w:style>
-  <w:style w:type="table" w:default="1" w:styleId="a1">
-    <w:name w:val="Normal Table"/>
-    <w:uiPriority w:val="99"/>
-    <w:semiHidden/>
-    <w:unhideWhenUsed/>
-    <w:tblPr>
-      <w:tblInd w:w="0" w:type="dxa"/>
-      <w:tblCellMar>
-        <w:top w:w="0" w:type="dxa"/>
-        <w:left w:w="108" w:type="dxa"/>
-        <w:bottom w:w="0" w:type="dxa"/>
-        <w:right w:w="108" w:type="dxa"/>
-      </w:tblCellMar>
-    </w:tblPr>
-  </w:style>
-  <w:style w:type="numbering" w:default="1" w:styleId="a2">
-    <w:name w:val="No List"/>
-    <w:uiPriority w:val="99"/>
-    <w:semiHidden/>
-    <w:unhideWhenUsed/>
-  </w:style>
-  <w:style w:type="character" w:styleId="a3">
-    <w:name w:val="Placeholder Text"/>
-    <w:basedOn w:val="a0"/>
-    <w:uiPriority w:val="99"/>
-    <w:semiHidden/>
-    <w:rsid w:val="00985685"/>
-    <w:rPr>
-      <w:color w:val="808080"/>
-    </w:rPr>
-  </w:style>
-</w:styles>
-</file>
-
-<file path=word/glossary/webSettings.xml><?xml version="1.0" encoding="utf-8"?>
-<w:webSettings xmlns:mc="http://schemas.openxmlformats.org/markup-compatibility/2006" xmlns:r="http://schemas.openxmlformats.org/officeDocument/2006/relationships" xmlns:w="http://schemas.openxmlformats.org/wordprocessingml/2006/main" xmlns:w14="http://schemas.microsoft.com/office/word/2010/wordml" xmlns:w15="http://schemas.microsoft.com/office/word/2012/wordml" mc:Ignorable="w14 w15">
-  <w:optimizeForBrowser/>
-  <w:allowPNG/>
-</w:webSettings>
-</file>
-
 <file path=word/theme/theme1.xml><?xml version="1.0" encoding="utf-8"?>
 <a:theme xmlns:a="http://schemas.openxmlformats.org/drawingml/2006/main" name="Тема Office">
   <a:themeElements>
@@ -33357,7 +33696,7 @@
 </file>
 
 <file path=customXml/itemProps1.xml><?xml version="1.0" encoding="utf-8"?>
-<ds:datastoreItem xmlns:ds="http://schemas.openxmlformats.org/officeDocument/2006/customXml" ds:itemID="{20ED05D6-3480-48EE-9293-5EBAFF306F0A}">
+<ds:datastoreItem xmlns:ds="http://schemas.openxmlformats.org/officeDocument/2006/customXml" ds:itemID="{07845578-771B-4CB1-B85B-B3F388AC03C2}">
   <ds:schemaRefs>
     <ds:schemaRef ds:uri="http://schemas.openxmlformats.org/officeDocument/2006/bibliography"/>
   </ds:schemaRefs>

</xml_diff>